<commit_message>
Add journal-length anonymised manuscript, title page, cover letter and pre-submission checklist; extend supporting information with sources, evidence matrix and ladder
</commit_message>
<xml_diff>
--- a/revision/05_supporting_information.docx
+++ b/revision/05_supporting_information.docx
@@ -146,7 +146,7 @@
         <w:pStyle w:val="FirstParagraph"/>
       </w:pPr>
       <w:r>
-        <w:t xml:space="preserve">This document gives the instrument-level data behind Tables 3 to 6 of the manuscript, so that the coding can be replicated. Each row is one instrument: a specific tax exemption, grant, eligibility rule or compliance requirement. The unit of analysis is the instrument, not the strategy document. A single scheme, such as Thailand’s digital division, bundles several instruments, and each is coded in its own row. Table S1 holds 29 instruments, in four blocks by country. Rows 1 to 20 are the first-coded instruments, and rows 21 to 29 were added when the primary texts were read in full for the compute layers.</w:t>
+        <w:t xml:space="preserve">This document gives the instrument-level data behind Tables 1 to 5 of the manuscript, so that the coding can be replicated. Each row is one instrument: a specific tax exemption, grant, eligibility rule or compliance requirement. The unit of analysis is the instrument, not the strategy document. A single scheme, such as Thailand’s digital division, bundles several instruments, and each is coded in its own row. Table S1 holds 29 instruments, in four blocks by country; Tables S2 to S4 give the sources, the full evidence matrix and an illustrative ladder. Rows 1 to 20 are the first-coded instruments, and rows 21 to 29 were added when the primary texts were read in full for the compute layers.</w:t>
       </w:r>
     </w:p>
     <w:bookmarkEnd w:id="20"/>
@@ -164,7 +164,7 @@
         <w:pStyle w:val="FirstParagraph"/>
       </w:pPr>
       <w:r>
-        <w:t xml:space="preserve">The columns follow Appendix A of the manuscript.</w:t>
+        <w:t xml:space="preserve">The columns follow the codebook given below.</w:t>
       </w:r>
     </w:p>
     <w:p>
@@ -5264,13 +5264,683 @@
     </w:p>
     <w:bookmarkEnd w:id="25"/>
     <w:bookmarkEnd w:id="26"/>
-    <w:bookmarkStart w:id="27" w:name="currency-conversion"/>
+    <w:bookmarkStart w:id="27" w:name="table-s2.-primary-sources-coded"/>
     <w:p>
       <w:pPr>
         <w:pStyle w:val="Heading2"/>
       </w:pPr>
       <w:r>
-        <w:t xml:space="preserve">Currency conversion</w:t>
+        <w:t xml:space="preserve">Table S2. Primary sources coded</w:t>
+      </w:r>
+    </w:p>
+    <w:tbl>
+      <w:tblPr>
+        <w:tblStyle w:val="Table"/>
+        <w:tblLayout w:type="fixed"/>
+        <w:tblLook w:firstRow="1" w:lastRow="0" w:firstColumn="0" w:lastColumn="0" w:noHBand="0" w:noVBand="0" w:val="0020"/>
+        <w:jc w:val="start"/>
+        <w:tblBorders>
+          <w:top w:val="single" w:sz="4" w:color="999999"/>
+          <w:left w:val="single" w:sz="4" w:color="999999"/>
+          <w:bottom w:val="single" w:sz="4" w:color="999999"/>
+          <w:right w:val="single" w:sz="4" w:color="999999"/>
+          <w:insideH w:val="single" w:sz="4" w:color="999999"/>
+          <w:insideV w:val="single" w:sz="4" w:color="999999"/>
+        </w:tblBorders>
+        <w:tblLayout w:type="fixed"/>
+        <w:tblW w:w="15023" w:type="dxa"/>
+      </w:tblPr>
+      <w:tblGrid>
+        <w:gridCol w:w="748"/>
+        <w:gridCol w:w="2878"/>
+        <w:gridCol w:w="2014"/>
+        <w:gridCol w:w="2014"/>
+        <w:gridCol w:w="2187"/>
+        <w:gridCol w:w="2417"/>
+        <w:gridCol w:w="2762"/>
+      </w:tblGrid>
+      <w:tr>
+        <w:trPr>
+          <w:tblHeader w:val="true"/>
+        </w:trPr>
+        <w:tc>
+          <w:tcPr>
+            <w:tcW w:type="dxa" w:w="748"/>
+          </w:tcPr>
+          <w:p>
+            <w:pPr>
+              <w:pStyle w:val="Compact"/>
+              <w:jc w:val="left"/>
+            </w:pPr>
+            <w:r>
+              <w:rPr>
+                <w:b/>
+                <w:sz w:val="15"/>
+              </w:rPr>
+              <w:t xml:space="preserve">Country</w:t>
+            </w:r>
+          </w:p>
+        </w:tc>
+        <w:tc>
+          <w:tcPr>
+            <w:tcW w:type="dxa" w:w="2878"/>
+          </w:tcPr>
+          <w:p>
+            <w:pPr>
+              <w:pStyle w:val="Compact"/>
+              <w:jc w:val="left"/>
+            </w:pPr>
+            <w:r>
+              <w:rPr>
+                <w:b/>
+                <w:sz w:val="15"/>
+              </w:rPr>
+              <w:t xml:space="preserve">Source</w:t>
+            </w:r>
+          </w:p>
+        </w:tc>
+        <w:tc>
+          <w:tcPr>
+            <w:tcW w:type="dxa" w:w="2015"/>
+          </w:tcPr>
+          <w:p>
+            <w:pPr>
+              <w:pStyle w:val="Compact"/>
+              <w:jc w:val="left"/>
+            </w:pPr>
+            <w:r>
+              <w:rPr>
+                <w:b/>
+                <w:sz w:val="15"/>
+              </w:rPr>
+              <w:t xml:space="preserve">Issuer</w:t>
+            </w:r>
+          </w:p>
+        </w:tc>
+        <w:tc>
+          <w:tcPr>
+            <w:tcW w:type="dxa" w:w="2015"/>
+          </w:tcPr>
+          <w:p>
+            <w:pPr>
+              <w:pStyle w:val="Compact"/>
+              <w:jc w:val="left"/>
+            </w:pPr>
+            <w:r>
+              <w:rPr>
+                <w:b/>
+                <w:sz w:val="15"/>
+              </w:rPr>
+              <w:t xml:space="preserve">Date in force</w:t>
+            </w:r>
+          </w:p>
+        </w:tc>
+        <w:tc>
+          <w:tcPr>
+            <w:tcW w:type="dxa" w:w="2187"/>
+          </w:tcPr>
+          <w:p>
+            <w:pPr>
+              <w:pStyle w:val="Compact"/>
+              <w:jc w:val="left"/>
+            </w:pPr>
+            <w:r>
+              <w:rPr>
+                <w:b/>
+                <w:sz w:val="15"/>
+              </w:rPr>
+              <w:t xml:space="preserve">Language / translation</w:t>
+            </w:r>
+          </w:p>
+        </w:tc>
+        <w:tc>
+          <w:tcPr>
+            <w:tcW w:type="dxa" w:w="2418"/>
+          </w:tcPr>
+          <w:p>
+            <w:pPr>
+              <w:pStyle w:val="Compact"/>
+              <w:jc w:val="left"/>
+            </w:pPr>
+            <w:r>
+              <w:rPr>
+                <w:b/>
+                <w:sz w:val="15"/>
+              </w:rPr>
+              <w:t xml:space="preserve">Accessed</w:t>
+            </w:r>
+          </w:p>
+        </w:tc>
+        <w:tc>
+          <w:tcPr>
+            <w:tcW w:type="dxa" w:w="2763"/>
+          </w:tcPr>
+          <w:p>
+            <w:pPr>
+              <w:pStyle w:val="Compact"/>
+              <w:jc w:val="left"/>
+            </w:pPr>
+            <w:r>
+              <w:rPr>
+                <w:b/>
+                <w:sz w:val="15"/>
+              </w:rPr>
+              <w:t xml:space="preserve">Amendments, repeals and implementing rules checked (date)</w:t>
+            </w:r>
+          </w:p>
+        </w:tc>
+      </w:tr>
+      <w:tr>
+        <w:tc>
+          <w:tcPr>
+            <w:tcW w:type="dxa" w:w="748"/>
+          </w:tcPr>
+          <w:p>
+            <w:pPr>
+              <w:pStyle w:val="Compact"/>
+              <w:jc w:val="left"/>
+            </w:pPr>
+            <w:r>
+              <w:rPr>
+                <w:sz w:val="15"/>
+              </w:rPr>
+              <w:t xml:space="preserve">Thailand</w:t>
+            </w:r>
+          </w:p>
+        </w:tc>
+        <w:tc>
+          <w:tcPr>
+            <w:tcW w:type="dxa" w:w="2878"/>
+          </w:tcPr>
+          <w:p>
+            <w:pPr>
+              <w:pStyle w:val="Compact"/>
+              <w:jc w:val="left"/>
+            </w:pPr>
+            <w:r>
+              <w:rPr>
+                <w:sz w:val="15"/>
+              </w:rPr>
+              <w:t xml:space="preserve">BOI Investment Promotion Guide 2026; BOI Announcements 9/2565 (8 December 2022), 10/2565, Sor. 5/2568 (5 June 2025) and Sor. 9/2568 (14 November 2025); approval statistics January to December 2025</w:t>
+            </w:r>
+          </w:p>
+        </w:tc>
+        <w:tc>
+          <w:tcPr>
+            <w:tcW w:type="dxa" w:w="2015"/>
+          </w:tcPr>
+          <w:p>
+            <w:pPr>
+              <w:pStyle w:val="Compact"/>
+              <w:jc w:val="left"/>
+            </w:pPr>
+            <w:r>
+              <w:rPr>
+                <w:sz w:val="15"/>
+              </w:rPr>
+              <w:t xml:space="preserve">Board of Investment</w:t>
+            </w:r>
+          </w:p>
+        </w:tc>
+        <w:tc>
+          <w:tcPr>
+            <w:tcW w:type="dxa" w:w="2015"/>
+          </w:tcPr>
+          <w:p>
+            <w:pPr>
+              <w:pStyle w:val="Compact"/>
+              <w:jc w:val="left"/>
+            </w:pPr>
+            <w:r>
+              <w:rPr>
+                <w:sz w:val="15"/>
+              </w:rPr>
+              <w:t xml:space="preserve">Sor. 9/2568 applies to applications from 14 November 2025</w:t>
+            </w:r>
+          </w:p>
+        </w:tc>
+        <w:tc>
+          <w:tcPr>
+            <w:tcW w:type="dxa" w:w="2187"/>
+          </w:tcPr>
+          <w:p>
+            <w:pPr>
+              <w:pStyle w:val="Compact"/>
+              <w:jc w:val="left"/>
+            </w:pPr>
+            <w:r>
+              <w:rPr>
+                <w:sz w:val="15"/>
+              </w:rPr>
+              <w:t xml:space="preserve">English (BOI unofficial translation)</w:t>
+            </w:r>
+          </w:p>
+        </w:tc>
+        <w:tc>
+          <w:tcPr>
+            <w:tcW w:type="dxa" w:w="2418"/>
+          </w:tcPr>
+          <w:p>
+            <w:pPr>
+              <w:pStyle w:val="Compact"/>
+              <w:jc w:val="left"/>
+            </w:pPr>
+            <w:r>
+              <w:rPr>
+                <w:sz w:val="15"/>
+              </w:rPr>
+              <w:t xml:space="preserve">Read 9 October 2026</w:t>
+            </w:r>
+          </w:p>
+        </w:tc>
+        <w:tc>
+          <w:tcPr>
+            <w:tcW w:type="dxa" w:w="2763"/>
+          </w:tcPr>
+          <w:p>
+            <w:pPr>
+              <w:pStyle w:val="Compact"/>
+              <w:jc w:val="left"/>
+            </w:pPr>
+            <w:r>
+              <w:rPr>
+                <w:sz w:val="15"/>
+              </w:rPr>
+              <w:t xml:space="preserve">Guide 2026 and Sor. 9/2568 are the current texts and Sor. 5/2568 and 9/2568 amend 9/2565; the Thai original and Royal Gazette text are to be checked (not yet read)</w:t>
+            </w:r>
+          </w:p>
+        </w:tc>
+      </w:tr>
+      <w:tr>
+        <w:tc>
+          <w:tcPr>
+            <w:tcW w:type="dxa" w:w="748"/>
+          </w:tcPr>
+          <w:p>
+            <w:pPr>
+              <w:pStyle w:val="Compact"/>
+              <w:jc w:val="left"/>
+            </w:pPr>
+            <w:r>
+              <w:rPr>
+                <w:sz w:val="15"/>
+              </w:rPr>
+              <w:t xml:space="preserve">Vietnam</w:t>
+            </w:r>
+          </w:p>
+        </w:tc>
+        <w:tc>
+          <w:tcPr>
+            <w:tcW w:type="dxa" w:w="2878"/>
+          </w:tcPr>
+          <w:p>
+            <w:pPr>
+              <w:pStyle w:val="Compact"/>
+              <w:jc w:val="left"/>
+            </w:pPr>
+            <w:r>
+              <w:rPr>
+                <w:sz w:val="15"/>
+              </w:rPr>
+              <w:t xml:space="preserve">Decree 260/2026/ND-CP (30 June 2026; in force 1 July 2026; replaces Decree 10/2024); Decision 21/2026/QD-TTg (replaces Decision 1131/QD-TTg of 2025)</w:t>
+            </w:r>
+          </w:p>
+        </w:tc>
+        <w:tc>
+          <w:tcPr>
+            <w:tcW w:type="dxa" w:w="2015"/>
+          </w:tcPr>
+          <w:p>
+            <w:pPr>
+              <w:pStyle w:val="Compact"/>
+              <w:jc w:val="left"/>
+            </w:pPr>
+            <w:r>
+              <w:rPr>
+                <w:sz w:val="15"/>
+              </w:rPr>
+              <w:t xml:space="preserve">Government; Prime Minister</w:t>
+            </w:r>
+          </w:p>
+        </w:tc>
+        <w:tc>
+          <w:tcPr>
+            <w:tcW w:type="dxa" w:w="2015"/>
+          </w:tcPr>
+          <w:p>
+            <w:pPr>
+              <w:pStyle w:val="Compact"/>
+              <w:jc w:val="left"/>
+            </w:pPr>
+            <w:r>
+              <w:rPr>
+                <w:sz w:val="15"/>
+              </w:rPr>
+              <w:t xml:space="preserve">1 July 2026</w:t>
+            </w:r>
+          </w:p>
+        </w:tc>
+        <w:tc>
+          <w:tcPr>
+            <w:tcW w:type="dxa" w:w="2187"/>
+          </w:tcPr>
+          <w:p>
+            <w:pPr>
+              <w:pStyle w:val="Compact"/>
+              <w:jc w:val="left"/>
+            </w:pPr>
+            <w:r>
+              <w:rPr>
+                <w:sz w:val="15"/>
+              </w:rPr>
+              <w:t xml:space="preserve">Vietnamese original, read through the Thu Vien Phap Luat legal database, not the official gazette</w:t>
+            </w:r>
+          </w:p>
+        </w:tc>
+        <w:tc>
+          <w:tcPr>
+            <w:tcW w:type="dxa" w:w="2418"/>
+          </w:tcPr>
+          <w:p>
+            <w:pPr>
+              <w:pStyle w:val="Compact"/>
+              <w:jc w:val="left"/>
+            </w:pPr>
+            <w:r>
+              <w:rPr>
+                <w:sz w:val="15"/>
+              </w:rPr>
+              <w:t xml:space="preserve">Decree 260 and Decision 21/2026 read in full 9 October 2026</w:t>
+            </w:r>
+          </w:p>
+        </w:tc>
+        <w:tc>
+          <w:tcPr>
+            <w:tcW w:type="dxa" w:w="2763"/>
+          </w:tcPr>
+          <w:p>
+            <w:pPr>
+              <w:pStyle w:val="Compact"/>
+              <w:jc w:val="left"/>
+            </w:pPr>
+            <w:r>
+              <w:rPr>
+                <w:sz w:val="15"/>
+              </w:rPr>
+              <w:t xml:space="preserve">Implementing circulars 38, 40, 42, 48 and 49/2026/TT-BKHCN and Decrees 20/2026 and 264/2025 identified; the circulars (including Circular 34/2025/TT-BKHCN on procurement preference) not yet read (not yet read)</w:t>
+            </w:r>
+          </w:p>
+        </w:tc>
+      </w:tr>
+      <w:tr>
+        <w:tc>
+          <w:tcPr>
+            <w:tcW w:type="dxa" w:w="748"/>
+          </w:tcPr>
+          <w:p>
+            <w:pPr>
+              <w:pStyle w:val="Compact"/>
+              <w:jc w:val="left"/>
+            </w:pPr>
+            <w:r>
+              <w:rPr>
+                <w:sz w:val="15"/>
+              </w:rPr>
+              <w:t xml:space="preserve">Malaysia</w:t>
+            </w:r>
+          </w:p>
+        </w:tc>
+        <w:tc>
+          <w:tcPr>
+            <w:tcW w:type="dxa" w:w="2878"/>
+          </w:tcPr>
+          <w:p>
+            <w:pPr>
+              <w:pStyle w:val="Compact"/>
+              <w:jc w:val="left"/>
+            </w:pPr>
+            <w:r>
+              <w:rPr>
+                <w:sz w:val="15"/>
+              </w:rPr>
+              <w:t xml:space="preserve">Guidelines on Malaysia Digital (MD) Tax Incentive, New Investment Incentive (revised 22 July 2025); Guidelines and Procedures for DESAC (version on MIDA’s site, December 2024); Guideline for Sustainable Development of Data Centre (December 2024)</w:t>
+            </w:r>
+          </w:p>
+        </w:tc>
+        <w:tc>
+          <w:tcPr>
+            <w:tcW w:type="dxa" w:w="2015"/>
+          </w:tcPr>
+          <w:p>
+            <w:pPr>
+              <w:pStyle w:val="Compact"/>
+              <w:jc w:val="left"/>
+            </w:pPr>
+            <w:r>
+              <w:rPr>
+                <w:sz w:val="15"/>
+              </w:rPr>
+              <w:t xml:space="preserve">MDEC; MIDA; MITI (hosted by MIDA)</w:t>
+            </w:r>
+          </w:p>
+        </w:tc>
+        <w:tc>
+          <w:tcPr>
+            <w:tcW w:type="dxa" w:w="2015"/>
+          </w:tcPr>
+          <w:p>
+            <w:pPr>
+              <w:pStyle w:val="Compact"/>
+              <w:jc w:val="left"/>
+            </w:pPr>
+            <w:r>
+              <w:rPr>
+                <w:sz w:val="15"/>
+              </w:rPr>
+              <w:t xml:space="preserve">DESAC applications received 1 January 2022 to 31 December 2027; MD guideline July 2025</w:t>
+            </w:r>
+          </w:p>
+        </w:tc>
+        <w:tc>
+          <w:tcPr>
+            <w:tcW w:type="dxa" w:w="2187"/>
+          </w:tcPr>
+          <w:p>
+            <w:pPr>
+              <w:pStyle w:val="Compact"/>
+              <w:jc w:val="left"/>
+            </w:pPr>
+            <w:r>
+              <w:rPr>
+                <w:sz w:val="15"/>
+              </w:rPr>
+              <w:t xml:space="preserve">English (original)</w:t>
+            </w:r>
+          </w:p>
+        </w:tc>
+        <w:tc>
+          <w:tcPr>
+            <w:tcW w:type="dxa" w:w="2418"/>
+          </w:tcPr>
+          <w:p>
+            <w:pPr>
+              <w:pStyle w:val="Compact"/>
+              <w:jc w:val="left"/>
+            </w:pPr>
+            <w:r>
+              <w:rPr>
+                <w:sz w:val="15"/>
+              </w:rPr>
+              <w:t xml:space="preserve">Read 9 October 2026</w:t>
+            </w:r>
+          </w:p>
+        </w:tc>
+        <w:tc>
+          <w:tcPr>
+            <w:tcW w:type="dxa" w:w="2763"/>
+          </w:tcPr>
+          <w:p>
+            <w:pPr>
+              <w:pStyle w:val="Compact"/>
+              <w:jc w:val="left"/>
+            </w:pPr>
+            <w:r>
+              <w:rPr>
+                <w:sz w:val="15"/>
+              </w:rPr>
+              <w:t xml:space="preserve">New Incentive Framework (manufacturing from 1 March 2026, services from Q2 2026) does not withdraw DESAC, which stays available until its window expires (MIDA NIF FAQ, question 20); checked 9 October 2026</w:t>
+            </w:r>
+          </w:p>
+        </w:tc>
+      </w:tr>
+      <w:tr>
+        <w:tc>
+          <w:tcPr>
+            <w:tcW w:type="dxa" w:w="748"/>
+          </w:tcPr>
+          <w:p>
+            <w:pPr>
+              <w:pStyle w:val="Compact"/>
+              <w:jc w:val="left"/>
+            </w:pPr>
+            <w:r>
+              <w:rPr>
+                <w:sz w:val="15"/>
+              </w:rPr>
+              <w:t xml:space="preserve">Philippines</w:t>
+            </w:r>
+          </w:p>
+        </w:tc>
+        <w:tc>
+          <w:tcPr>
+            <w:tcW w:type="dxa" w:w="2878"/>
+          </w:tcPr>
+          <w:p>
+            <w:pPr>
+              <w:pStyle w:val="Compact"/>
+              <w:jc w:val="left"/>
+            </w:pPr>
+            <w:r>
+              <w:rPr>
+                <w:sz w:val="15"/>
+              </w:rPr>
+              <w:t xml:space="preserve">Republic Act 12066 (CREATE MORE), signed 11 November 2024; implementing rules and regulations of Title XIII of the Tax Code (signed 17 February 2025, in force 20 February 2025, circularized by FIRB Advisory 001-2025); Memorandum Order 47 of 21 May 2026 approving the 2026 SIPP</w:t>
+            </w:r>
+          </w:p>
+        </w:tc>
+        <w:tc>
+          <w:tcPr>
+            <w:tcW w:type="dxa" w:w="2015"/>
+          </w:tcPr>
+          <w:p>
+            <w:pPr>
+              <w:pStyle w:val="Compact"/>
+              <w:jc w:val="left"/>
+            </w:pPr>
+            <w:r>
+              <w:rPr>
+                <w:sz w:val="15"/>
+              </w:rPr>
+              <w:t xml:space="preserve">Congress; Department of Finance and Department of Trade and Industry; Office of the President</w:t>
+            </w:r>
+          </w:p>
+        </w:tc>
+        <w:tc>
+          <w:tcPr>
+            <w:tcW w:type="dxa" w:w="2015"/>
+          </w:tcPr>
+          <w:p>
+            <w:pPr>
+              <w:pStyle w:val="Compact"/>
+              <w:jc w:val="left"/>
+            </w:pPr>
+            <w:r>
+              <w:rPr>
+                <w:sz w:val="15"/>
+              </w:rPr>
+              <w:t xml:space="preserve">Act 2024; rules February 2025; SIPP 2026</w:t>
+            </w:r>
+          </w:p>
+        </w:tc>
+        <w:tc>
+          <w:tcPr>
+            <w:tcW w:type="dxa" w:w="2187"/>
+          </w:tcPr>
+          <w:p>
+            <w:pPr>
+              <w:pStyle w:val="Compact"/>
+              <w:jc w:val="left"/>
+            </w:pPr>
+            <w:r>
+              <w:rPr>
+                <w:sz w:val="15"/>
+              </w:rPr>
+              <w:t xml:space="preserve">English (original)</w:t>
+            </w:r>
+          </w:p>
+        </w:tc>
+        <w:tc>
+          <w:tcPr>
+            <w:tcW w:type="dxa" w:w="2418"/>
+          </w:tcPr>
+          <w:p>
+            <w:pPr>
+              <w:pStyle w:val="Compact"/>
+              <w:jc w:val="left"/>
+            </w:pPr>
+            <w:r>
+              <w:rPr>
+                <w:sz w:val="15"/>
+              </w:rPr>
+              <w:t xml:space="preserve">All three read in full 9 October 2026</w:t>
+            </w:r>
+          </w:p>
+        </w:tc>
+        <w:tc>
+          <w:tcPr>
+            <w:tcW w:type="dxa" w:w="2763"/>
+          </w:tcPr>
+          <w:p>
+            <w:pPr>
+              <w:pStyle w:val="Compact"/>
+              <w:jc w:val="left"/>
+            </w:pPr>
+            <w:r>
+              <w:rPr>
+                <w:sz w:val="15"/>
+              </w:rPr>
+              <w:t xml:space="preserve">FIRB Advisory 009-2026 circularizing the 2026 SIPP identified; the SIPP qualification guidelines and the FIRB’s published amendments not yet read (not yet read)</w:t>
+            </w:r>
+          </w:p>
+        </w:tc>
+      </w:tr>
+    </w:tbl>
+    <w:p>
+      <w:pPr>
+        <w:pStyle w:val="BodyText"/>
+      </w:pPr>
+      <w:r>
+        <w:rPr>
+          <w:iCs/>
+          <w:i/>
+        </w:rPr>
+        <w:t xml:space="preserve">Note.</w:t>
+      </w:r>
+      <w:r>
+        <w:t xml:space="preserve"> </w:t>
+      </w:r>
+      <w:r>
+        <w:t xml:space="preserve">Currency figures are converted at about 35.7 baht, 4.55 ringgit and 57.7 pesos to the US dollar. The Vietnamese texts were read through a commercial legal database, not the official gazette.</w:t>
+      </w:r>
+    </w:p>
+    <w:bookmarkEnd w:id="27"/>
+    <w:bookmarkStart w:id="28" w:name="table-s3.-full-evidence-matrix"/>
+    <w:p>
+      <w:pPr>
+        <w:pStyle w:val="Heading2"/>
+      </w:pPr>
+      <w:r>
+        <w:t xml:space="preserve">Table S3. Full evidence matrix</w:t>
       </w:r>
     </w:p>
     <w:p>
@@ -5278,17 +5948,2340 @@
         <w:pStyle w:val="FirstParagraph"/>
       </w:pPr>
       <w:r>
-        <w:t xml:space="preserve">Thai baht, Malaysian ringgit, Philippine peso and Vietnamese dong figures are converted to US dollars at about 35.7 baht, 4.55 ringgit and 57.7 pesos to the dollar. These rates are those implied by the values first coded. They are approximations used for comparison only. The source and date of each rate are to be recorded before submission, and the local-currency figure is the one to cite.</w:t>
+        <w:t xml:space="preserve">Rating rubric. A hypothesis is rated</w:t>
+      </w:r>
+      <w:r>
+        <w:t xml:space="preserve"> </w:t>
+      </w:r>
+      <w:r>
+        <w:rPr>
+          <w:iCs/>
+          <w:i/>
+        </w:rPr>
+        <w:t xml:space="preserve">expected</w:t>
+      </w:r>
+      <w:r>
+        <w:t xml:space="preserve"> </w:t>
+      </w:r>
+      <w:r>
+        <w:t xml:space="preserve">(E) when a stated prediction (P1a to P3c, Section 2.4 of the manuscript) predicts the evidence,</w:t>
+      </w:r>
+      <w:r>
+        <w:t xml:space="preserve"> </w:t>
+      </w:r>
+      <w:r>
+        <w:rPr>
+          <w:iCs/>
+          <w:i/>
+        </w:rPr>
+        <w:t xml:space="preserve">compatible</w:t>
+      </w:r>
+      <w:r>
+        <w:t xml:space="preserve"> </w:t>
+      </w:r>
+      <w:r>
+        <w:t xml:space="preserve">(C) when no prediction covers it and it is not in tension with any,</w:t>
+      </w:r>
+      <w:r>
+        <w:t xml:space="preserve"> </w:t>
+      </w:r>
+      <w:r>
+        <w:rPr>
+          <w:iCs/>
+          <w:i/>
+        </w:rPr>
+        <w:t xml:space="preserve">unexpected</w:t>
+      </w:r>
+      <w:r>
+        <w:t xml:space="preserve"> </w:t>
+      </w:r>
+      <w:r>
+        <w:t xml:space="preserve">(U) when it is in tension with a prediction or can be reconciled only with an additional assumption, and</w:t>
+      </w:r>
+      <w:r>
+        <w:t xml:space="preserve"> </w:t>
+      </w:r>
+      <w:r>
+        <w:rPr>
+          <w:iCs/>
+          <w:i/>
+        </w:rPr>
+        <w:t xml:space="preserve">contradicted</w:t>
+      </w:r>
+      <w:r>
+        <w:t xml:space="preserve"> </w:t>
+      </w:r>
+      <w:r>
+        <w:t xml:space="preserve">(X) when it is inconsistent with the hypothesis. The weight for the pair a row separates is</w:t>
+      </w:r>
+      <w:r>
+        <w:t xml:space="preserve"> </w:t>
+      </w:r>
+      <w:r>
+        <w:rPr>
+          <w:iCs/>
+          <w:i/>
+        </w:rPr>
+        <w:t xml:space="preserve">strong</w:t>
+      </w:r>
+      <w:r>
+        <w:t xml:space="preserve"> </w:t>
+      </w:r>
+      <w:r>
+        <w:t xml:space="preserve">if one hypothesis is E, the other U or X, the coding is verified and no auxiliary assumption is needed;</w:t>
+      </w:r>
+      <w:r>
+        <w:t xml:space="preserve"> </w:t>
+      </w:r>
+      <w:r>
+        <w:rPr>
+          <w:iCs/>
+          <w:i/>
+        </w:rPr>
+        <w:t xml:space="preserve">moderate</w:t>
+      </w:r>
+      <w:r>
+        <w:t xml:space="preserve"> </w:t>
+      </w:r>
+      <w:r>
+        <w:t xml:space="preserve">if it depends on assumption A1 or on coding not yet verified; and</w:t>
+      </w:r>
+      <w:r>
+        <w:t xml:space="preserve"> </w:t>
+      </w:r>
+      <w:r>
+        <w:rPr>
+          <w:iCs/>
+          <w:i/>
+        </w:rPr>
+        <w:t xml:space="preserve">weak</w:t>
+      </w:r>
+      <w:r>
+        <w:t xml:space="preserve"> </w:t>
+      </w:r>
+      <w:r>
+        <w:t xml:space="preserve">if no hypothesis is U or X.</w:t>
       </w:r>
     </w:p>
-    <w:bookmarkEnd w:id="27"/>
-    <w:bookmarkStart w:id="28" w:name="codebook"/>
+    <w:tbl>
+      <w:tblPr>
+        <w:tblStyle w:val="Table"/>
+        <w:tblLayout w:type="fixed"/>
+        <w:tblLook w:firstRow="1" w:lastRow="0" w:firstColumn="0" w:lastColumn="0" w:noHBand="0" w:noVBand="0" w:val="0020"/>
+        <w:jc w:val="start"/>
+        <w:tblBorders>
+          <w:top w:val="single" w:sz="4" w:color="999999"/>
+          <w:left w:val="single" w:sz="4" w:color="999999"/>
+          <w:bottom w:val="single" w:sz="4" w:color="999999"/>
+          <w:right w:val="single" w:sz="4" w:color="999999"/>
+          <w:insideH w:val="single" w:sz="4" w:color="999999"/>
+          <w:insideV w:val="single" w:sz="4" w:color="999999"/>
+        </w:tblBorders>
+        <w:tblLayout w:type="fixed"/>
+        <w:tblW w:w="15023" w:type="dxa"/>
+      </w:tblPr>
+      <w:tblGrid>
+        <w:gridCol w:w="748"/>
+        <w:gridCol w:w="2878"/>
+        <w:gridCol w:w="2014"/>
+        <w:gridCol w:w="2014"/>
+        <w:gridCol w:w="2187"/>
+        <w:gridCol w:w="2417"/>
+        <w:gridCol w:w="2762"/>
+      </w:tblGrid>
+      <w:tr>
+        <w:trPr>
+          <w:tblHeader w:val="true"/>
+        </w:trPr>
+        <w:tc>
+          <w:tcPr>
+            <w:tcW w:type="dxa" w:w="748"/>
+          </w:tcPr>
+          <w:p>
+            <w:pPr>
+              <w:pStyle w:val="Compact"/>
+              <w:jc w:val="left"/>
+            </w:pPr>
+            <w:r>
+              <w:rPr>
+                <w:b/>
+                <w:sz w:val="15"/>
+              </w:rPr>
+              <w:t xml:space="preserve">#</w:t>
+            </w:r>
+          </w:p>
+        </w:tc>
+        <w:tc>
+          <w:tcPr>
+            <w:tcW w:type="dxa" w:w="2878"/>
+          </w:tcPr>
+          <w:p>
+            <w:pPr>
+              <w:pStyle w:val="Compact"/>
+              <w:jc w:val="left"/>
+            </w:pPr>
+            <w:r>
+              <w:rPr>
+                <w:b/>
+                <w:sz w:val="15"/>
+              </w:rPr>
+              <w:t xml:space="preserve">Evidence (country)</w:t>
+            </w:r>
+          </w:p>
+        </w:tc>
+        <w:tc>
+          <w:tcPr>
+            <w:tcW w:type="dxa" w:w="2015"/>
+          </w:tcPr>
+          <w:p>
+            <w:pPr>
+              <w:pStyle w:val="Compact"/>
+              <w:jc w:val="left"/>
+            </w:pPr>
+            <w:r>
+              <w:rPr>
+                <w:b/>
+                <w:sz w:val="15"/>
+              </w:rPr>
+              <w:t xml:space="preserve">H1 cost</w:t>
+            </w:r>
+          </w:p>
+        </w:tc>
+        <w:tc>
+          <w:tcPr>
+            <w:tcW w:type="dxa" w:w="2015"/>
+          </w:tcPr>
+          <w:p>
+            <w:pPr>
+              <w:pStyle w:val="Compact"/>
+              <w:jc w:val="left"/>
+            </w:pPr>
+            <w:r>
+              <w:rPr>
+                <w:b/>
+                <w:sz w:val="15"/>
+              </w:rPr>
+              <w:t xml:space="preserve">H2 design</w:t>
+            </w:r>
+          </w:p>
+        </w:tc>
+        <w:tc>
+          <w:tcPr>
+            <w:tcW w:type="dxa" w:w="2187"/>
+          </w:tcPr>
+          <w:p>
+            <w:pPr>
+              <w:pStyle w:val="Compact"/>
+              <w:jc w:val="left"/>
+            </w:pPr>
+            <w:r>
+              <w:rPr>
+                <w:b/>
+                <w:sz w:val="15"/>
+              </w:rPr>
+              <w:t xml:space="preserve">H3 habit</w:t>
+            </w:r>
+          </w:p>
+        </w:tc>
+        <w:tc>
+          <w:tcPr>
+            <w:tcW w:type="dxa" w:w="2418"/>
+          </w:tcPr>
+          <w:p>
+            <w:pPr>
+              <w:pStyle w:val="Compact"/>
+              <w:jc w:val="left"/>
+            </w:pPr>
+            <w:r>
+              <w:rPr>
+                <w:b/>
+                <w:sz w:val="15"/>
+              </w:rPr>
+              <w:t xml:space="preserve">Pair separated and weight</w:t>
+            </w:r>
+          </w:p>
+        </w:tc>
+        <w:tc>
+          <w:tcPr>
+            <w:tcW w:type="dxa" w:w="2763"/>
+          </w:tcPr>
+          <w:p>
+            <w:pPr>
+              <w:pStyle w:val="Compact"/>
+              <w:jc w:val="left"/>
+            </w:pPr>
+            <w:r>
+              <w:rPr>
+                <w:b/>
+                <w:sz w:val="15"/>
+              </w:rPr>
+              <w:t xml:space="preserve">What would change the rating</w:t>
+            </w:r>
+          </w:p>
+        </w:tc>
+      </w:tr>
+      <w:tr>
+        <w:tc>
+          <w:tcPr>
+            <w:tcW w:type="dxa" w:w="748"/>
+          </w:tcPr>
+          <w:p>
+            <w:pPr>
+              <w:pStyle w:val="Compact"/>
+              <w:jc w:val="left"/>
+            </w:pPr>
+            <w:r>
+              <w:rPr>
+                <w:sz w:val="15"/>
+              </w:rPr>
+              <w:t xml:space="preserve">E1</w:t>
+            </w:r>
+          </w:p>
+        </w:tc>
+        <w:tc>
+          <w:tcPr>
+            <w:tcW w:type="dxa" w:w="2878"/>
+          </w:tcPr>
+          <w:p>
+            <w:pPr>
+              <w:pStyle w:val="Compact"/>
+              <w:jc w:val="left"/>
+            </w:pPr>
+            <w:r>
+              <w:rPr>
+                <w:sz w:val="15"/>
+              </w:rPr>
+              <w:t xml:space="preserve">Software threshold far below GPU-hosting capital condition (Thailand)</w:t>
+            </w:r>
+          </w:p>
+        </w:tc>
+        <w:tc>
+          <w:tcPr>
+            <w:tcW w:type="dxa" w:w="2015"/>
+          </w:tcPr>
+          <w:p>
+            <w:pPr>
+              <w:pStyle w:val="Compact"/>
+              <w:jc w:val="left"/>
+            </w:pPr>
+            <w:r>
+              <w:rPr>
+                <w:sz w:val="15"/>
+              </w:rPr>
+              <w:t xml:space="preserve">E (P1a)</w:t>
+            </w:r>
+          </w:p>
+        </w:tc>
+        <w:tc>
+          <w:tcPr>
+            <w:tcW w:type="dxa" w:w="2015"/>
+          </w:tcPr>
+          <w:p>
+            <w:pPr>
+              <w:pStyle w:val="Compact"/>
+              <w:jc w:val="left"/>
+            </w:pPr>
+            <w:r>
+              <w:rPr>
+                <w:sz w:val="15"/>
+              </w:rPr>
+              <w:t xml:space="preserve">C</w:t>
+            </w:r>
+          </w:p>
+        </w:tc>
+        <w:tc>
+          <w:tcPr>
+            <w:tcW w:type="dxa" w:w="2187"/>
+          </w:tcPr>
+          <w:p>
+            <w:pPr>
+              <w:pStyle w:val="Compact"/>
+              <w:jc w:val="left"/>
+            </w:pPr>
+            <w:r>
+              <w:rPr>
+                <w:sz w:val="15"/>
+              </w:rPr>
+              <w:t xml:space="preserve">C</w:t>
+            </w:r>
+          </w:p>
+        </w:tc>
+        <w:tc>
+          <w:tcPr>
+            <w:tcW w:type="dxa" w:w="2418"/>
+          </w:tcPr>
+          <w:p>
+            <w:pPr>
+              <w:pStyle w:val="Compact"/>
+              <w:jc w:val="left"/>
+            </w:pPr>
+            <w:r>
+              <w:rPr>
+                <w:sz w:val="15"/>
+              </w:rPr>
+              <w:t xml:space="preserve">None: Weak</w:t>
+            </w:r>
+          </w:p>
+        </w:tc>
+        <w:tc>
+          <w:tcPr>
+            <w:tcW w:type="dxa" w:w="2763"/>
+          </w:tcPr>
+          <w:p>
+            <w:pPr>
+              <w:pStyle w:val="Compact"/>
+              <w:jc w:val="left"/>
+            </w:pPr>
+            <w:r>
+              <w:rPr>
+                <w:sz w:val="15"/>
+              </w:rPr>
+              <w:t xml:space="preserve">Not diagnostic</w:t>
+            </w:r>
+          </w:p>
+        </w:tc>
+      </w:tr>
+      <w:tr>
+        <w:tc>
+          <w:tcPr>
+            <w:tcW w:type="dxa" w:w="748"/>
+          </w:tcPr>
+          <w:p>
+            <w:pPr>
+              <w:pStyle w:val="Compact"/>
+              <w:jc w:val="left"/>
+            </w:pPr>
+            <w:r>
+              <w:rPr>
+                <w:sz w:val="15"/>
+              </w:rPr>
+              <w:t xml:space="preserve">E2</w:t>
+            </w:r>
+          </w:p>
+        </w:tc>
+        <w:tc>
+          <w:tcPr>
+            <w:tcW w:type="dxa" w:w="2878"/>
+          </w:tcPr>
+          <w:p>
+            <w:pPr>
+              <w:pStyle w:val="Compact"/>
+              <w:jc w:val="left"/>
+            </w:pPr>
+            <w:r>
+              <w:rPr>
+                <w:sz w:val="15"/>
+              </w:rPr>
+              <w:t xml:space="preserve">Malaysia’s low-capital digital track covers cloud (RM50,000 paid-up capital), beside a data-centre track whose smallest category is 0.85 MW</w:t>
+            </w:r>
+          </w:p>
+        </w:tc>
+        <w:tc>
+          <w:tcPr>
+            <w:tcW w:type="dxa" w:w="2015"/>
+          </w:tcPr>
+          <w:p>
+            <w:pPr>
+              <w:pStyle w:val="Compact"/>
+              <w:jc w:val="left"/>
+            </w:pPr>
+            <w:r>
+              <w:rPr>
+                <w:sz w:val="15"/>
+              </w:rPr>
+              <w:t xml:space="preserve">C</w:t>
+            </w:r>
+          </w:p>
+        </w:tc>
+        <w:tc>
+          <w:tcPr>
+            <w:tcW w:type="dxa" w:w="2015"/>
+          </w:tcPr>
+          <w:p>
+            <w:pPr>
+              <w:pStyle w:val="Compact"/>
+              <w:jc w:val="left"/>
+            </w:pPr>
+            <w:r>
+              <w:rPr>
+                <w:sz w:val="15"/>
+              </w:rPr>
+              <w:t xml:space="preserve">U (P2a, if the MD track admits capacity resale; to be confirmed)</w:t>
+            </w:r>
+          </w:p>
+        </w:tc>
+        <w:tc>
+          <w:tcPr>
+            <w:tcW w:type="dxa" w:w="2187"/>
+          </w:tcPr>
+          <w:p>
+            <w:pPr>
+              <w:pStyle w:val="Compact"/>
+              <w:jc w:val="left"/>
+            </w:pPr>
+            <w:r>
+              <w:rPr>
+                <w:sz w:val="15"/>
+              </w:rPr>
+              <w:t xml:space="preserve">C</w:t>
+            </w:r>
+          </w:p>
+        </w:tc>
+        <w:tc>
+          <w:tcPr>
+            <w:tcW w:type="dxa" w:w="2418"/>
+          </w:tcPr>
+          <w:p>
+            <w:pPr>
+              <w:pStyle w:val="Compact"/>
+              <w:jc w:val="left"/>
+            </w:pPr>
+            <w:r>
+              <w:rPr>
+                <w:sz w:val="15"/>
+              </w:rPr>
+              <w:t xml:space="preserve">H2 against H1 and H3: Moderate, provisional</w:t>
+            </w:r>
+          </w:p>
+        </w:tc>
+        <w:tc>
+          <w:tcPr>
+            <w:tcW w:type="dxa" w:w="2763"/>
+          </w:tcPr>
+          <w:p>
+            <w:pPr>
+              <w:pStyle w:val="Compact"/>
+              <w:jc w:val="left"/>
+            </w:pPr>
+            <w:r>
+              <w:rPr>
+                <w:sz w:val="15"/>
+              </w:rPr>
+              <w:t xml:space="preserve">MDEC’s reading of MD activities</w:t>
+            </w:r>
+          </w:p>
+        </w:tc>
+      </w:tr>
+      <w:tr>
+        <w:tc>
+          <w:tcPr>
+            <w:tcW w:type="dxa" w:w="748"/>
+          </w:tcPr>
+          <w:p>
+            <w:pPr>
+              <w:pStyle w:val="Compact"/>
+              <w:jc w:val="left"/>
+            </w:pPr>
+            <w:r>
+              <w:rPr>
+                <w:sz w:val="15"/>
+              </w:rPr>
+              <w:t xml:space="preserve">E3</w:t>
+            </w:r>
+          </w:p>
+        </w:tc>
+        <w:tc>
+          <w:tcPr>
+            <w:tcW w:type="dxa" w:w="2878"/>
+          </w:tcPr>
+          <w:p>
+            <w:pPr>
+              <w:pStyle w:val="Compact"/>
+              <w:jc w:val="left"/>
+            </w:pPr>
+            <w:r>
+              <w:rPr>
+                <w:sz w:val="15"/>
+              </w:rPr>
+              <w:t xml:space="preserve">No instrument aimed at sub-facility compute (Thailand, Vietnam, Philippines; absence on coded instruments)</w:t>
+            </w:r>
+          </w:p>
+        </w:tc>
+        <w:tc>
+          <w:tcPr>
+            <w:tcW w:type="dxa" w:w="2015"/>
+          </w:tcPr>
+          <w:p>
+            <w:pPr>
+              <w:pStyle w:val="Compact"/>
+              <w:jc w:val="left"/>
+            </w:pPr>
+            <w:r>
+              <w:rPr>
+                <w:sz w:val="15"/>
+              </w:rPr>
+              <w:t xml:space="preserve">U if A1 holds, E if A1 fails</w:t>
+            </w:r>
+          </w:p>
+        </w:tc>
+        <w:tc>
+          <w:tcPr>
+            <w:tcW w:type="dxa" w:w="2015"/>
+          </w:tcPr>
+          <w:p>
+            <w:pPr>
+              <w:pStyle w:val="Compact"/>
+              <w:jc w:val="left"/>
+            </w:pPr>
+            <w:r>
+              <w:rPr>
+                <w:sz w:val="15"/>
+              </w:rPr>
+              <w:t xml:space="preserve">E if A1 holds (P2a)</w:t>
+            </w:r>
+          </w:p>
+        </w:tc>
+        <w:tc>
+          <w:tcPr>
+            <w:tcW w:type="dxa" w:w="2187"/>
+          </w:tcPr>
+          <w:p>
+            <w:pPr>
+              <w:pStyle w:val="Compact"/>
+              <w:jc w:val="left"/>
+            </w:pPr>
+            <w:r>
+              <w:rPr>
+                <w:sz w:val="15"/>
+              </w:rPr>
+              <w:t xml:space="preserve">E (P3b)</w:t>
+            </w:r>
+          </w:p>
+        </w:tc>
+        <w:tc>
+          <w:tcPr>
+            <w:tcW w:type="dxa" w:w="2418"/>
+          </w:tcPr>
+          <w:p>
+            <w:pPr>
+              <w:pStyle w:val="Compact"/>
+              <w:jc w:val="left"/>
+            </w:pPr>
+            <w:r>
+              <w:rPr>
+                <w:sz w:val="15"/>
+              </w:rPr>
+              <w:t xml:space="preserve">H1 against {H2, H3}: Moderate, conditional on A1 and on the search protocol</w:t>
+            </w:r>
+          </w:p>
+        </w:tc>
+        <w:tc>
+          <w:tcPr>
+            <w:tcW w:type="dxa" w:w="2763"/>
+          </w:tcPr>
+          <w:p>
+            <w:pPr>
+              <w:pStyle w:val="Compact"/>
+              <w:jc w:val="left"/>
+            </w:pPr>
+            <w:r>
+              <w:rPr>
+                <w:sz w:val="15"/>
+              </w:rPr>
+              <w:t xml:space="preserve">Viability benchmark; applicable general instrument; hypothetical-firm test</w:t>
+            </w:r>
+          </w:p>
+        </w:tc>
+      </w:tr>
+      <w:tr>
+        <w:tc>
+          <w:tcPr>
+            <w:tcW w:type="dxa" w:w="748"/>
+          </w:tcPr>
+          <w:p>
+            <w:pPr>
+              <w:pStyle w:val="Compact"/>
+              <w:jc w:val="left"/>
+            </w:pPr>
+            <w:r>
+              <w:rPr>
+                <w:sz w:val="15"/>
+              </w:rPr>
+              <w:t xml:space="preserve">E4</w:t>
+            </w:r>
+          </w:p>
+        </w:tc>
+        <w:tc>
+          <w:tcPr>
+            <w:tcW w:type="dxa" w:w="2878"/>
+          </w:tcPr>
+          <w:p>
+            <w:pPr>
+              <w:pStyle w:val="Compact"/>
+              <w:jc w:val="left"/>
+            </w:pPr>
+            <w:r>
+              <w:rPr>
+                <w:sz w:val="15"/>
+              </w:rPr>
+              <w:t xml:space="preserve">No capital condition at the compute layers despite their capital intensity (Vietnam, Philippines)</w:t>
+            </w:r>
+          </w:p>
+        </w:tc>
+        <w:tc>
+          <w:tcPr>
+            <w:tcW w:type="dxa" w:w="2015"/>
+          </w:tcPr>
+          <w:p>
+            <w:pPr>
+              <w:pStyle w:val="Compact"/>
+              <w:jc w:val="left"/>
+            </w:pPr>
+            <w:r>
+              <w:rPr>
+                <w:sz w:val="15"/>
+              </w:rPr>
+              <w:t xml:space="preserve">U (P1b)</w:t>
+            </w:r>
+          </w:p>
+        </w:tc>
+        <w:tc>
+          <w:tcPr>
+            <w:tcW w:type="dxa" w:w="2015"/>
+          </w:tcPr>
+          <w:p>
+            <w:pPr>
+              <w:pStyle w:val="Compact"/>
+              <w:jc w:val="left"/>
+            </w:pPr>
+            <w:r>
+              <w:rPr>
+                <w:sz w:val="15"/>
+              </w:rPr>
+              <w:t xml:space="preserve">C</w:t>
+            </w:r>
+          </w:p>
+        </w:tc>
+        <w:tc>
+          <w:tcPr>
+            <w:tcW w:type="dxa" w:w="2187"/>
+          </w:tcPr>
+          <w:p>
+            <w:pPr>
+              <w:pStyle w:val="Compact"/>
+              <w:jc w:val="left"/>
+            </w:pPr>
+            <w:r>
+              <w:rPr>
+                <w:sz w:val="15"/>
+              </w:rPr>
+              <w:t xml:space="preserve">C</w:t>
+            </w:r>
+          </w:p>
+        </w:tc>
+        <w:tc>
+          <w:tcPr>
+            <w:tcW w:type="dxa" w:w="2418"/>
+          </w:tcPr>
+          <w:p>
+            <w:pPr>
+              <w:pStyle w:val="Compact"/>
+              <w:jc w:val="left"/>
+            </w:pPr>
+            <w:r>
+              <w:rPr>
+                <w:sz w:val="15"/>
+              </w:rPr>
+              <w:t xml:space="preserve">H1 against {H2, H3}: Moderate; rests on Decision 21/2026, Decree 260 and the Act and Plan, with the Vietnamese circulars and the Philippine qualification guidelines unread</w:t>
+            </w:r>
+          </w:p>
+        </w:tc>
+        <w:tc>
+          <w:tcPr>
+            <w:tcW w:type="dxa" w:w="2763"/>
+          </w:tcPr>
+          <w:p>
+            <w:pPr>
+              <w:pStyle w:val="Compact"/>
+              <w:jc w:val="left"/>
+            </w:pPr>
+            <w:r>
+              <w:rPr>
+                <w:sz w:val="15"/>
+              </w:rPr>
+              <w:t xml:space="preserve">The circulars and the guidelines</w:t>
+            </w:r>
+          </w:p>
+        </w:tc>
+      </w:tr>
+      <w:tr>
+        <w:tc>
+          <w:tcPr>
+            <w:tcW w:type="dxa" w:w="748"/>
+          </w:tcPr>
+          <w:p>
+            <w:pPr>
+              <w:pStyle w:val="Compact"/>
+              <w:jc w:val="left"/>
+            </w:pPr>
+            <w:r>
+              <w:rPr>
+                <w:sz w:val="15"/>
+              </w:rPr>
+              <w:t xml:space="preserve">E5</w:t>
+            </w:r>
+          </w:p>
+        </w:tc>
+        <w:tc>
+          <w:tcPr>
+            <w:tcW w:type="dxa" w:w="2878"/>
+          </w:tcPr>
+          <w:p>
+            <w:pPr>
+              <w:pStyle w:val="Compact"/>
+              <w:jc w:val="left"/>
+            </w:pPr>
+            <w:r>
+              <w:rPr>
+                <w:sz w:val="15"/>
+              </w:rPr>
+              <w:t xml:space="preserve">Extension of the exemption tied to spending of at least 1% of sales, or THB 200m if lower, in the first three years (Thailand; cross-sectoral measure, verified)</w:t>
+            </w:r>
+          </w:p>
+        </w:tc>
+        <w:tc>
+          <w:tcPr>
+            <w:tcW w:type="dxa" w:w="2015"/>
+          </w:tcPr>
+          <w:p>
+            <w:pPr>
+              <w:pStyle w:val="Compact"/>
+              <w:jc w:val="left"/>
+            </w:pPr>
+            <w:r>
+              <w:rPr>
+                <w:sz w:val="15"/>
+              </w:rPr>
+              <w:t xml:space="preserve">U (P1c)</w:t>
+            </w:r>
+          </w:p>
+        </w:tc>
+        <w:tc>
+          <w:tcPr>
+            <w:tcW w:type="dxa" w:w="2015"/>
+          </w:tcPr>
+          <w:p>
+            <w:pPr>
+              <w:pStyle w:val="Compact"/>
+              <w:jc w:val="left"/>
+            </w:pPr>
+            <w:r>
+              <w:rPr>
+                <w:sz w:val="15"/>
+              </w:rPr>
+              <w:t xml:space="preserve">E (P2b)</w:t>
+            </w:r>
+          </w:p>
+        </w:tc>
+        <w:tc>
+          <w:tcPr>
+            <w:tcW w:type="dxa" w:w="2187"/>
+          </w:tcPr>
+          <w:p>
+            <w:pPr>
+              <w:pStyle w:val="Compact"/>
+              <w:jc w:val="left"/>
+            </w:pPr>
+            <w:r>
+              <w:rPr>
+                <w:sz w:val="15"/>
+              </w:rPr>
+              <w:t xml:space="preserve">E (P3a)</w:t>
+            </w:r>
+          </w:p>
+        </w:tc>
+        <w:tc>
+          <w:tcPr>
+            <w:tcW w:type="dxa" w:w="2418"/>
+          </w:tcPr>
+          <w:p>
+            <w:pPr>
+              <w:pStyle w:val="Compact"/>
+              <w:jc w:val="left"/>
+            </w:pPr>
+            <w:r>
+              <w:rPr>
+                <w:sz w:val="15"/>
+              </w:rPr>
+              <w:t xml:space="preserve">H1 against {H2, H3}: Moderate</w:t>
+            </w:r>
+          </w:p>
+        </w:tc>
+        <w:tc>
+          <w:tcPr>
+            <w:tcW w:type="dxa" w:w="2763"/>
+          </w:tcPr>
+          <w:p>
+            <w:pPr>
+              <w:pStyle w:val="Compact"/>
+              <w:jc w:val="left"/>
+            </w:pPr>
+            <w:r>
+              <w:rPr>
+                <w:sz w:val="15"/>
+              </w:rPr>
+              <w:t xml:space="preserve">How BOI applies the measure to firms without early sales</w:t>
+            </w:r>
+          </w:p>
+        </w:tc>
+      </w:tr>
+      <w:tr>
+        <w:tc>
+          <w:tcPr>
+            <w:tcW w:type="dxa" w:w="748"/>
+          </w:tcPr>
+          <w:p>
+            <w:pPr>
+              <w:pStyle w:val="Compact"/>
+              <w:jc w:val="left"/>
+            </w:pPr>
+            <w:r>
+              <w:rPr>
+                <w:sz w:val="15"/>
+              </w:rPr>
+              <w:t xml:space="preserve">E6</w:t>
+            </w:r>
+          </w:p>
+        </w:tc>
+        <w:tc>
+          <w:tcPr>
+            <w:tcW w:type="dxa" w:w="2878"/>
+          </w:tcPr>
+          <w:p>
+            <w:pPr>
+              <w:pStyle w:val="Compact"/>
+              <w:jc w:val="left"/>
+            </w:pPr>
+            <w:r>
+              <w:rPr>
+                <w:sz w:val="15"/>
+              </w:rPr>
+              <w:t xml:space="preserve">Auditor-verified annual self-declaration at the company’s cost in the low-capital track (Malaysia; verified against the July 2025 guideline)</w:t>
+            </w:r>
+          </w:p>
+        </w:tc>
+        <w:tc>
+          <w:tcPr>
+            <w:tcW w:type="dxa" w:w="2015"/>
+          </w:tcPr>
+          <w:p>
+            <w:pPr>
+              <w:pStyle w:val="Compact"/>
+              <w:jc w:val="left"/>
+            </w:pPr>
+            <w:r>
+              <w:rPr>
+                <w:sz w:val="15"/>
+              </w:rPr>
+              <w:t xml:space="preserve">U (P1d)</w:t>
+            </w:r>
+          </w:p>
+        </w:tc>
+        <w:tc>
+          <w:tcPr>
+            <w:tcW w:type="dxa" w:w="2015"/>
+          </w:tcPr>
+          <w:p>
+            <w:pPr>
+              <w:pStyle w:val="Compact"/>
+              <w:jc w:val="left"/>
+            </w:pPr>
+            <w:r>
+              <w:rPr>
+                <w:sz w:val="15"/>
+              </w:rPr>
+              <w:t xml:space="preserve">E (P2b)</w:t>
+            </w:r>
+          </w:p>
+        </w:tc>
+        <w:tc>
+          <w:tcPr>
+            <w:tcW w:type="dxa" w:w="2187"/>
+          </w:tcPr>
+          <w:p>
+            <w:pPr>
+              <w:pStyle w:val="Compact"/>
+              <w:jc w:val="left"/>
+            </w:pPr>
+            <w:r>
+              <w:rPr>
+                <w:sz w:val="15"/>
+              </w:rPr>
+              <w:t xml:space="preserve">C</w:t>
+            </w:r>
+          </w:p>
+        </w:tc>
+        <w:tc>
+          <w:tcPr>
+            <w:tcW w:type="dxa" w:w="2418"/>
+          </w:tcPr>
+          <w:p>
+            <w:pPr>
+              <w:pStyle w:val="Compact"/>
+              <w:jc w:val="left"/>
+            </w:pPr>
+            <w:r>
+              <w:rPr>
+                <w:sz w:val="15"/>
+              </w:rPr>
+              <w:t xml:space="preserve">H1 against H2: Moderate; audit cost unmeasured</w:t>
+            </w:r>
+          </w:p>
+        </w:tc>
+        <w:tc>
+          <w:tcPr>
+            <w:tcW w:type="dxa" w:w="2763"/>
+          </w:tcPr>
+          <w:p>
+            <w:pPr>
+              <w:pStyle w:val="Compact"/>
+              <w:jc w:val="left"/>
+            </w:pPr>
+            <w:r>
+              <w:rPr>
+                <w:sz w:val="15"/>
+              </w:rPr>
+              <w:t xml:space="preserve">Audit cost relative to RM50,000 of capital</w:t>
+            </w:r>
+          </w:p>
+        </w:tc>
+      </w:tr>
+      <w:tr>
+        <w:tc>
+          <w:tcPr>
+            <w:tcW w:type="dxa" w:w="748"/>
+          </w:tcPr>
+          <w:p>
+            <w:pPr>
+              <w:pStyle w:val="Compact"/>
+              <w:jc w:val="left"/>
+            </w:pPr>
+            <w:r>
+              <w:rPr>
+                <w:sz w:val="15"/>
+              </w:rPr>
+              <w:t xml:space="preserve">E7</w:t>
+            </w:r>
+          </w:p>
+        </w:tc>
+        <w:tc>
+          <w:tcPr>
+            <w:tcW w:type="dxa" w:w="2878"/>
+          </w:tcPr>
+          <w:p>
+            <w:pPr>
+              <w:pStyle w:val="Compact"/>
+              <w:jc w:val="left"/>
+            </w:pPr>
+            <w:r>
+              <w:rPr>
+                <w:sz w:val="15"/>
+              </w:rPr>
+              <w:t xml:space="preserve">Common firm-scale boundary for all activities in the Act (Philippines); activity tiers that name AI and data centres</w:t>
+            </w:r>
+          </w:p>
+        </w:tc>
+        <w:tc>
+          <w:tcPr>
+            <w:tcW w:type="dxa" w:w="2015"/>
+          </w:tcPr>
+          <w:p>
+            <w:pPr>
+              <w:pStyle w:val="Compact"/>
+              <w:jc w:val="left"/>
+            </w:pPr>
+            <w:r>
+              <w:rPr>
+                <w:sz w:val="15"/>
+              </w:rPr>
+              <w:t xml:space="preserve">U (P1a, P1b)</w:t>
+            </w:r>
+          </w:p>
+        </w:tc>
+        <w:tc>
+          <w:tcPr>
+            <w:tcW w:type="dxa" w:w="2015"/>
+          </w:tcPr>
+          <w:p>
+            <w:pPr>
+              <w:pStyle w:val="Compact"/>
+              <w:jc w:val="left"/>
+            </w:pPr>
+            <w:r>
+              <w:rPr>
+                <w:sz w:val="15"/>
+              </w:rPr>
+              <w:t xml:space="preserve">C</w:t>
+            </w:r>
+          </w:p>
+        </w:tc>
+        <w:tc>
+          <w:tcPr>
+            <w:tcW w:type="dxa" w:w="2187"/>
+          </w:tcPr>
+          <w:p>
+            <w:pPr>
+              <w:pStyle w:val="Compact"/>
+              <w:jc w:val="left"/>
+            </w:pPr>
+            <w:r>
+              <w:rPr>
+                <w:sz w:val="15"/>
+              </w:rPr>
+              <w:t xml:space="preserve">E (P3a) for the boundary; U for the tiers, which name AI</w:t>
+            </w:r>
+          </w:p>
+        </w:tc>
+        <w:tc>
+          <w:tcPr>
+            <w:tcW w:type="dxa" w:w="2418"/>
+          </w:tcPr>
+          <w:p>
+            <w:pPr>
+              <w:pStyle w:val="Compact"/>
+              <w:jc w:val="left"/>
+            </w:pPr>
+            <w:r>
+              <w:rPr>
+                <w:sz w:val="15"/>
+              </w:rPr>
+              <w:t xml:space="preserve">H3 against H1: Weak to Moderate; Act, implementing rules and Plan read</w:t>
+            </w:r>
+          </w:p>
+        </w:tc>
+        <w:tc>
+          <w:tcPr>
+            <w:tcW w:type="dxa" w:w="2763"/>
+          </w:tcPr>
+          <w:p>
+            <w:pPr>
+              <w:pStyle w:val="Compact"/>
+              <w:jc w:val="left"/>
+            </w:pPr>
+            <w:r>
+              <w:rPr>
+                <w:sz w:val="15"/>
+              </w:rPr>
+              <w:t xml:space="preserve">Pre-AI instruments with the same boundary; Plan guidelines</w:t>
+            </w:r>
+          </w:p>
+        </w:tc>
+      </w:tr>
+      <w:tr>
+        <w:tc>
+          <w:tcPr>
+            <w:tcW w:type="dxa" w:w="748"/>
+          </w:tcPr>
+          <w:p>
+            <w:pPr>
+              <w:pStyle w:val="Compact"/>
+              <w:jc w:val="left"/>
+            </w:pPr>
+            <w:r>
+              <w:rPr>
+                <w:sz w:val="15"/>
+              </w:rPr>
+              <w:t xml:space="preserve">E8</w:t>
+            </w:r>
+          </w:p>
+        </w:tc>
+        <w:tc>
+          <w:tcPr>
+            <w:tcW w:type="dxa" w:w="2878"/>
+          </w:tcPr>
+          <w:p>
+            <w:pPr>
+              <w:pStyle w:val="Compact"/>
+              <w:jc w:val="left"/>
+            </w:pPr>
+            <w:r>
+              <w:rPr>
+                <w:sz w:val="15"/>
+              </w:rPr>
+              <w:t xml:space="preserve">Explicit startup track with direct support and recognition by the provincial authority (Vietnam; verified against Decree 260/2026, Article 11)</w:t>
+            </w:r>
+          </w:p>
+        </w:tc>
+        <w:tc>
+          <w:tcPr>
+            <w:tcW w:type="dxa" w:w="2015"/>
+          </w:tcPr>
+          <w:p>
+            <w:pPr>
+              <w:pStyle w:val="Compact"/>
+              <w:jc w:val="left"/>
+            </w:pPr>
+            <w:r>
+              <w:rPr>
+                <w:sz w:val="15"/>
+              </w:rPr>
+              <w:t xml:space="preserve">U (P1c)</w:t>
+            </w:r>
+          </w:p>
+        </w:tc>
+        <w:tc>
+          <w:tcPr>
+            <w:tcW w:type="dxa" w:w="2015"/>
+          </w:tcPr>
+          <w:p>
+            <w:pPr>
+              <w:pStyle w:val="Compact"/>
+              <w:jc w:val="left"/>
+            </w:pPr>
+            <w:r>
+              <w:rPr>
+                <w:sz w:val="15"/>
+              </w:rPr>
+              <w:t xml:space="preserve">U (P2c)</w:t>
+            </w:r>
+          </w:p>
+        </w:tc>
+        <w:tc>
+          <w:tcPr>
+            <w:tcW w:type="dxa" w:w="2187"/>
+          </w:tcPr>
+          <w:p>
+            <w:pPr>
+              <w:pStyle w:val="Compact"/>
+              <w:jc w:val="left"/>
+            </w:pPr>
+            <w:r>
+              <w:rPr>
+                <w:sz w:val="15"/>
+              </w:rPr>
+              <w:t xml:space="preserve">U (P3a; a 2026 design with no scale tiers)</w:t>
+            </w:r>
+          </w:p>
+        </w:tc>
+        <w:tc>
+          <w:tcPr>
+            <w:tcW w:type="dxa" w:w="2418"/>
+          </w:tcPr>
+          <w:p>
+            <w:pPr>
+              <w:pStyle w:val="Compact"/>
+              <w:jc w:val="left"/>
+            </w:pPr>
+            <w:r>
+              <w:rPr>
+                <w:sz w:val="15"/>
+              </w:rPr>
+              <w:t xml:space="preserve">All three unexpected: no pair separated</w:t>
+            </w:r>
+          </w:p>
+        </w:tc>
+        <w:tc>
+          <w:tcPr>
+            <w:tcW w:type="dxa" w:w="2763"/>
+          </w:tcPr>
+          <w:p>
+            <w:pPr>
+              <w:pStyle w:val="Compact"/>
+              <w:jc w:val="left"/>
+            </w:pPr>
+            <w:r>
+              <w:rPr>
+                <w:sz w:val="15"/>
+              </w:rPr>
+              <w:t xml:space="preserve">Take-up evidence</w:t>
+            </w:r>
+          </w:p>
+        </w:tc>
+      </w:tr>
+      <w:tr>
+        <w:tc>
+          <w:tcPr>
+            <w:tcW w:type="dxa" w:w="748"/>
+          </w:tcPr>
+          <w:p>
+            <w:pPr>
+              <w:pStyle w:val="Compact"/>
+              <w:jc w:val="left"/>
+            </w:pPr>
+            <w:r>
+              <w:rPr>
+                <w:sz w:val="15"/>
+              </w:rPr>
+              <w:t xml:space="preserve">E9</w:t>
+            </w:r>
+          </w:p>
+        </w:tc>
+        <w:tc>
+          <w:tcPr>
+            <w:tcW w:type="dxa" w:w="2878"/>
+          </w:tcPr>
+          <w:p>
+            <w:pPr>
+              <w:pStyle w:val="Compact"/>
+              <w:jc w:val="left"/>
+            </w:pPr>
+            <w:r>
+              <w:rPr>
+                <w:sz w:val="15"/>
+              </w:rPr>
+              <w:t xml:space="preserve">Official criticism of data-centre incentives on employment grounds (Malaysia)</w:t>
+            </w:r>
+          </w:p>
+        </w:tc>
+        <w:tc>
+          <w:tcPr>
+            <w:tcW w:type="dxa" w:w="2015"/>
+          </w:tcPr>
+          <w:p>
+            <w:pPr>
+              <w:pStyle w:val="Compact"/>
+              <w:jc w:val="left"/>
+            </w:pPr>
+            <w:r>
+              <w:rPr>
+                <w:sz w:val="15"/>
+              </w:rPr>
+              <w:t xml:space="preserve">C</w:t>
+            </w:r>
+          </w:p>
+        </w:tc>
+        <w:tc>
+          <w:tcPr>
+            <w:tcW w:type="dxa" w:w="2015"/>
+          </w:tcPr>
+          <w:p>
+            <w:pPr>
+              <w:pStyle w:val="Compact"/>
+              <w:jc w:val="left"/>
+            </w:pPr>
+            <w:r>
+              <w:rPr>
+                <w:sz w:val="15"/>
+              </w:rPr>
+              <w:t xml:space="preserve">C</w:t>
+            </w:r>
+          </w:p>
+        </w:tc>
+        <w:tc>
+          <w:tcPr>
+            <w:tcW w:type="dxa" w:w="2187"/>
+          </w:tcPr>
+          <w:p>
+            <w:pPr>
+              <w:pStyle w:val="Compact"/>
+              <w:jc w:val="left"/>
+            </w:pPr>
+            <w:r>
+              <w:rPr>
+                <w:sz w:val="15"/>
+              </w:rPr>
+              <w:t xml:space="preserve">C</w:t>
+            </w:r>
+          </w:p>
+        </w:tc>
+        <w:tc>
+          <w:tcPr>
+            <w:tcW w:type="dxa" w:w="2418"/>
+          </w:tcPr>
+          <w:p>
+            <w:pPr>
+              <w:pStyle w:val="Compact"/>
+              <w:jc w:val="left"/>
+            </w:pPr>
+            <w:r>
+              <w:rPr>
+                <w:sz w:val="15"/>
+              </w:rPr>
+              <w:t xml:space="preserve">None: Weak</w:t>
+            </w:r>
+          </w:p>
+        </w:tc>
+        <w:tc>
+          <w:tcPr>
+            <w:tcW w:type="dxa" w:w="2763"/>
+          </w:tcPr>
+          <w:p>
+            <w:pPr>
+              <w:pStyle w:val="Compact"/>
+              <w:jc w:val="left"/>
+            </w:pPr>
+            <w:r>
+              <w:rPr>
+                <w:sz w:val="15"/>
+              </w:rPr>
+              <w:t xml:space="preserve">Evidence on whether the criticism cited firm size</w:t>
+            </w:r>
+          </w:p>
+        </w:tc>
+      </w:tr>
+      <w:tr>
+        <w:tc>
+          <w:tcPr>
+            <w:tcW w:type="dxa" w:w="748"/>
+          </w:tcPr>
+          <w:p>
+            <w:pPr>
+              <w:pStyle w:val="Compact"/>
+              <w:jc w:val="left"/>
+            </w:pPr>
+            <w:r>
+              <w:rPr>
+                <w:sz w:val="15"/>
+              </w:rPr>
+              <w:t xml:space="preserve">E10</w:t>
+            </w:r>
+          </w:p>
+        </w:tc>
+        <w:tc>
+          <w:tcPr>
+            <w:tcW w:type="dxa" w:w="2878"/>
+          </w:tcPr>
+          <w:p>
+            <w:pPr>
+              <w:pStyle w:val="Compact"/>
+              <w:jc w:val="left"/>
+            </w:pPr>
+            <w:r>
+              <w:rPr>
+                <w:sz w:val="15"/>
+              </w:rPr>
+              <w:t xml:space="preserve">Thai-held share of capital falls with depth (46, 15, 0 per cent; Thailand)</w:t>
+            </w:r>
+          </w:p>
+        </w:tc>
+        <w:tc>
+          <w:tcPr>
+            <w:tcW w:type="dxa" w:w="2015"/>
+          </w:tcPr>
+          <w:p>
+            <w:pPr>
+              <w:pStyle w:val="Compact"/>
+              <w:jc w:val="left"/>
+            </w:pPr>
+            <w:r>
+              <w:rPr>
+                <w:sz w:val="15"/>
+              </w:rPr>
+              <w:t xml:space="preserve">C</w:t>
+            </w:r>
+          </w:p>
+        </w:tc>
+        <w:tc>
+          <w:tcPr>
+            <w:tcW w:type="dxa" w:w="2015"/>
+          </w:tcPr>
+          <w:p>
+            <w:pPr>
+              <w:pStyle w:val="Compact"/>
+              <w:jc w:val="left"/>
+            </w:pPr>
+            <w:r>
+              <w:rPr>
+                <w:sz w:val="15"/>
+              </w:rPr>
+              <w:t xml:space="preserve">C</w:t>
+            </w:r>
+          </w:p>
+        </w:tc>
+        <w:tc>
+          <w:tcPr>
+            <w:tcW w:type="dxa" w:w="2187"/>
+          </w:tcPr>
+          <w:p>
+            <w:pPr>
+              <w:pStyle w:val="Compact"/>
+              <w:jc w:val="left"/>
+            </w:pPr>
+            <w:r>
+              <w:rPr>
+                <w:sz w:val="15"/>
+              </w:rPr>
+              <w:t xml:space="preserve">C</w:t>
+            </w:r>
+          </w:p>
+        </w:tc>
+        <w:tc>
+          <w:tcPr>
+            <w:tcW w:type="dxa" w:w="2418"/>
+          </w:tcPr>
+          <w:p>
+            <w:pPr>
+              <w:pStyle w:val="Compact"/>
+              <w:jc w:val="left"/>
+            </w:pPr>
+            <w:r>
+              <w:rPr>
+                <w:sz w:val="15"/>
+              </w:rPr>
+              <w:t xml:space="preserve">None: Weak; descriptive; three points</w:t>
+            </w:r>
+          </w:p>
+        </w:tc>
+        <w:tc>
+          <w:tcPr>
+            <w:tcW w:type="dxa" w:w="2763"/>
+          </w:tcPr>
+          <w:p>
+            <w:pPr>
+              <w:pStyle w:val="Compact"/>
+              <w:jc w:val="left"/>
+            </w:pPr>
+            <w:r>
+              <w:rPr>
+                <w:sz w:val="15"/>
+              </w:rPr>
+              <w:t xml:space="preserve">Project-level data</w:t>
+            </w:r>
+          </w:p>
+        </w:tc>
+      </w:tr>
+      <w:tr>
+        <w:tc>
+          <w:tcPr>
+            <w:tcW w:type="dxa" w:w="748"/>
+          </w:tcPr>
+          <w:p>
+            <w:pPr>
+              <w:pStyle w:val="Compact"/>
+              <w:jc w:val="left"/>
+            </w:pPr>
+            <w:r>
+              <w:rPr>
+                <w:sz w:val="15"/>
+              </w:rPr>
+              <w:t xml:space="preserve">E11</w:t>
+            </w:r>
+          </w:p>
+        </w:tc>
+        <w:tc>
+          <w:tcPr>
+            <w:tcW w:type="dxa" w:w="2878"/>
+          </w:tcPr>
+          <w:p>
+            <w:pPr>
+              <w:pStyle w:val="Compact"/>
+              <w:jc w:val="left"/>
+            </w:pPr>
+            <w:r>
+              <w:rPr>
+                <w:sz w:val="15"/>
+              </w:rPr>
+              <w:t xml:space="preserve">Low-capital cloud routes screened by fixed compliance costs: Thai cloud services (certification, two certified data centres) and the Malaysian Digital track (annual audit)</w:t>
+            </w:r>
+          </w:p>
+        </w:tc>
+        <w:tc>
+          <w:tcPr>
+            <w:tcW w:type="dxa" w:w="2015"/>
+          </w:tcPr>
+          <w:p>
+            <w:pPr>
+              <w:pStyle w:val="Compact"/>
+              <w:jc w:val="left"/>
+            </w:pPr>
+            <w:r>
+              <w:rPr>
+                <w:sz w:val="15"/>
+              </w:rPr>
+              <w:t xml:space="preserve">U (P1d)</w:t>
+            </w:r>
+          </w:p>
+        </w:tc>
+        <w:tc>
+          <w:tcPr>
+            <w:tcW w:type="dxa" w:w="2015"/>
+          </w:tcPr>
+          <w:p>
+            <w:pPr>
+              <w:pStyle w:val="Compact"/>
+              <w:jc w:val="left"/>
+            </w:pPr>
+            <w:r>
+              <w:rPr>
+                <w:sz w:val="15"/>
+              </w:rPr>
+              <w:t xml:space="preserve">E (P2b)</w:t>
+            </w:r>
+          </w:p>
+        </w:tc>
+        <w:tc>
+          <w:tcPr>
+            <w:tcW w:type="dxa" w:w="2187"/>
+          </w:tcPr>
+          <w:p>
+            <w:pPr>
+              <w:pStyle w:val="Compact"/>
+              <w:jc w:val="left"/>
+            </w:pPr>
+            <w:r>
+              <w:rPr>
+                <w:sz w:val="15"/>
+              </w:rPr>
+              <w:t xml:space="preserve">C</w:t>
+            </w:r>
+          </w:p>
+        </w:tc>
+        <w:tc>
+          <w:tcPr>
+            <w:tcW w:type="dxa" w:w="2418"/>
+          </w:tcPr>
+          <w:p>
+            <w:pPr>
+              <w:pStyle w:val="Compact"/>
+              <w:jc w:val="left"/>
+            </w:pPr>
+            <w:r>
+              <w:rPr>
+                <w:sz w:val="15"/>
+              </w:rPr>
+              <w:t xml:space="preserve">H1 against H2: Moderate; verified against the guides, cost size unmeasured</w:t>
+            </w:r>
+          </w:p>
+        </w:tc>
+        <w:tc>
+          <w:tcPr>
+            <w:tcW w:type="dxa" w:w="2763"/>
+          </w:tcPr>
+          <w:p>
+            <w:pPr>
+              <w:pStyle w:val="Compact"/>
+              <w:jc w:val="left"/>
+            </w:pPr>
+            <w:r>
+              <w:rPr>
+                <w:sz w:val="15"/>
+              </w:rPr>
+              <w:t xml:space="preserve">Cost of certification and audit relative to a small provider’s capital</w:t>
+            </w:r>
+          </w:p>
+        </w:tc>
+      </w:tr>
+      <w:tr>
+        <w:tc>
+          <w:tcPr>
+            <w:tcW w:type="dxa" w:w="748"/>
+          </w:tcPr>
+          <w:p>
+            <w:pPr>
+              <w:pStyle w:val="Compact"/>
+              <w:jc w:val="left"/>
+            </w:pPr>
+            <w:r>
+              <w:rPr>
+                <w:sz w:val="15"/>
+              </w:rPr>
+              <w:t xml:space="preserve">E12</w:t>
+            </w:r>
+          </w:p>
+        </w:tc>
+        <w:tc>
+          <w:tcPr>
+            <w:tcW w:type="dxa" w:w="2878"/>
+          </w:tcPr>
+          <w:p>
+            <w:pPr>
+              <w:pStyle w:val="Compact"/>
+              <w:jc w:val="left"/>
+            </w:pPr>
+            <w:r>
+              <w:rPr>
+                <w:sz w:val="15"/>
+              </w:rPr>
+              <w:t xml:space="preserve">Required research ratio falls as total capital rises (VND 100 billion and 6,000 billion tiers) in high-technology enterprise criteria (Vietnam; verified)</w:t>
+            </w:r>
+          </w:p>
+        </w:tc>
+        <w:tc>
+          <w:tcPr>
+            <w:tcW w:type="dxa" w:w="2015"/>
+          </w:tcPr>
+          <w:p>
+            <w:pPr>
+              <w:pStyle w:val="Compact"/>
+              <w:jc w:val="left"/>
+            </w:pPr>
+            <w:r>
+              <w:rPr>
+                <w:sz w:val="15"/>
+              </w:rPr>
+              <w:t xml:space="preserve">U (P1d)</w:t>
+            </w:r>
+          </w:p>
+        </w:tc>
+        <w:tc>
+          <w:tcPr>
+            <w:tcW w:type="dxa" w:w="2015"/>
+          </w:tcPr>
+          <w:p>
+            <w:pPr>
+              <w:pStyle w:val="Compact"/>
+              <w:jc w:val="left"/>
+            </w:pPr>
+            <w:r>
+              <w:rPr>
+                <w:sz w:val="15"/>
+              </w:rPr>
+              <w:t xml:space="preserve">E (P2b)</w:t>
+            </w:r>
+          </w:p>
+        </w:tc>
+        <w:tc>
+          <w:tcPr>
+            <w:tcW w:type="dxa" w:w="2187"/>
+          </w:tcPr>
+          <w:p>
+            <w:pPr>
+              <w:pStyle w:val="Compact"/>
+              <w:jc w:val="left"/>
+            </w:pPr>
+            <w:r>
+              <w:rPr>
+                <w:sz w:val="15"/>
+              </w:rPr>
+              <w:t xml:space="preserve">C</w:t>
+            </w:r>
+          </w:p>
+        </w:tc>
+        <w:tc>
+          <w:tcPr>
+            <w:tcW w:type="dxa" w:w="2418"/>
+          </w:tcPr>
+          <w:p>
+            <w:pPr>
+              <w:pStyle w:val="Compact"/>
+              <w:jc w:val="left"/>
+            </w:pPr>
+            <w:r>
+              <w:rPr>
+                <w:sz w:val="15"/>
+              </w:rPr>
+              <w:t xml:space="preserve">H1 against H2: Moderate; applies to enterprise recognition, not to compute provision</w:t>
+            </w:r>
+          </w:p>
+        </w:tc>
+        <w:tc>
+          <w:tcPr>
+            <w:tcW w:type="dxa" w:w="2763"/>
+          </w:tcPr>
+          <w:p>
+            <w:pPr>
+              <w:pStyle w:val="Compact"/>
+              <w:jc w:val="left"/>
+            </w:pPr>
+            <w:r>
+              <w:rPr>
+                <w:sz w:val="15"/>
+              </w:rPr>
+              <w:t xml:space="preserve">Whether the criteria apply to compute providers</w:t>
+            </w:r>
+          </w:p>
+        </w:tc>
+      </w:tr>
+    </w:tbl>
+    <w:p>
+      <w:pPr>
+        <w:pStyle w:val="BodyText"/>
+      </w:pPr>
+      <w:r>
+        <w:rPr>
+          <w:iCs/>
+          <w:i/>
+        </w:rPr>
+        <w:t xml:space="preserve">Note.</w:t>
+      </w:r>
+      <w:r>
+        <w:t xml:space="preserve"> </w:t>
+      </w:r>
+      <w:r>
+        <w:t xml:space="preserve">E = expected; C = compatible; U = unexpected; X = contradicted. Ratings follow the predictions P1a to P3c of Section 2.4 and the rubric of Section 3.3 of the manuscript. Rows resting on unverified coding are provisional.</w:t>
+      </w:r>
+    </w:p>
+    <w:bookmarkEnd w:id="28"/>
+    <w:bookmarkStart w:id="29" w:name="X85004c227c6a131437c0397ef19b5831bb8be07"/>
     <w:p>
       <w:pPr>
         <w:pStyle w:val="Heading2"/>
       </w:pPr>
       <w:r>
-        <w:t xml:space="preserve">Codebook</w:t>
+        <w:t xml:space="preserve">Table S4. Illustrative eligibility ladder calibrated to cost benchmarks</w:t>
+      </w:r>
+    </w:p>
+    <w:tbl>
+      <w:tblPr>
+        <w:tblStyle w:val="Table"/>
+        <w:tblLayout w:type="fixed"/>
+        <w:tblLook w:firstRow="1" w:lastRow="0" w:firstColumn="0" w:lastColumn="0" w:noHBand="0" w:noVBand="0" w:val="0020"/>
+        <w:jc w:val="start"/>
+        <w:tblBorders>
+          <w:top w:val="single" w:sz="4" w:color="999999"/>
+          <w:left w:val="single" w:sz="4" w:color="999999"/>
+          <w:bottom w:val="single" w:sz="4" w:color="999999"/>
+          <w:right w:val="single" w:sz="4" w:color="999999"/>
+          <w:insideH w:val="single" w:sz="4" w:color="999999"/>
+          <w:insideV w:val="single" w:sz="4" w:color="999999"/>
+        </w:tblBorders>
+        <w:tblLayout w:type="fixed"/>
+        <w:tblW w:w="15023" w:type="dxa"/>
+      </w:tblPr>
+      <w:tblGrid>
+        <w:gridCol w:w="715"/>
+        <w:gridCol w:w="2861"/>
+        <w:gridCol w:w="3577"/>
+        <w:gridCol w:w="4292"/>
+        <w:gridCol w:w="3577"/>
+      </w:tblGrid>
+      <w:tr>
+        <w:trPr>
+          <w:tblHeader w:val="true"/>
+        </w:trPr>
+        <w:tc>
+          <w:tcPr>
+            <w:tcW w:type="dxa" w:w="715"/>
+          </w:tcPr>
+          <w:p>
+            <w:pPr>
+              <w:pStyle w:val="Compact"/>
+              <w:jc w:val="left"/>
+            </w:pPr>
+            <w:r>
+              <w:rPr>
+                <w:b/>
+                <w:sz w:val="15"/>
+              </w:rPr>
+              <w:t xml:space="preserve">Rung</w:t>
+            </w:r>
+          </w:p>
+        </w:tc>
+        <w:tc>
+          <w:tcPr>
+            <w:tcW w:type="dxa" w:w="2862"/>
+          </w:tcPr>
+          <w:p>
+            <w:pPr>
+              <w:pStyle w:val="Compact"/>
+              <w:jc w:val="left"/>
+            </w:pPr>
+            <w:r>
+              <w:rPr>
+                <w:b/>
+                <w:sz w:val="15"/>
+              </w:rPr>
+              <w:t xml:space="preserve">Capacity</w:t>
+            </w:r>
+          </w:p>
+        </w:tc>
+        <w:tc>
+          <w:tcPr>
+            <w:tcW w:type="dxa" w:w="3577"/>
+          </w:tcPr>
+          <w:p>
+            <w:pPr>
+              <w:pStyle w:val="Compact"/>
+              <w:jc w:val="left"/>
+            </w:pPr>
+            <w:r>
+              <w:rPr>
+                <w:b/>
+                <w:sz w:val="15"/>
+              </w:rPr>
+              <w:t xml:space="preserve">Capital to host: construction only to fully equipped (US$ million)</w:t>
+            </w:r>
+          </w:p>
+        </w:tc>
+        <w:tc>
+          <w:tcPr>
+            <w:tcW w:type="dxa" w:w="4292"/>
+          </w:tcPr>
+          <w:p>
+            <w:pPr>
+              <w:pStyle w:val="Compact"/>
+              <w:jc w:val="left"/>
+            </w:pPr>
+            <w:r>
+              <w:rPr>
+                <w:b/>
+                <w:sz w:val="15"/>
+              </w:rPr>
+              <w:t xml:space="preserve">Instrument type that may suit the rung</w:t>
+            </w:r>
+          </w:p>
+        </w:tc>
+        <w:tc>
+          <w:tcPr>
+            <w:tcW w:type="dxa" w:w="3577"/>
+          </w:tcPr>
+          <w:p>
+            <w:pPr>
+              <w:pStyle w:val="Compact"/>
+              <w:jc w:val="left"/>
+            </w:pPr>
+            <w:r>
+              <w:rPr>
+                <w:b/>
+                <w:sz w:val="15"/>
+              </w:rPr>
+              <w:t xml:space="preserve">Reason</w:t>
+            </w:r>
+          </w:p>
+        </w:tc>
+      </w:tr>
+      <w:tr>
+        <w:tc>
+          <w:tcPr>
+            <w:tcW w:type="dxa" w:w="715"/>
+          </w:tcPr>
+          <w:p>
+            <w:pPr>
+              <w:pStyle w:val="Compact"/>
+              <w:jc w:val="left"/>
+            </w:pPr>
+            <w:r>
+              <w:rPr>
+                <w:sz w:val="15"/>
+              </w:rPr>
+              <w:t xml:space="preserve">0</w:t>
+            </w:r>
+          </w:p>
+        </w:tc>
+        <w:tc>
+          <w:tcPr>
+            <w:tcW w:type="dxa" w:w="2862"/>
+          </w:tcPr>
+          <w:p>
+            <w:pPr>
+              <w:pStyle w:val="Compact"/>
+              <w:jc w:val="left"/>
+            </w:pPr>
+            <w:r>
+              <w:rPr>
+                <w:sz w:val="15"/>
+              </w:rPr>
+              <w:t xml:space="preserve">One eight-accelerator server (12 kW)</w:t>
+            </w:r>
+          </w:p>
+        </w:tc>
+        <w:tc>
+          <w:tcPr>
+            <w:tcW w:type="dxa" w:w="3577"/>
+          </w:tcPr>
+          <w:p>
+            <w:pPr>
+              <w:pStyle w:val="Compact"/>
+              <w:jc w:val="left"/>
+            </w:pPr>
+            <w:r>
+              <w:rPr>
+                <w:sz w:val="15"/>
+              </w:rPr>
+              <w:t xml:space="preserve">0.13 to 0.46</w:t>
+            </w:r>
+          </w:p>
+        </w:tc>
+        <w:tc>
+          <w:tcPr>
+            <w:tcW w:type="dxa" w:w="4292"/>
+          </w:tcPr>
+          <w:p>
+            <w:pPr>
+              <w:pStyle w:val="Compact"/>
+              <w:jc w:val="left"/>
+            </w:pPr>
+            <w:r>
+              <w:rPr>
+                <w:sz w:val="15"/>
+              </w:rPr>
+              <w:t xml:space="preserve">Direct: compute vouchers for users, matching grants for small providers</w:t>
+            </w:r>
+          </w:p>
+        </w:tc>
+        <w:tc>
+          <w:tcPr>
+            <w:tcW w:type="dxa" w:w="3577"/>
+          </w:tcPr>
+          <w:p>
+            <w:pPr>
+              <w:pStyle w:val="Compact"/>
+              <w:jc w:val="left"/>
+            </w:pPr>
+            <w:r>
+              <w:rPr>
+                <w:sz w:val="15"/>
+              </w:rPr>
+              <w:t xml:space="preserve">Tax relief presupposes taxable profit, which a new provider lacks</w:t>
+            </w:r>
+          </w:p>
+        </w:tc>
+      </w:tr>
+      <w:tr>
+        <w:tc>
+          <w:tcPr>
+            <w:tcW w:type="dxa" w:w="715"/>
+          </w:tcPr>
+          <w:p>
+            <w:pPr>
+              <w:pStyle w:val="Compact"/>
+              <w:jc w:val="left"/>
+            </w:pPr>
+            <w:r>
+              <w:rPr>
+                <w:sz w:val="15"/>
+              </w:rPr>
+              <w:t xml:space="preserve">1</w:t>
+            </w:r>
+          </w:p>
+        </w:tc>
+        <w:tc>
+          <w:tcPr>
+            <w:tcW w:type="dxa" w:w="2862"/>
+          </w:tcPr>
+          <w:p>
+            <w:pPr>
+              <w:pStyle w:val="Compact"/>
+              <w:jc w:val="left"/>
+            </w:pPr>
+            <w:r>
+              <w:rPr>
+                <w:sz w:val="15"/>
+              </w:rPr>
+              <w:t xml:space="preserve">100 kW (about eight servers)</w:t>
+            </w:r>
+          </w:p>
+        </w:tc>
+        <w:tc>
+          <w:tcPr>
+            <w:tcW w:type="dxa" w:w="3577"/>
+          </w:tcPr>
+          <w:p>
+            <w:pPr>
+              <w:pStyle w:val="Compact"/>
+              <w:jc w:val="left"/>
+            </w:pPr>
+            <w:r>
+              <w:rPr>
+                <w:sz w:val="15"/>
+              </w:rPr>
+              <w:t xml:space="preserve">1.1 to 3.8</w:t>
+            </w:r>
+          </w:p>
+        </w:tc>
+        <w:tc>
+          <w:tcPr>
+            <w:tcW w:type="dxa" w:w="4292"/>
+          </w:tcPr>
+          <w:p>
+            <w:pPr>
+              <w:pStyle w:val="Compact"/>
+              <w:jc w:val="left"/>
+            </w:pPr>
+            <w:r>
+              <w:rPr>
+                <w:sz w:val="15"/>
+              </w:rPr>
+              <w:t xml:space="preserve">Direct or refundable credit; simple eligibility test</w:t>
+            </w:r>
+          </w:p>
+        </w:tc>
+        <w:tc>
+          <w:tcPr>
+            <w:tcW w:type="dxa" w:w="3577"/>
+          </w:tcPr>
+          <w:p>
+            <w:pPr>
+              <w:pStyle w:val="Compact"/>
+              <w:jc w:val="left"/>
+            </w:pPr>
+            <w:r>
+              <w:rPr>
+                <w:sz w:val="15"/>
+              </w:rPr>
+              <w:t xml:space="preserve">Allows many small trials before any scale up (Hausmann and Rodrik, 2003)</w:t>
+            </w:r>
+          </w:p>
+        </w:tc>
+      </w:tr>
+      <w:tr>
+        <w:tc>
+          <w:tcPr>
+            <w:tcW w:type="dxa" w:w="715"/>
+          </w:tcPr>
+          <w:p>
+            <w:pPr>
+              <w:pStyle w:val="Compact"/>
+              <w:jc w:val="left"/>
+            </w:pPr>
+            <w:r>
+              <w:rPr>
+                <w:sz w:val="15"/>
+              </w:rPr>
+              <w:t xml:space="preserve">2</w:t>
+            </w:r>
+          </w:p>
+        </w:tc>
+        <w:tc>
+          <w:tcPr>
+            <w:tcW w:type="dxa" w:w="2862"/>
+          </w:tcPr>
+          <w:p>
+            <w:pPr>
+              <w:pStyle w:val="Compact"/>
+              <w:jc w:val="left"/>
+            </w:pPr>
+            <w:r>
+              <w:rPr>
+                <w:sz w:val="15"/>
+              </w:rPr>
+              <w:t xml:space="preserve">1 MW</w:t>
+            </w:r>
+          </w:p>
+        </w:tc>
+        <w:tc>
+          <w:tcPr>
+            <w:tcW w:type="dxa" w:w="3577"/>
+          </w:tcPr>
+          <w:p>
+            <w:pPr>
+              <w:pStyle w:val="Compact"/>
+              <w:jc w:val="left"/>
+            </w:pPr>
+            <w:r>
+              <w:rPr>
+                <w:sz w:val="15"/>
+              </w:rPr>
+              <w:t xml:space="preserve">10.7 to 38</w:t>
+            </w:r>
+          </w:p>
+        </w:tc>
+        <w:tc>
+          <w:tcPr>
+            <w:tcW w:type="dxa" w:w="4292"/>
+          </w:tcPr>
+          <w:p>
+            <w:pPr>
+              <w:pStyle w:val="Compact"/>
+              <w:jc w:val="left"/>
+            </w:pPr>
+            <w:r>
+              <w:rPr>
+                <w:sz w:val="15"/>
+              </w:rPr>
+              <w:t xml:space="preserve">Milestone-based tax incentive with compliance proportional to size</w:t>
+            </w:r>
+          </w:p>
+        </w:tc>
+        <w:tc>
+          <w:tcPr>
+            <w:tcW w:type="dxa" w:w="3577"/>
+          </w:tcPr>
+          <w:p>
+            <w:pPr>
+              <w:pStyle w:val="Compact"/>
+              <w:jc w:val="left"/>
+            </w:pPr>
+            <w:r>
+              <w:rPr>
+                <w:sz w:val="15"/>
+              </w:rPr>
+              <w:t xml:space="preserve">Avoids the fixed audit cost that weighs on the smallest firms (Section 4.3)</w:t>
+            </w:r>
+          </w:p>
+        </w:tc>
+      </w:tr>
+      <w:tr>
+        <w:tc>
+          <w:tcPr>
+            <w:tcW w:type="dxa" w:w="715"/>
+          </w:tcPr>
+          <w:p>
+            <w:pPr>
+              <w:pStyle w:val="Compact"/>
+              <w:jc w:val="left"/>
+            </w:pPr>
+            <w:r>
+              <w:rPr>
+                <w:sz w:val="15"/>
+              </w:rPr>
+              <w:t xml:space="preserve">3</w:t>
+            </w:r>
+          </w:p>
+        </w:tc>
+        <w:tc>
+          <w:tcPr>
+            <w:tcW w:type="dxa" w:w="2862"/>
+          </w:tcPr>
+          <w:p>
+            <w:pPr>
+              <w:pStyle w:val="Compact"/>
+              <w:jc w:val="left"/>
+            </w:pPr>
+            <w:r>
+              <w:rPr>
+                <w:sz w:val="15"/>
+              </w:rPr>
+              <w:t xml:space="preserve">10 MW</w:t>
+            </w:r>
+          </w:p>
+        </w:tc>
+        <w:tc>
+          <w:tcPr>
+            <w:tcW w:type="dxa" w:w="3577"/>
+          </w:tcPr>
+          <w:p>
+            <w:pPr>
+              <w:pStyle w:val="Compact"/>
+              <w:jc w:val="left"/>
+            </w:pPr>
+            <w:r>
+              <w:rPr>
+                <w:sz w:val="15"/>
+              </w:rPr>
+              <w:t xml:space="preserve">107 to 380</w:t>
+            </w:r>
+          </w:p>
+        </w:tc>
+        <w:tc>
+          <w:tcPr>
+            <w:tcW w:type="dxa" w:w="4292"/>
+          </w:tcPr>
+          <w:p>
+            <w:pPr>
+              <w:pStyle w:val="Compact"/>
+              <w:jc w:val="left"/>
+            </w:pPr>
+            <w:r>
+              <w:rPr>
+                <w:sz w:val="15"/>
+              </w:rPr>
+              <w:t xml:space="preserve">Existing facility-scale tax incentive</w:t>
+            </w:r>
+          </w:p>
+        </w:tc>
+        <w:tc>
+          <w:tcPr>
+            <w:tcW w:type="dxa" w:w="3577"/>
+          </w:tcPr>
+          <w:p>
+            <w:pPr>
+              <w:pStyle w:val="Compact"/>
+              <w:jc w:val="left"/>
+            </w:pPr>
+            <w:r>
+              <w:rPr>
+                <w:sz w:val="15"/>
+              </w:rPr>
+              <w:t xml:space="preserve">Comparable to Thailand’s threshold (about 13 MW on construction cost)</w:t>
+            </w:r>
+          </w:p>
+        </w:tc>
+      </w:tr>
+      <w:tr>
+        <w:tc>
+          <w:tcPr>
+            <w:tcW w:type="dxa" w:w="715"/>
+          </w:tcPr>
+          <w:p>
+            <w:pPr>
+              <w:pStyle w:val="Compact"/>
+              <w:jc w:val="left"/>
+            </w:pPr>
+            <w:r>
+              <w:rPr>
+                <w:sz w:val="15"/>
+              </w:rPr>
+              <w:t xml:space="preserve">4</w:t>
+            </w:r>
+          </w:p>
+        </w:tc>
+        <w:tc>
+          <w:tcPr>
+            <w:tcW w:type="dxa" w:w="2862"/>
+          </w:tcPr>
+          <w:p>
+            <w:pPr>
+              <w:pStyle w:val="Compact"/>
+              <w:jc w:val="left"/>
+            </w:pPr>
+            <w:r>
+              <w:rPr>
+                <w:sz w:val="15"/>
+              </w:rPr>
+              <w:t xml:space="preserve">40 MW</w:t>
+            </w:r>
+          </w:p>
+        </w:tc>
+        <w:tc>
+          <w:tcPr>
+            <w:tcW w:type="dxa" w:w="3577"/>
+          </w:tcPr>
+          <w:p>
+            <w:pPr>
+              <w:pStyle w:val="Compact"/>
+              <w:jc w:val="left"/>
+            </w:pPr>
+            <w:r>
+              <w:rPr>
+                <w:sz w:val="15"/>
+              </w:rPr>
+              <w:t xml:space="preserve">428 to 1,520</w:t>
+            </w:r>
+          </w:p>
+        </w:tc>
+        <w:tc>
+          <w:tcPr>
+            <w:tcW w:type="dxa" w:w="4292"/>
+          </w:tcPr>
+          <w:p>
+            <w:pPr>
+              <w:pStyle w:val="Compact"/>
+              <w:jc w:val="left"/>
+            </w:pPr>
+            <w:r>
+              <w:rPr>
+                <w:sz w:val="15"/>
+              </w:rPr>
+              <w:t xml:space="preserve">Existing facility-scale incentive and negotiated packages</w:t>
+            </w:r>
+          </w:p>
+        </w:tc>
+        <w:tc>
+          <w:tcPr>
+            <w:tcW w:type="dxa" w:w="3577"/>
+          </w:tcPr>
+          <w:p>
+            <w:pPr>
+              <w:pStyle w:val="Compact"/>
+              <w:jc w:val="left"/>
+            </w:pPr>
+            <w:r>
+              <w:rPr>
+                <w:sz w:val="15"/>
+              </w:rPr>
+              <w:t xml:space="preserve">Already served by current designs</w:t>
+            </w:r>
+          </w:p>
+        </w:tc>
+      </w:tr>
+    </w:tbl>
+    <w:p>
+      <w:pPr>
+        <w:pStyle w:val="BodyText"/>
+      </w:pPr>
+      <w:r>
+        <w:rPr>
+          <w:iCs/>
+          <w:i/>
+        </w:rPr>
+        <w:t xml:space="preserve">Note.</w:t>
+      </w:r>
+      <w:r>
+        <w:t xml:space="preserve"> </w:t>
+      </w:r>
+      <w:r>
+        <w:t xml:space="preserve">Construction cost of US$10.7m per MW (Turner and Townsend, 2025); fully equipped AI capacity of US$38m per MW (Epoch AI, 2026); 12 kW per server [citation to be added]. Figures are products of these benchmarks, not estimates of this paper.</w:t>
+      </w:r>
+    </w:p>
+    <w:bookmarkEnd w:id="29"/>
+    <w:bookmarkStart w:id="30" w:name="currency-conversion"/>
+    <w:p>
+      <w:pPr>
+        <w:pStyle w:val="Heading2"/>
+      </w:pPr>
+      <w:r>
+        <w:t xml:space="preserve">Currency conversion</w:t>
       </w:r>
     </w:p>
     <w:p>
@@ -5296,7 +8289,274 @@
         <w:pStyle w:val="FirstParagraph"/>
       </w:pPr>
       <w:r>
-        <w:t xml:space="preserve">The codebook is Appendix A of the manuscript. Four points matter for replication.</w:t>
+        <w:t xml:space="preserve">Thai baht, Malaysian ringgit, Philippine peso and Vietnamese dong figures are converted to US dollars at about 35.7 baht, 4.55 ringgit and 57.7 pesos to the dollar. These rates are those implied by the values first coded. They are approximations used for comparison only. The source and date of each rate are to be recorded before submission, and the local-currency figure is the one to cite.</w:t>
+      </w:r>
+    </w:p>
+    <w:bookmarkEnd w:id="30"/>
+    <w:bookmarkStart w:id="31" w:name="codebook"/>
+    <w:p>
+      <w:pPr>
+        <w:pStyle w:val="Heading2"/>
+      </w:pPr>
+      <w:r>
+        <w:t xml:space="preserve">Codebook</w:t>
+      </w:r>
+    </w:p>
+    <w:p>
+      <w:pPr>
+        <w:pStyle w:val="FirstParagraph"/>
+      </w:pPr>
+      <w:r>
+        <w:t xml:space="preserve">The coding rules applied are these.</w:t>
+      </w:r>
+    </w:p>
+    <w:p>
+      <w:pPr>
+        <w:pStyle w:val="BodyText"/>
+      </w:pPr>
+      <w:r>
+        <w:t xml:space="preserve">Stack layer.</w:t>
+      </w:r>
+      <w:r>
+        <w:t xml:space="preserve"> </w:t>
+      </w:r>
+      <w:r>
+        <w:rPr>
+          <w:iCs/>
+          <w:i/>
+        </w:rPr>
+        <w:t xml:space="preserve">Applications and models</w:t>
+      </w:r>
+      <w:r>
+        <w:t xml:space="preserve"> </w:t>
+      </w:r>
+      <w:r>
+        <w:t xml:space="preserve">if the instrument governs software, models or AI systems as end products.</w:t>
+      </w:r>
+      <w:r>
+        <w:t xml:space="preserve"> </w:t>
+      </w:r>
+      <w:r>
+        <w:rPr>
+          <w:iCs/>
+          <w:i/>
+        </w:rPr>
+        <w:t xml:space="preserve">Cloud and compute services</w:t>
+      </w:r>
+      <w:r>
+        <w:t xml:space="preserve"> </w:t>
+      </w:r>
+      <w:r>
+        <w:t xml:space="preserve">if it governs the provision of computing capacity as a service, whether from owned or leased facilities.</w:t>
+      </w:r>
+      <w:r>
+        <w:t xml:space="preserve"> </w:t>
+      </w:r>
+      <w:r>
+        <w:rPr>
+          <w:iCs/>
+          <w:i/>
+        </w:rPr>
+        <w:t xml:space="preserve">Physical data-centre capacity</w:t>
+      </w:r>
+      <w:r>
+        <w:t xml:space="preserve"> </w:t>
+      </w:r>
+      <w:r>
+        <w:t xml:space="preserve">if it governs construction or operation of physical facilities.</w:t>
+      </w:r>
+      <w:r>
+        <w:t xml:space="preserve"> </w:t>
+      </w:r>
+      <w:r>
+        <w:rPr>
+          <w:iCs/>
+          <w:i/>
+        </w:rPr>
+        <w:t xml:space="preserve">(ii)+(iii)</w:t>
+      </w:r>
+      <w:r>
+        <w:t xml:space="preserve"> </w:t>
+      </w:r>
+      <w:r>
+        <w:t xml:space="preserve">if one instrument covers both and does not distinguish them.</w:t>
+      </w:r>
+      <w:r>
+        <w:t xml:space="preserve"> </w:t>
+      </w:r>
+      <w:r>
+        <w:rPr>
+          <w:iCs/>
+          <w:i/>
+        </w:rPr>
+        <w:t xml:space="preserve">Hardware manufacture</w:t>
+      </w:r>
+      <w:r>
+        <w:t xml:space="preserve"> </w:t>
+      </w:r>
+      <w:r>
+        <w:t xml:space="preserve">if it governs semiconductor or chip design or fabrication.</w:t>
+      </w:r>
+      <w:r>
+        <w:t xml:space="preserve"> </w:t>
+      </w:r>
+      <w:r>
+        <w:rPr>
+          <w:iCs/>
+          <w:i/>
+        </w:rPr>
+        <w:t xml:space="preserve">Cross-cutting</w:t>
+      </w:r>
+      <w:r>
+        <w:t xml:space="preserve"> </w:t>
+      </w:r>
+      <w:r>
+        <w:t xml:space="preserve">if it applies across activity types without targeting a layer.</w:t>
+      </w:r>
+    </w:p>
+    <w:p>
+      <w:pPr>
+        <w:pStyle w:val="BodyText"/>
+      </w:pPr>
+      <w:r>
+        <w:t xml:space="preserve">Delivery mechanism.</w:t>
+      </w:r>
+      <w:r>
+        <w:t xml:space="preserve"> </w:t>
+      </w:r>
+      <w:r>
+        <w:rPr>
+          <w:iCs/>
+          <w:i/>
+        </w:rPr>
+        <w:t xml:space="preserve">Indirect</w:t>
+      </w:r>
+      <w:r>
+        <w:t xml:space="preserve"> </w:t>
+      </w:r>
+      <w:r>
+        <w:t xml:space="preserve">for tax-based instruments (exemptions, holidays, deductions) that presuppose taxable profit or investment expenditure.</w:t>
+      </w:r>
+      <w:r>
+        <w:t xml:space="preserve"> </w:t>
+      </w:r>
+      <w:r>
+        <w:rPr>
+          <w:iCs/>
+          <w:i/>
+        </w:rPr>
+        <w:t xml:space="preserve">Direct</w:t>
+      </w:r>
+      <w:r>
+        <w:t xml:space="preserve"> </w:t>
+      </w:r>
+      <w:r>
+        <w:t xml:space="preserve">for grants, equity investment or fee waivers that do not presuppose profitability. Combined schemes are coded as separate rows.</w:t>
+      </w:r>
+    </w:p>
+    <w:p>
+      <w:pPr>
+        <w:pStyle w:val="BodyText"/>
+      </w:pPr>
+      <w:r>
+        <w:t xml:space="preserve">Formal threshold. Report the eligibility rule as stated in the source, in local currency with a dated conversion, and record its basis (annual spend, paid-up capital, minimum capital, cumulative capex, firm-scale investment capital). Record</w:t>
+      </w:r>
+      <w:r>
+        <w:t xml:space="preserve"> </w:t>
+      </w:r>
+      <w:r>
+        <w:t xml:space="preserve">“</w:t>
+      </w:r>
+      <w:r>
+        <w:t xml:space="preserve">none stated</w:t>
+      </w:r>
+      <w:r>
+        <w:t xml:space="preserve">”</w:t>
+      </w:r>
+      <w:r>
+        <w:t xml:space="preserve"> </w:t>
+      </w:r>
+      <w:r>
+        <w:t xml:space="preserve">when the source states no threshold; do not record zero.</w:t>
+      </w:r>
+    </w:p>
+    <w:p>
+      <w:pPr>
+        <w:pStyle w:val="BodyText"/>
+      </w:pPr>
+      <w:r>
+        <w:t xml:space="preserve">New-firm accommodation.</w:t>
+      </w:r>
+      <w:r>
+        <w:t xml:space="preserve"> </w:t>
+      </w:r>
+      <w:r>
+        <w:rPr>
+          <w:iCs/>
+          <w:i/>
+        </w:rPr>
+        <w:t xml:space="preserve">Yes</w:t>
+      </w:r>
+      <w:r>
+        <w:t xml:space="preserve"> </w:t>
+      </w:r>
+      <w:r>
+        <w:t xml:space="preserve">only where the source contains an explicit provision easing eligibility for smaller or newer firms (for example a startup track or direct equity access).</w:t>
+      </w:r>
+      <w:r>
+        <w:t xml:space="preserve"> </w:t>
+      </w:r>
+      <w:r>
+        <w:rPr>
+          <w:iCs/>
+          <w:i/>
+        </w:rPr>
+        <w:t xml:space="preserve">No</w:t>
+      </w:r>
+      <w:r>
+        <w:t xml:space="preserve"> </w:t>
+      </w:r>
+      <w:r>
+        <w:t xml:space="preserve">where none exists, even if the general threshold is numerically low. A low threshold is recorded as a threshold. Proportional requirements (for example a percentage of staff) are coded</w:t>
+      </w:r>
+      <w:r>
+        <w:t xml:space="preserve"> </w:t>
+      </w:r>
+      <w:r>
+        <w:t xml:space="preserve">“</w:t>
+      </w:r>
+      <w:r>
+        <w:t xml:space="preserve">not scale-based</w:t>
+      </w:r>
+      <w:r>
+        <w:t xml:space="preserve">”</w:t>
+      </w:r>
+      <w:r>
+        <w:t xml:space="preserve">.</w:t>
+      </w:r>
+    </w:p>
+    <w:p>
+      <w:pPr>
+        <w:pStyle w:val="BodyText"/>
+      </w:pPr>
+      <w:r>
+        <w:t xml:space="preserve">Compliance burden. Any recurring (annual or ongoing) obligation attached to continued eligibility, distinct from one-off application requirements. Fixed-cost obligations are noted explicitly.</w:t>
+      </w:r>
+    </w:p>
+    <w:p>
+      <w:pPr>
+        <w:pStyle w:val="BodyText"/>
+      </w:pPr>
+      <w:r>
+        <w:t xml:space="preserve">Ambiguous cases. When a coding decision stays uncertain after reading the source, flag the row, record both candidate codes, and log how it was resolved.</w:t>
+      </w:r>
+    </w:p>
+    <w:p>
+      <w:pPr>
+        <w:pStyle w:val="BodyText"/>
+      </w:pPr>
+      <w:r>
+        <w:t xml:space="preserve">Four points matter for replication.</w:t>
       </w:r>
     </w:p>
     <w:p>
@@ -5387,8 +8647,8 @@
         <w:t xml:space="preserve">Rows 3, 5, 6, 18, 19, 20, 25 and 26 apply beyond AI. They are kept so that the rules that govern an AI firm can be separated from rules written for AI.</w:t>
       </w:r>
     </w:p>
-    <w:bookmarkEnd w:id="28"/>
-    <w:bookmarkStart w:id="29" w:name="reliability-and-outstanding-checks"/>
+    <w:bookmarkEnd w:id="31"/>
+    <w:bookmarkStart w:id="32" w:name="reliability-and-outstanding-checks"/>
     <w:p>
       <w:pPr>
         <w:pStyle w:val="Heading2"/>
@@ -5416,7 +8676,7 @@
         <w:t xml:space="preserve"> </w:t>
       </w:r>
       <w:r>
-        <w:t xml:space="preserve">Not yet done. A second coder will code all 29 instruments independently from the blind sheet, using Appendix A, and the manuscript will report percentage agreement, Cohen’s kappa per dimension and Krippendorff’s alpha. Each resolved disagreement is to be logged.</w:t>
+        <w:t xml:space="preserve">Not yet done. A second coder will code all 29 instruments independently from the blind sheet, using the codebook, and the manuscript will report percentage agreement, Cohen’s kappa per dimension and Krippendorff’s alpha. Each resolved disagreement is to be logged.</w:t>
       </w:r>
     </w:p>
     <w:p>
@@ -5503,7 +8763,7 @@
         <w:t xml:space="preserve">General SME, startup and research schemes, and pre-AI sector schemes, are outside Table S1. Absence claims in the manuscript are limited to AI-related and digital-sector instruments.</w:t>
       </w:r>
     </w:p>
-    <w:bookmarkEnd w:id="29"/>
+    <w:bookmarkEnd w:id="32"/>
     <w:sectPr>
       <w:pgSz w:orient="landscape" w:w="16838" w:h="11906"/>
       <w:pgMar w:left="907" w:right="907" w:top="907" w:bottom="907"/>

</xml_diff>

<commit_message>
Test viability assumption with a provider-economics benchmark; revise abstract, findings, discussion and tables; add model script and supporting table; fill AI declaration
</commit_message>
<xml_diff>
--- a/revision/05_supporting_information.docx
+++ b/revision/05_supporting_information.docx
@@ -146,7 +146,7 @@
         <w:pStyle w:val="FirstParagraph"/>
       </w:pPr>
       <w:r>
-        <w:t xml:space="preserve">This document gives the instrument-level data behind Tables 1 to 5 of the manuscript, so that the coding can be replicated. Each row is one instrument: a specific tax exemption, grant, eligibility rule or compliance requirement. The unit of analysis is the instrument, not the strategy document. A single scheme, such as Thailand’s digital division, bundles several instruments, and each is coded in its own row. Table S1 holds 29 instruments, in four blocks by country; Tables S2 to S4 give the sources, the full evidence matrix and an illustrative ladder. Rows 1 to 20 are the first-coded instruments, and rows 21 to 29 were added when the primary texts were read in full for the compute layers.</w:t>
+        <w:t xml:space="preserve">This document gives the instrument-level data behind Tables 1 to 5 of the manuscript, so that the coding can be replicated. Each row is one instrument: a specific tax exemption, grant, eligibility rule or compliance requirement. The unit of analysis is the instrument, not the strategy document. A single scheme, such as Thailand’s digital division, bundles several instruments, and each is coded in its own row. Table S1 holds 29 instruments, in four blocks by country; Tables S2 to S5 give the sources, the full evidence matrix, an illustrative ladder and the viability benchmark. Rows 1 to 20 are the first-coded instruments, and rows 21 to 29 were added when the primary texts were read in full for the compute layers.</w:t>
       </w:r>
     </w:p>
     <w:bookmarkEnd w:id="20"/>
@@ -8275,13 +8275,13 @@
       </w:r>
     </w:p>
     <w:bookmarkEnd w:id="29"/>
-    <w:bookmarkStart w:id="30" w:name="currency-conversion"/>
+    <w:bookmarkStart w:id="30" w:name="Xa2c17921f4af7568b56f239dacda6dc895cf9dc"/>
     <w:p>
       <w:pPr>
         <w:pStyle w:val="Heading2"/>
       </w:pPr>
       <w:r>
-        <w:t xml:space="preserve">Currency conversion</w:t>
+        <w:t xml:space="preserve">Table S5. Viability benchmark for a small provider of AI compute (assumption A1)</w:t>
       </w:r>
     </w:p>
     <w:p>
@@ -8289,11 +8289,614 @@
         <w:pStyle w:val="FirstParagraph"/>
       </w:pPr>
       <w:r>
-        <w:t xml:space="preserve">Thai baht, Malaysian ringgit, Philippine peso and Vietnamese dong figures are converted to US dollars at about 35.7 baht, 4.55 ringgit and 57.7 pesos to the dollar. These rates are those implied by the values first coded. They are approximations used for comparison only. The source and date of each rate are to be recorded before submission, and the local-currency figure is the one to cite.</w:t>
+        <w:t xml:space="preserve">The benchmark asks what scale of provision is commercially viable, so that the distance to an instrument’s threshold can be measured from it. It is a transparent model with stated inputs, not a forecast. The script is in the replication files (</w:t>
+      </w:r>
+      <w:r>
+        <w:rPr>
+          <w:rStyle w:val="VerbatimChar"/>
+        </w:rPr>
+        <w:t xml:space="preserve">08a_viability_model.py</w:t>
+      </w:r>
+      <w:r>
+        <w:t xml:space="preserve">). All market inputs come from vendor blogs, reseller listings and trade guides, which are indicative, and prices moved sharply in 2026.</w:t>
+      </w:r>
+    </w:p>
+    <w:p>
+      <w:pPr>
+        <w:pStyle w:val="BodyText"/>
+      </w:pPr>
+      <w:r>
+        <w:rPr>
+          <w:bCs/>
+          <w:b/>
+        </w:rPr>
+        <w:t xml:space="preserve">Inputs.</w:t>
+      </w:r>
+      <w:r>
+        <w:t xml:space="preserve"> </w:t>
+      </w:r>
+      <w:r>
+        <w:t xml:space="preserve">One eight-GPU H100 server of 12 kW is the unit. Server capital is US$250,000 to US$320,000 (reseller listings, September 2026). Realised price runs from US$1.70 to US$3.85 per GPU-hour: the low end is the 1-year contract index of October 2025 and the high end the on-demand list price of neoclouds, with US$2.35 (the March 2026 contract index) and US$3.00 between (Spendark, 2026). Colocation is US$200 to US$475 per kW a month (Singapore guides give US$310 to US$475; North American wholesale is about US$196), with metered power at US$0.11 per kWh, the Thai average tariff of THB 3.95 per kWh for September to December 2026 (Thai Energy Regulatory Commission, through press reports). Capital is charged as an annuity at 10 per cent over three to five years with no residual value, and 10 per cent of revenue goes to payment, support and bandwidth costs. A scale provider is given wholesale colocation at US$150 per kW, a hardware price of US$250,000 and a cost of capital of 8 per cent. The overhead of running a provider (certification, audit, staff, monitoring) is not observed, so it is varied from US$50,000 to US$300,000 a year.</w:t>
+      </w:r>
+    </w:p>
+    <w:p>
+      <w:pPr>
+        <w:pStyle w:val="BodyText"/>
+      </w:pPr>
+      <w:r>
+        <w:rPr>
+          <w:bCs/>
+          <w:b/>
+        </w:rPr>
+        <w:t xml:space="preserve">Break-even utilisation</w:t>
+      </w:r>
+      <w:r>
+        <w:t xml:space="preserve"> </w:t>
+      </w:r>
+      <w:r>
+        <w:t xml:space="preserve">(share of hours sold; above 1.00 means no break-even):</w:t>
+      </w:r>
+    </w:p>
+    <w:tbl>
+      <w:tblPr>
+        <w:tblStyle w:val="Table"/>
+        <w:tblLayout w:type="fixed"/>
+        <w:tblLook w:firstRow="1" w:lastRow="0" w:firstColumn="0" w:lastColumn="0" w:noHBand="0" w:noVBand="0" w:val="0020"/>
+        <w:jc w:val="start"/>
+        <w:tblBorders>
+          <w:top w:val="single" w:sz="4" w:color="999999"/>
+          <w:left w:val="single" w:sz="4" w:color="999999"/>
+          <w:bottom w:val="single" w:sz="4" w:color="999999"/>
+          <w:right w:val="single" w:sz="4" w:color="999999"/>
+          <w:insideH w:val="single" w:sz="4" w:color="999999"/>
+          <w:insideV w:val="single" w:sz="4" w:color="999999"/>
+        </w:tblBorders>
+        <w:tblLayout w:type="fixed"/>
+        <w:tblW w:w="15023" w:type="dxa"/>
+      </w:tblPr>
+      <w:tblGrid>
+        <w:gridCol w:w="715"/>
+        <w:gridCol w:w="2861"/>
+        <w:gridCol w:w="3577"/>
+        <w:gridCol w:w="4292"/>
+        <w:gridCol w:w="3577"/>
+      </w:tblGrid>
+      <w:tr>
+        <w:trPr>
+          <w:tblHeader w:val="true"/>
+        </w:trPr>
+        <w:tc>
+          <w:tcPr>
+            <w:tcW w:type="dxa" w:w="715"/>
+          </w:tcPr>
+          <w:p>
+            <w:pPr>
+              <w:pStyle w:val="Compact"/>
+              <w:jc w:val="left"/>
+            </w:pPr>
+            <w:r>
+              <w:rPr>
+                <w:b/>
+                <w:sz w:val="15"/>
+              </w:rPr>
+              <w:t xml:space="preserve">Case</w:t>
+            </w:r>
+          </w:p>
+        </w:tc>
+        <w:tc>
+          <w:tcPr>
+            <w:tcW w:type="dxa" w:w="2862"/>
+          </w:tcPr>
+          <w:p>
+            <w:pPr>
+              <w:pStyle w:val="Compact"/>
+              <w:jc w:val="left"/>
+            </w:pPr>
+            <w:r>
+              <w:rPr>
+                <w:b/>
+                <w:sz w:val="15"/>
+              </w:rPr>
+              <w:t xml:space="preserve">US$1.70</w:t>
+            </w:r>
+          </w:p>
+        </w:tc>
+        <w:tc>
+          <w:tcPr>
+            <w:tcW w:type="dxa" w:w="3577"/>
+          </w:tcPr>
+          <w:p>
+            <w:pPr>
+              <w:pStyle w:val="Compact"/>
+              <w:jc w:val="left"/>
+            </w:pPr>
+            <w:r>
+              <w:rPr>
+                <w:b/>
+                <w:sz w:val="15"/>
+              </w:rPr>
+              <w:t xml:space="preserve">US$2.35</w:t>
+            </w:r>
+          </w:p>
+        </w:tc>
+        <w:tc>
+          <w:tcPr>
+            <w:tcW w:type="dxa" w:w="4292"/>
+          </w:tcPr>
+          <w:p>
+            <w:pPr>
+              <w:pStyle w:val="Compact"/>
+              <w:jc w:val="left"/>
+            </w:pPr>
+            <w:r>
+              <w:rPr>
+                <w:b/>
+                <w:sz w:val="15"/>
+              </w:rPr>
+              <w:t xml:space="preserve">US$3.00</w:t>
+            </w:r>
+          </w:p>
+        </w:tc>
+        <w:tc>
+          <w:tcPr>
+            <w:tcW w:type="dxa" w:w="3577"/>
+          </w:tcPr>
+          <w:p>
+            <w:pPr>
+              <w:pStyle w:val="Compact"/>
+              <w:jc w:val="left"/>
+            </w:pPr>
+            <w:r>
+              <w:rPr>
+                <w:b/>
+                <w:sz w:val="15"/>
+              </w:rPr>
+              <w:t xml:space="preserve">US$3.85</w:t>
+            </w:r>
+          </w:p>
+        </w:tc>
+      </w:tr>
+      <w:tr>
+        <w:tc>
+          <w:tcPr>
+            <w:tcW w:type="dxa" w:w="715"/>
+          </w:tcPr>
+          <w:p>
+            <w:pPr>
+              <w:pStyle w:val="Compact"/>
+              <w:jc w:val="left"/>
+            </w:pPr>
+            <w:r>
+              <w:rPr>
+                <w:sz w:val="15"/>
+              </w:rPr>
+              <w:t xml:space="preserve">Small provider, favourable inputs</w:t>
+            </w:r>
+          </w:p>
+        </w:tc>
+        <w:tc>
+          <w:tcPr>
+            <w:tcW w:type="dxa" w:w="2862"/>
+          </w:tcPr>
+          <w:p>
+            <w:pPr>
+              <w:pStyle w:val="Compact"/>
+              <w:jc w:val="left"/>
+            </w:pPr>
+            <w:r>
+              <w:rPr>
+                <w:sz w:val="15"/>
+              </w:rPr>
+              <w:t xml:space="preserve">0.96</w:t>
+            </w:r>
+          </w:p>
+        </w:tc>
+        <w:tc>
+          <w:tcPr>
+            <w:tcW w:type="dxa" w:w="3577"/>
+          </w:tcPr>
+          <w:p>
+            <w:pPr>
+              <w:pStyle w:val="Compact"/>
+              <w:jc w:val="left"/>
+            </w:pPr>
+            <w:r>
+              <w:rPr>
+                <w:sz w:val="15"/>
+              </w:rPr>
+              <w:t xml:space="preserve">0.69</w:t>
+            </w:r>
+          </w:p>
+        </w:tc>
+        <w:tc>
+          <w:tcPr>
+            <w:tcW w:type="dxa" w:w="4292"/>
+          </w:tcPr>
+          <w:p>
+            <w:pPr>
+              <w:pStyle w:val="Compact"/>
+              <w:jc w:val="left"/>
+            </w:pPr>
+            <w:r>
+              <w:rPr>
+                <w:sz w:val="15"/>
+              </w:rPr>
+              <w:t xml:space="preserve">0.54</w:t>
+            </w:r>
+          </w:p>
+        </w:tc>
+        <w:tc>
+          <w:tcPr>
+            <w:tcW w:type="dxa" w:w="3577"/>
+          </w:tcPr>
+          <w:p>
+            <w:pPr>
+              <w:pStyle w:val="Compact"/>
+              <w:jc w:val="left"/>
+            </w:pPr>
+            <w:r>
+              <w:rPr>
+                <w:sz w:val="15"/>
+              </w:rPr>
+              <w:t xml:space="preserve">0.42</w:t>
+            </w:r>
+          </w:p>
+        </w:tc>
+      </w:tr>
+      <w:tr>
+        <w:tc>
+          <w:tcPr>
+            <w:tcW w:type="dxa" w:w="715"/>
+          </w:tcPr>
+          <w:p>
+            <w:pPr>
+              <w:pStyle w:val="Compact"/>
+              <w:jc w:val="left"/>
+            </w:pPr>
+            <w:r>
+              <w:rPr>
+                <w:sz w:val="15"/>
+              </w:rPr>
+              <w:t xml:space="preserve">Small provider, central inputs</w:t>
+            </w:r>
+          </w:p>
+        </w:tc>
+        <w:tc>
+          <w:tcPr>
+            <w:tcW w:type="dxa" w:w="2862"/>
+          </w:tcPr>
+          <w:p>
+            <w:pPr>
+              <w:pStyle w:val="Compact"/>
+              <w:jc w:val="left"/>
+            </w:pPr>
+            <w:r>
+              <w:rPr>
+                <w:sz w:val="15"/>
+              </w:rPr>
+              <w:t xml:space="preserve">1.40</w:t>
+            </w:r>
+          </w:p>
+        </w:tc>
+        <w:tc>
+          <w:tcPr>
+            <w:tcW w:type="dxa" w:w="3577"/>
+          </w:tcPr>
+          <w:p>
+            <w:pPr>
+              <w:pStyle w:val="Compact"/>
+              <w:jc w:val="left"/>
+            </w:pPr>
+            <w:r>
+              <w:rPr>
+                <w:sz w:val="15"/>
+              </w:rPr>
+              <w:t xml:space="preserve">1.01</w:t>
+            </w:r>
+          </w:p>
+        </w:tc>
+        <w:tc>
+          <w:tcPr>
+            <w:tcW w:type="dxa" w:w="4292"/>
+          </w:tcPr>
+          <w:p>
+            <w:pPr>
+              <w:pStyle w:val="Compact"/>
+              <w:jc w:val="left"/>
+            </w:pPr>
+            <w:r>
+              <w:rPr>
+                <w:sz w:val="15"/>
+              </w:rPr>
+              <w:t xml:space="preserve">0.79</w:t>
+            </w:r>
+          </w:p>
+        </w:tc>
+        <w:tc>
+          <w:tcPr>
+            <w:tcW w:type="dxa" w:w="3577"/>
+          </w:tcPr>
+          <w:p>
+            <w:pPr>
+              <w:pStyle w:val="Compact"/>
+              <w:jc w:val="left"/>
+            </w:pPr>
+            <w:r>
+              <w:rPr>
+                <w:sz w:val="15"/>
+              </w:rPr>
+              <w:t xml:space="preserve">0.62</w:t>
+            </w:r>
+          </w:p>
+        </w:tc>
+      </w:tr>
+      <w:tr>
+        <w:tc>
+          <w:tcPr>
+            <w:tcW w:type="dxa" w:w="715"/>
+          </w:tcPr>
+          <w:p>
+            <w:pPr>
+              <w:pStyle w:val="Compact"/>
+              <w:jc w:val="left"/>
+            </w:pPr>
+            <w:r>
+              <w:rPr>
+                <w:sz w:val="15"/>
+              </w:rPr>
+              <w:t xml:space="preserve">Small provider, adverse inputs</w:t>
+            </w:r>
+          </w:p>
+        </w:tc>
+        <w:tc>
+          <w:tcPr>
+            <w:tcW w:type="dxa" w:w="2862"/>
+          </w:tcPr>
+          <w:p>
+            <w:pPr>
+              <w:pStyle w:val="Compact"/>
+              <w:jc w:val="left"/>
+            </w:pPr>
+            <w:r>
+              <w:rPr>
+                <w:sz w:val="15"/>
+              </w:rPr>
+              <w:t xml:space="preserve">1.91</w:t>
+            </w:r>
+          </w:p>
+        </w:tc>
+        <w:tc>
+          <w:tcPr>
+            <w:tcW w:type="dxa" w:w="3577"/>
+          </w:tcPr>
+          <w:p>
+            <w:pPr>
+              <w:pStyle w:val="Compact"/>
+              <w:jc w:val="left"/>
+            </w:pPr>
+            <w:r>
+              <w:rPr>
+                <w:sz w:val="15"/>
+              </w:rPr>
+              <w:t xml:space="preserve">1.38</w:t>
+            </w:r>
+          </w:p>
+        </w:tc>
+        <w:tc>
+          <w:tcPr>
+            <w:tcW w:type="dxa" w:w="4292"/>
+          </w:tcPr>
+          <w:p>
+            <w:pPr>
+              <w:pStyle w:val="Compact"/>
+              <w:jc w:val="left"/>
+            </w:pPr>
+            <w:r>
+              <w:rPr>
+                <w:sz w:val="15"/>
+              </w:rPr>
+              <w:t xml:space="preserve">1.08</w:t>
+            </w:r>
+          </w:p>
+        </w:tc>
+        <w:tc>
+          <w:tcPr>
+            <w:tcW w:type="dxa" w:w="3577"/>
+          </w:tcPr>
+          <w:p>
+            <w:pPr>
+              <w:pStyle w:val="Compact"/>
+              <w:jc w:val="left"/>
+            </w:pPr>
+            <w:r>
+              <w:rPr>
+                <w:sz w:val="15"/>
+              </w:rPr>
+              <w:t xml:space="preserve">0.84</w:t>
+            </w:r>
+          </w:p>
+        </w:tc>
+      </w:tr>
+      <w:tr>
+        <w:tc>
+          <w:tcPr>
+            <w:tcW w:type="dxa" w:w="715"/>
+          </w:tcPr>
+          <w:p>
+            <w:pPr>
+              <w:pStyle w:val="Compact"/>
+              <w:jc w:val="left"/>
+            </w:pPr>
+            <w:r>
+              <w:rPr>
+                <w:sz w:val="15"/>
+              </w:rPr>
+              <w:t xml:space="preserve">Scale provider</w:t>
+            </w:r>
+          </w:p>
+        </w:tc>
+        <w:tc>
+          <w:tcPr>
+            <w:tcW w:type="dxa" w:w="2862"/>
+          </w:tcPr>
+          <w:p>
+            <w:pPr>
+              <w:pStyle w:val="Compact"/>
+              <w:jc w:val="left"/>
+            </w:pPr>
+            <w:r>
+              <w:rPr>
+                <w:sz w:val="15"/>
+              </w:rPr>
+              <w:t xml:space="preserve">0.98</w:t>
+            </w:r>
+          </w:p>
+        </w:tc>
+        <w:tc>
+          <w:tcPr>
+            <w:tcW w:type="dxa" w:w="3577"/>
+          </w:tcPr>
+          <w:p>
+            <w:pPr>
+              <w:pStyle w:val="Compact"/>
+              <w:jc w:val="left"/>
+            </w:pPr>
+            <w:r>
+              <w:rPr>
+                <w:sz w:val="15"/>
+              </w:rPr>
+              <w:t xml:space="preserve">0.71</w:t>
+            </w:r>
+          </w:p>
+        </w:tc>
+        <w:tc>
+          <w:tcPr>
+            <w:tcW w:type="dxa" w:w="4292"/>
+          </w:tcPr>
+          <w:p>
+            <w:pPr>
+              <w:pStyle w:val="Compact"/>
+              <w:jc w:val="left"/>
+            </w:pPr>
+            <w:r>
+              <w:rPr>
+                <w:sz w:val="15"/>
+              </w:rPr>
+              <w:t xml:space="preserve">0.56</w:t>
+            </w:r>
+          </w:p>
+        </w:tc>
+        <w:tc>
+          <w:tcPr>
+            <w:tcW w:type="dxa" w:w="3577"/>
+          </w:tcPr>
+          <w:p>
+            <w:pPr>
+              <w:pStyle w:val="Compact"/>
+              <w:jc w:val="left"/>
+            </w:pPr>
+            <w:r>
+              <w:rPr>
+                <w:sz w:val="15"/>
+              </w:rPr>
+              <w:t xml:space="preserve">0.43</w:t>
+            </w:r>
+          </w:p>
+        </w:tc>
+      </w:tr>
+    </w:tbl>
+    <w:p>
+      <w:pPr>
+        <w:pStyle w:val="BodyText"/>
+      </w:pPr>
+      <w:r>
+        <w:rPr>
+          <w:bCs/>
+          <w:b/>
+        </w:rPr>
+        <w:t xml:space="preserve">Minimum fleet</w:t>
+      </w:r>
+      <w:r>
+        <w:t xml:space="preserve"> </w:t>
+      </w:r>
+      <w:r>
+        <w:t xml:space="preserve">to cover the overhead, central inputs, 80 per cent utilisation: at US$3.00 per GPU-hour, 45 servers (US$13m) for an overhead of US$50,000, 134 servers (US$40m) for US$150,000 and 268 servers (US$80m) for US$300,000. At US$3.85, one to seven servers suffice. At US$2.35 or below, no fleet size covers the overhead.</w:t>
+      </w:r>
+    </w:p>
+    <w:p>
+      <w:pPr>
+        <w:pStyle w:val="BodyText"/>
+      </w:pPr>
+      <w:r>
+        <w:rPr>
+          <w:bCs/>
+          <w:b/>
+        </w:rPr>
+        <w:t xml:space="preserve">Reading.</w:t>
+      </w:r>
+      <w:r>
+        <w:t xml:space="preserve"> </w:t>
+      </w:r>
+      <w:r>
+        <w:t xml:space="preserve">First, a single server is not a viable provider. Second, viability turns on price. A small provider breaks even only if it can sell near or above US$3.00 per GPU-hour at about 80 per cent utilisation, and at contract-index prices it cannot break even at any size. Third, scale lowers the break-even utilisation by about 20 percentage points at the same price, through cheaper colocation, capital and hardware. Fourth, the viable scale lies between a few servers (US$0.3m to US$2m of capital at US$3.85) and tens to hundreds of servers (US$13m to US$80m at US$3.00), and does not exist at US$2.35 or below. Distances from US$13m to US$80m are given in Table 3 of the manuscript.</w:t>
+      </w:r>
+    </w:p>
+    <w:p>
+      <w:pPr>
+        <w:pStyle w:val="BodyText"/>
+      </w:pPr>
+      <w:r>
+        <w:rPr>
+          <w:bCs/>
+          <w:b/>
+        </w:rPr>
+        <w:t xml:space="preserve">Observed entrants.</w:t>
+      </w:r>
+      <w:r>
+        <w:t xml:space="preserve"> </w:t>
+      </w:r>
+      <w:r>
+        <w:t xml:space="preserve">Thailand’s BOI approved a THB 3.25 billion (about US$91m) cloud-services project for Siam AI Corporation, a Thai company and NVIDIA cloud partner, on 29 January 2025, classed as cloud services focusing on AI applications and not as data hosting (Board of Investment of Thailand, 2025). Press reports say its equipment is hosted in third-party colocation data centres (STT Bangkok 1). The only data-hosting project approved in 2025 was TikTok’s, at THB 126.8 billion. Vietnamese and regional GPU clouds also run on leased colocation space. We could not verify their scale or incentives.</w:t>
+      </w:r>
+    </w:p>
+    <w:p>
+      <w:pPr>
+        <w:pStyle w:val="BodyText"/>
+      </w:pPr>
+      <w:r>
+        <w:rPr>
+          <w:iCs/>
+          <w:i/>
+        </w:rPr>
+        <w:t xml:space="preserve">Sources.</w:t>
+      </w:r>
+      <w:r>
+        <w:t xml:space="preserve"> </w:t>
+      </w:r>
+      <w:r>
+        <w:t xml:space="preserve">Spendark (2026), cloud GPU price war, citing SemiAnalysis’s GPU index (https://spendark.com/blog/cloud-gpu-price-war-2026/). Reseller listings for 8-GPU H100 servers (https://gpuperhour.com/blog/nvidia-h100-price). Colocation guides (https://brightlio.com/colocation-pricing/; https://www.coradvisors.net/2026/08/colocation-pricing-per-rack-2026.html). Break-even and margin estimates (https://www.gpunex.com/blog/gpu-cluster-economics-2026). BOI news of 29 January 2025 (https://osos.boi.go.th/EN/news/2163).</w:t>
       </w:r>
     </w:p>
     <w:bookmarkEnd w:id="30"/>
-    <w:bookmarkStart w:id="31" w:name="codebook"/>
+    <w:bookmarkStart w:id="31" w:name="currency-conversion"/>
+    <w:p>
+      <w:pPr>
+        <w:pStyle w:val="Heading2"/>
+      </w:pPr>
+      <w:r>
+        <w:t xml:space="preserve">Currency conversion</w:t>
+      </w:r>
+    </w:p>
+    <w:p>
+      <w:pPr>
+        <w:pStyle w:val="FirstParagraph"/>
+      </w:pPr>
+      <w:r>
+        <w:t xml:space="preserve">Thai baht, Malaysian ringgit, Philippine peso and Vietnamese dong figures are converted to US dollars at about 35.7 baht, 4.55 ringgit and 57.7 pesos to the dollar. These rates are those implied by the values first coded. They are approximations used for comparison only. The source and date of each rate are to be recorded before submission, and the local-currency figure is the one to cite.</w:t>
+      </w:r>
+    </w:p>
+    <w:bookmarkEnd w:id="31"/>
+    <w:bookmarkStart w:id="32" w:name="codebook"/>
     <w:p>
       <w:pPr>
         <w:pStyle w:val="Heading2"/>
@@ -8647,8 +9250,8 @@
         <w:t xml:space="preserve">Rows 3, 5, 6, 18, 19, 20, 25 and 26 apply beyond AI. They are kept so that the rules that govern an AI firm can be separated from rules written for AI.</w:t>
       </w:r>
     </w:p>
-    <w:bookmarkEnd w:id="31"/>
-    <w:bookmarkStart w:id="32" w:name="reliability-and-outstanding-checks"/>
+    <w:bookmarkEnd w:id="32"/>
+    <w:bookmarkStart w:id="33" w:name="reliability-and-outstanding-checks"/>
     <w:p>
       <w:pPr>
         <w:pStyle w:val="Heading2"/>
@@ -8763,7 +9366,7 @@
         <w:t xml:space="preserve">General SME, startup and research schemes, and pre-AI sector schemes, are outside Table S1. Absence claims in the manuscript are limited to AI-related and digital-sector instruments.</w:t>
       </w:r>
     </w:p>
-    <w:bookmarkEnd w:id="32"/>
+    <w:bookmarkEnd w:id="33"/>
     <w:sectPr>
       <w:pgSz w:orient="landscape" w:w="16838" w:h="11906"/>
       <w:pgMar w:left="907" w:right="907" w:top="907" w:bottom="907"/>

</xml_diff>

<commit_message>
State case-selection reason for Indonesia, cite server power source, add blind second-coder check and disagreement log, recode adjudicated rows
</commit_message>
<xml_diff>
--- a/revision/05_supporting_information.docx
+++ b/revision/05_supporting_information.docx
@@ -146,7 +146,7 @@
         <w:pStyle w:val="FirstParagraph"/>
       </w:pPr>
       <w:r>
-        <w:t xml:space="preserve">This document gives the instrument-level data behind Tables 1 to 5 of the manuscript, so that the coding can be replicated. Each row is one instrument: a specific tax exemption, grant, eligibility rule or compliance requirement. The unit of analysis is the instrument, not the strategy document. A single scheme, such as Thailand’s digital division, bundles several instruments, and each is coded in its own row. Table S1 holds 29 instruments, in four blocks by country; Tables S2 to S5 give the sources, the full evidence matrix, an illustrative ladder and the viability benchmark. Rows 1 to 20 are the first-coded instruments, and rows 21 to 29 were added when the primary texts were read in full for the compute layers.</w:t>
+        <w:t xml:space="preserve">This document gives the instrument-level data behind Tables 1 to 5 of the manuscript, so that the coding can be replicated. Each row is one instrument: a specific tax exemption, grant, eligibility rule or compliance requirement. The unit of analysis is the instrument, not the strategy document. A single scheme, such as Thailand’s digital division, bundles several instruments, and each is coded in its own row. Table S1 holds 29 instruments, in four blocks by country; Tables S2 to S6 give the sources, the full evidence matrix, an illustrative ladder, the viability benchmark and the second-coder check. Rows 1 to 20 are the first-coded instruments, and rows 21 to 29 were added when the primary texts were read in full for the compute layers.</w:t>
       </w:r>
     </w:p>
     <w:bookmarkEnd w:id="20"/>
@@ -806,7 +806,7 @@
               <w:rPr>
                 <w:sz w:val="15"/>
               </w:rPr>
-              <w:t xml:space="preserve">(i)</w:t>
+              <w:t xml:space="preserve">Cross-cutting (R&amp;D of any technology)</w:t>
             </w:r>
           </w:p>
         </w:tc>
@@ -1021,7 +1021,7 @@
               <w:rPr>
                 <w:sz w:val="15"/>
               </w:rPr>
-              <w:t xml:space="preserve">No: presupposes sales in the first three years</w:t>
+              <w:t xml:space="preserve">Not scale-based (proportional to sales), but presupposes sales in the first three years</w:t>
             </w:r>
           </w:p>
         </w:tc>
@@ -1108,7 +1108,7 @@
               <w:rPr>
                 <w:sz w:val="15"/>
               </w:rPr>
-              <w:t xml:space="preserve">(ii)+(iii)</w:t>
+              <w:t xml:space="preserve">(ii)</w:t>
             </w:r>
           </w:p>
         </w:tc>
@@ -1674,7 +1674,7 @@
               <w:rPr>
                 <w:sz w:val="15"/>
               </w:rPr>
-              <w:t xml:space="preserve">(ii)+(iii)</w:t>
+              <w:t xml:space="preserve">(iii)</w:t>
             </w:r>
           </w:p>
         </w:tc>
@@ -1708,7 +1708,7 @@
               <w:rPr>
                 <w:sz w:val="15"/>
               </w:rPr>
-              <w:t xml:space="preserve">Electrical system for at least 2 MW of IT load in both tiers (basis power capacity; no capital minimum stated); four high-speed links; concurrent maintainability; plan of benefits to Thailand; Thai personnel in at least half of executive and expert positions within three years; the higher tier also requires a power usage effectiveness of 1.3 or lower</w:t>
+              <w:t xml:space="preserve">Electrical system for at least 2 MW of IT load in both tiers (basis power capacity; no capital minimum stated); at least four telecom systems with combined capacity of at least 60 Gbps; concurrent maintainability; plan of benefits to Thailand; Thai personnel in at least half of executive and expert positions within three years; the higher tier also requires a power usage effectiveness of 1.3 or lower; the Guide also lists preliminary approval by a Board sub-committee, which the later announcement does not repeat</w:t>
             </w:r>
           </w:p>
         </w:tc>
@@ -1999,7 +1999,7 @@
               <w:rPr>
                 <w:sz w:val="15"/>
               </w:rPr>
-              <w:t xml:space="preserve">(i) (research institutions)</w:t>
+              <w:t xml:space="preserve">Cross-cutting (listed technologies of any layer)</w:t>
             </w:r>
           </w:p>
         </w:tc>
@@ -2050,7 +2050,7 @@
               <w:rPr>
                 <w:sz w:val="15"/>
               </w:rPr>
-              <w:t xml:space="preserve">No: restricts the track to purpose-built research institutions</w:t>
+              <w:t xml:space="preserve">Not scale-based: ratios restrict the track to purpose-built research institutions</w:t>
             </w:r>
           </w:p>
         </w:tc>
@@ -2137,7 +2137,7 @@
               <w:rPr>
                 <w:sz w:val="15"/>
               </w:rPr>
-              <w:t xml:space="preserve">(i)</w:t>
+              <w:t xml:space="preserve">Cross-cutting (listed technologies of any layer)</w:t>
             </w:r>
           </w:p>
         </w:tc>
@@ -2275,7 +2275,7 @@
               <w:rPr>
                 <w:sz w:val="15"/>
               </w:rPr>
-              <w:t xml:space="preserve">(i)</w:t>
+              <w:t xml:space="preserve">Cross-cutting (listed technologies of any layer)</w:t>
             </w:r>
           </w:p>
         </w:tc>
@@ -2965,7 +2965,7 @@
               <w:rPr>
                 <w:sz w:val="15"/>
               </w:rPr>
-              <w:t xml:space="preserve">(ii)+(iii), for research tasks</w:t>
+              <w:t xml:space="preserve">Cross-cutting (technology infrastructure, of which computing and data is one kind)</w:t>
             </w:r>
           </w:p>
         </w:tc>
@@ -2982,7 +2982,7 @@
               <w:rPr>
                 <w:sz w:val="15"/>
               </w:rPr>
-              <w:t xml:space="preserve">Indirect: investment cost deductible for corporate income tax</w:t>
+              <w:t xml:space="preserve">Indirect (cost deductible for corporate income tax) and State support of unspecified form</w:t>
             </w:r>
           </w:p>
         </w:tc>
@@ -3016,7 +3016,7 @@
               <w:rPr>
                 <w:sz w:val="15"/>
               </w:rPr>
-              <w:t xml:space="preserve">Not applicable</w:t>
+              <w:t xml:space="preserve">No</w:t>
             </w:r>
           </w:p>
         </w:tc>
@@ -3120,7 +3120,7 @@
               <w:rPr>
                 <w:sz w:val="15"/>
               </w:rPr>
-              <w:t xml:space="preserve">Eligibility status</w:t>
+              <w:t xml:space="preserve">Direct: land-rent exemption for the whole lease on land used for strategic products and research (Article 12(3)); further benefits through other instruments</w:t>
             </w:r>
           </w:p>
         </w:tc>
@@ -3154,7 +3154,7 @@
               <w:rPr>
                 <w:sz w:val="15"/>
               </w:rPr>
-              <w:t xml:space="preserve">No: not scale-based, but the revenue condition presupposes a product already earning revenue</w:t>
+              <w:t xml:space="preserve">Not scale-based (proportional ratios), but the revenue condition presupposes a product already earning revenue</w:t>
             </w:r>
           </w:p>
         </w:tc>
@@ -3566,7 +3566,7 @@
               <w:rPr>
                 <w:sz w:val="15"/>
               </w:rPr>
-              <w:t xml:space="preserve">(i) and (ii)</w:t>
+              <w:t xml:space="preserve">Cross-cutting (ten enablers across layers (i) and (ii))</w:t>
             </w:r>
           </w:p>
         </w:tc>
@@ -4511,7 +4511,7 @@
               <w:rPr>
                 <w:sz w:val="15"/>
               </w:rPr>
-              <w:t xml:space="preserve">Cost-benefit analysis at application; documents including audited financial statements where applicable and projections without incentives for the whole period; FIRB monitoring</w:t>
+              <w:t xml:space="preserve">Cost-benefit analysis at application; documents including audited financial statements where applicable and projections without incentives for the whole period; FIRB monitoring; annual claim for each project and performance metrics; the rules prescribe simplified forms for micro and small enterprises, which ease filing and not eligibility</w:t>
             </w:r>
           </w:p>
         </w:tc>
@@ -4790,7 +4790,7 @@
               <w:rPr>
                 <w:sz w:val="15"/>
               </w:rPr>
-              <w:t xml:space="preserve">Not applicable: discretionary</w:t>
+              <w:t xml:space="preserve">No: discretionary and not an entitlement</w:t>
             </w:r>
           </w:p>
         </w:tc>
@@ -4894,7 +4894,7 @@
               <w:rPr>
                 <w:sz w:val="15"/>
               </w:rPr>
-              <w:t xml:space="preserve">Indirect (through the tier)</w:t>
+              <w:t xml:space="preserve">Eligibility status: listing confers eligibility, and benefits follow by tier</w:t>
             </w:r>
           </w:p>
         </w:tc>
@@ -5032,7 +5032,7 @@
               <w:rPr>
                 <w:sz w:val="15"/>
               </w:rPr>
-              <w:t xml:space="preserve">Indirect (through the tier)</w:t>
+              <w:t xml:space="preserve">Eligibility status: listing confers eligibility, and benefits follow by tier</w:t>
             </w:r>
           </w:p>
         </w:tc>
@@ -5170,7 +5170,7 @@
               <w:rPr>
                 <w:sz w:val="15"/>
               </w:rPr>
-              <w:t xml:space="preserve">Indirect (through the tier)</w:t>
+              <w:t xml:space="preserve">Eligibility status: listing confers eligibility, and benefits follow by tier</w:t>
             </w:r>
           </w:p>
         </w:tc>
@@ -8271,7 +8271,7 @@
         <w:t xml:space="preserve"> </w:t>
       </w:r>
       <w:r>
-        <w:t xml:space="preserve">Construction cost of US$10.7m per MW (Turner and Townsend, 2025); fully equipped AI capacity of US$38m per MW (Epoch AI, 2026); 12 kW per server [citation to be added]. Figures are products of these benchmarks, not estimates of this paper.</w:t>
+        <w:t xml:space="preserve">Construction cost of US$10.7m per MW (Turner and Townsend, 2025); fully equipped AI capacity of US$38m per MW (Epoch AI, 2026); 12 kW per server, a planning figure above the 10.2 kW maximum NVIDIA lists for its DGX H100. Figures are products of these benchmarks, not estimates of this paper.</w:t>
       </w:r>
     </w:p>
     <w:bookmarkEnd w:id="29"/>
@@ -8316,7 +8316,7 @@
         <w:t xml:space="preserve"> </w:t>
       </w:r>
       <w:r>
-        <w:t xml:space="preserve">One eight-GPU H100 server of 12 kW is the unit. Server capital is US$250,000 to US$320,000 (reseller listings, September 2026). Realised price runs from US$1.70 to US$3.85 per GPU-hour: the low end is the 1-year contract index of October 2025 and the high end the on-demand list price of neoclouds, with US$2.35 (the March 2026 contract index) and US$3.00 between (Spendark, 2026). Colocation is US$200 to US$475 per kW a month (Singapore guides give US$310 to US$475; North American wholesale is about US$196), with metered power at US$0.11 per kWh, the Thai average tariff of THB 3.95 per kWh for September to December 2026 (Thai Energy Regulatory Commission, through press reports). Capital is charged as an annuity at 10 per cent over three to five years with no residual value, and 10 per cent of revenue goes to payment, support and bandwidth costs. A scale provider is given wholesale colocation at US$150 per kW, a hardware price of US$250,000 and a cost of capital of 8 per cent. The overhead of running a provider (certification, audit, staff, monitoring) is not observed, so it is varied from US$50,000 to US$300,000 a year.</w:t>
+        <w:t xml:space="preserve">One eight-GPU H100 server of 12 kW (above the 10.2 kW maximum that NVIDIA lists for its DGX H100) is the unit. Server capital is US$250,000 to US$320,000 (reseller listings, September 2026). Realised price runs from US$1.70 to US$3.85 per GPU-hour: the low end is the 1-year contract index of October 2025 and the high end the on-demand list price of neoclouds, with US$2.35 (the March 2026 contract index) and US$3.00 between (Spendark, 2026). Colocation is US$200 to US$475 per kW a month (Singapore guides give US$310 to US$475; North American wholesale is about US$196), with metered power at US$0.11 per kWh, the Thai average tariff of THB 3.95 per kWh for September to December 2026 (Thai Energy Regulatory Commission, through press reports). Capital is charged as an annuity at 10 per cent over three to five years with no residual value, and 10 per cent of revenue goes to payment, support and bandwidth costs. A scale provider is given wholesale colocation at US$150 per kW, a hardware price of US$250,000 and a cost of capital of 8 per cent. The overhead of running a provider (certification, audit, staff, monitoring) is not observed, so it is varied from US$50,000 to US$300,000 a year.</w:t>
       </w:r>
     </w:p>
     <w:p>
@@ -8878,13 +8878,13 @@
       </w:r>
     </w:p>
     <w:bookmarkEnd w:id="30"/>
-    <w:bookmarkStart w:id="31" w:name="currency-conversion"/>
+    <w:bookmarkStart w:id="31" w:name="X2ab4b4bf65b5183cee91dab9297b3466d6e51cc"/>
     <w:p>
       <w:pPr>
         <w:pStyle w:val="Heading2"/>
       </w:pPr>
       <w:r>
-        <w:t xml:space="preserve">Currency conversion</w:t>
+        <w:t xml:space="preserve">Table S6. Second-coder check and disagreement log</w:t>
       </w:r>
     </w:p>
     <w:p>
@@ -8892,11 +8892,1839 @@
         <w:pStyle w:val="FirstParagraph"/>
       </w:pPr>
       <w:r>
-        <w:t xml:space="preserve">Thai baht, Malaysian ringgit, Philippine peso and Vietnamese dong figures are converted to US dollars at about 35.7 baht, 4.55 ringgit and 57.7 pesos to the dollar. These rates are those implied by the values first coded. They are approximations used for comparison only. The source and date of each rate are to be recorded before submission, and the local-currency figure is the one to cite.</w:t>
+        <w:t xml:space="preserve">A separate instance of a generative AI model coded all 29 instruments blind to the first coder’s codes. It received only the codebook above, the blank coding sheet and the primary texts, and its two halves (Thailand and Malaysia; Vietnam and the Philippines) were coded by different instances. It reported no sight of the first codes. The first coder then adjudicated each disagreement against the text. This is an AI second coder: it shares the first coder’s model family and so may share its blind spots, and it is not a substitute for an independent human check.</w:t>
+      </w:r>
+    </w:p>
+    <w:p>
+      <w:pPr>
+        <w:pStyle w:val="BodyText"/>
+      </w:pPr>
+      <w:r>
+        <w:rPr>
+          <w:bCs/>
+          <w:b/>
+        </w:rPr>
+        <w:t xml:space="preserve">Agreement before adjudication</w:t>
+      </w:r>
+      <w:r>
+        <w:t xml:space="preserve"> </w:t>
+      </w:r>
+      <w:r>
+        <w:t xml:space="preserve">(29 instruments):</w:t>
+      </w:r>
+    </w:p>
+    <w:tbl>
+      <w:tblPr>
+        <w:tblStyle w:val="Table"/>
+        <w:tblLayout w:type="fixed"/>
+        <w:tblLook w:firstRow="1" w:lastRow="0" w:firstColumn="0" w:lastColumn="0" w:noHBand="0" w:noVBand="0" w:val="0020"/>
+        <w:jc w:val="start"/>
+        <w:tblBorders>
+          <w:top w:val="single" w:sz="4" w:color="999999"/>
+          <w:left w:val="single" w:sz="4" w:color="999999"/>
+          <w:bottom w:val="single" w:sz="4" w:color="999999"/>
+          <w:right w:val="single" w:sz="4" w:color="999999"/>
+          <w:insideH w:val="single" w:sz="4" w:color="999999"/>
+          <w:insideV w:val="single" w:sz="4" w:color="999999"/>
+        </w:tblBorders>
+        <w:tblLayout w:type="fixed"/>
+        <w:tblW w:w="15023" w:type="dxa"/>
+      </w:tblPr>
+      <w:tblGrid>
+        <w:gridCol w:w="3755"/>
+        <w:gridCol w:w="3755"/>
+        <w:gridCol w:w="3755"/>
+        <w:gridCol w:w="3755"/>
+      </w:tblGrid>
+      <w:tr>
+        <w:trPr>
+          <w:tblHeader w:val="true"/>
+        </w:trPr>
+        <w:tc>
+          <w:tcPr>
+            <w:tcW w:type="dxa" w:w="3756"/>
+          </w:tcPr>
+          <w:p>
+            <w:pPr>
+              <w:pStyle w:val="Compact"/>
+              <w:jc w:val="left"/>
+            </w:pPr>
+            <w:r>
+              <w:rPr>
+                <w:b/>
+                <w:sz w:val="15"/>
+              </w:rPr>
+              <w:t xml:space="preserve">Dimension</w:t>
+            </w:r>
+          </w:p>
+        </w:tc>
+        <w:tc>
+          <w:tcPr>
+            <w:tcW w:type="dxa" w:w="3756"/>
+          </w:tcPr>
+          <w:p>
+            <w:pPr>
+              <w:pStyle w:val="Compact"/>
+              <w:jc w:val="left"/>
+            </w:pPr>
+            <w:r>
+              <w:rPr>
+                <w:b/>
+                <w:sz w:val="15"/>
+              </w:rPr>
+              <w:t xml:space="preserve">Agreement</w:t>
+            </w:r>
+          </w:p>
+        </w:tc>
+        <w:tc>
+          <w:tcPr>
+            <w:tcW w:type="dxa" w:w="3756"/>
+          </w:tcPr>
+          <w:p>
+            <w:pPr>
+              <w:pStyle w:val="Compact"/>
+              <w:jc w:val="left"/>
+            </w:pPr>
+            <w:r>
+              <w:rPr>
+                <w:b/>
+                <w:sz w:val="15"/>
+              </w:rPr>
+              <w:t xml:space="preserve">Cohen’s kappa</w:t>
+            </w:r>
+          </w:p>
+        </w:tc>
+        <w:tc>
+          <w:tcPr>
+            <w:tcW w:type="dxa" w:w="3756"/>
+          </w:tcPr>
+          <w:p>
+            <w:pPr>
+              <w:pStyle w:val="Compact"/>
+              <w:jc w:val="left"/>
+            </w:pPr>
+            <w:r>
+              <w:rPr>
+                <w:b/>
+                <w:sz w:val="15"/>
+              </w:rPr>
+              <w:t xml:space="preserve">Rows that differed</w:t>
+            </w:r>
+          </w:p>
+        </w:tc>
+      </w:tr>
+      <w:tr>
+        <w:tc>
+          <w:tcPr>
+            <w:tcW w:type="dxa" w:w="3756"/>
+          </w:tcPr>
+          <w:p>
+            <w:pPr>
+              <w:pStyle w:val="Compact"/>
+              <w:jc w:val="left"/>
+            </w:pPr>
+            <w:r>
+              <w:rPr>
+                <w:sz w:val="15"/>
+              </w:rPr>
+              <w:t xml:space="preserve">Layer</w:t>
+            </w:r>
+          </w:p>
+        </w:tc>
+        <w:tc>
+          <w:tcPr>
+            <w:tcW w:type="dxa" w:w="3756"/>
+          </w:tcPr>
+          <w:p>
+            <w:pPr>
+              <w:pStyle w:val="Compact"/>
+              <w:jc w:val="left"/>
+            </w:pPr>
+            <w:r>
+              <w:rPr>
+                <w:sz w:val="15"/>
+              </w:rPr>
+              <w:t xml:space="preserve">20 of 29 (69%)</w:t>
+            </w:r>
+          </w:p>
+        </w:tc>
+        <w:tc>
+          <w:tcPr>
+            <w:tcW w:type="dxa" w:w="3756"/>
+          </w:tcPr>
+          <w:p>
+            <w:pPr>
+              <w:pStyle w:val="Compact"/>
+              <w:jc w:val="left"/>
+            </w:pPr>
+            <w:r>
+              <w:rPr>
+                <w:sz w:val="15"/>
+              </w:rPr>
+              <w:t xml:space="preserve">0.60</w:t>
+            </w:r>
+          </w:p>
+        </w:tc>
+        <w:tc>
+          <w:tcPr>
+            <w:tcW w:type="dxa" w:w="3756"/>
+          </w:tcPr>
+          <w:p>
+            <w:pPr>
+              <w:pStyle w:val="Compact"/>
+              <w:jc w:val="left"/>
+            </w:pPr>
+            <w:r>
+              <w:rPr>
+                <w:sz w:val="15"/>
+              </w:rPr>
+              <w:t xml:space="preserve">2, 4, 7, 8, 9, 14, 22, 24, 27</w:t>
+            </w:r>
+          </w:p>
+        </w:tc>
+      </w:tr>
+      <w:tr>
+        <w:tc>
+          <w:tcPr>
+            <w:tcW w:type="dxa" w:w="3756"/>
+          </w:tcPr>
+          <w:p>
+            <w:pPr>
+              <w:pStyle w:val="Compact"/>
+              <w:jc w:val="left"/>
+            </w:pPr>
+            <w:r>
+              <w:rPr>
+                <w:sz w:val="15"/>
+              </w:rPr>
+              <w:t xml:space="preserve">Delivery</w:t>
+            </w:r>
+          </w:p>
+        </w:tc>
+        <w:tc>
+          <w:tcPr>
+            <w:tcW w:type="dxa" w:w="3756"/>
+          </w:tcPr>
+          <w:p>
+            <w:pPr>
+              <w:pStyle w:val="Compact"/>
+              <w:jc w:val="left"/>
+            </w:pPr>
+            <w:r>
+              <w:rPr>
+                <w:sz w:val="15"/>
+              </w:rPr>
+              <w:t xml:space="preserve">24 of 29 (83%)</w:t>
+            </w:r>
+          </w:p>
+        </w:tc>
+        <w:tc>
+          <w:tcPr>
+            <w:tcW w:type="dxa" w:w="3756"/>
+          </w:tcPr>
+          <w:p>
+            <w:pPr>
+              <w:pStyle w:val="Compact"/>
+              <w:jc w:val="left"/>
+            </w:pPr>
+            <w:r>
+              <w:rPr>
+                <w:sz w:val="15"/>
+              </w:rPr>
+              <w:t xml:space="preserve">0.73</w:t>
+            </w:r>
+          </w:p>
+        </w:tc>
+        <w:tc>
+          <w:tcPr>
+            <w:tcW w:type="dxa" w:w="3756"/>
+          </w:tcPr>
+          <w:p>
+            <w:pPr>
+              <w:pStyle w:val="Compact"/>
+              <w:jc w:val="left"/>
+            </w:pPr>
+            <w:r>
+              <w:rPr>
+                <w:sz w:val="15"/>
+              </w:rPr>
+              <w:t xml:space="preserve">24, 25, 27, 28, 29</w:t>
+            </w:r>
+          </w:p>
+        </w:tc>
+      </w:tr>
+      <w:tr>
+        <w:tc>
+          <w:tcPr>
+            <w:tcW w:type="dxa" w:w="3756"/>
+          </w:tcPr>
+          <w:p>
+            <w:pPr>
+              <w:pStyle w:val="Compact"/>
+              <w:jc w:val="left"/>
+            </w:pPr>
+            <w:r>
+              <w:rPr>
+                <w:sz w:val="15"/>
+              </w:rPr>
+              <w:t xml:space="preserve">New-firm accommodation</w:t>
+            </w:r>
+          </w:p>
+        </w:tc>
+        <w:tc>
+          <w:tcPr>
+            <w:tcW w:type="dxa" w:w="3756"/>
+          </w:tcPr>
+          <w:p>
+            <w:pPr>
+              <w:pStyle w:val="Compact"/>
+              <w:jc w:val="left"/>
+            </w:pPr>
+            <w:r>
+              <w:rPr>
+                <w:sz w:val="15"/>
+              </w:rPr>
+              <w:t xml:space="preserve">22 of 29 (76%)</w:t>
+            </w:r>
+          </w:p>
+        </w:tc>
+        <w:tc>
+          <w:tcPr>
+            <w:tcW w:type="dxa" w:w="3756"/>
+          </w:tcPr>
+          <w:p>
+            <w:pPr>
+              <w:pStyle w:val="Compact"/>
+              <w:jc w:val="left"/>
+            </w:pPr>
+            <w:r>
+              <w:rPr>
+                <w:sz w:val="15"/>
+              </w:rPr>
+              <w:t xml:space="preserve">0.57</w:t>
+            </w:r>
+          </w:p>
+        </w:tc>
+        <w:tc>
+          <w:tcPr>
+            <w:tcW w:type="dxa" w:w="3756"/>
+          </w:tcPr>
+          <w:p>
+            <w:pPr>
+              <w:pStyle w:val="Compact"/>
+              <w:jc w:val="left"/>
+            </w:pPr>
+            <w:r>
+              <w:rPr>
+                <w:sz w:val="15"/>
+              </w:rPr>
+              <w:t xml:space="preserve">3, 7, 20, 23, 24, 25, 26</w:t>
+            </w:r>
+          </w:p>
+        </w:tc>
+      </w:tr>
+      <w:tr>
+        <w:tc>
+          <w:tcPr>
+            <w:tcW w:type="dxa" w:w="3756"/>
+          </w:tcPr>
+          <w:p>
+            <w:pPr>
+              <w:pStyle w:val="Compact"/>
+              <w:jc w:val="left"/>
+            </w:pPr>
+            <w:r>
+              <w:rPr>
+                <w:sz w:val="15"/>
+              </w:rPr>
+              <w:t xml:space="preserve">Threshold figures</w:t>
+            </w:r>
+          </w:p>
+        </w:tc>
+        <w:tc>
+          <w:tcPr>
+            <w:tcW w:type="dxa" w:w="3756"/>
+          </w:tcPr>
+          <w:p>
+            <w:pPr>
+              <w:pStyle w:val="Compact"/>
+              <w:jc w:val="left"/>
+            </w:pPr>
+            <w:r>
+              <w:rPr>
+                <w:sz w:val="15"/>
+              </w:rPr>
+              <w:t xml:space="preserve">28 of 29</w:t>
+            </w:r>
+          </w:p>
+        </w:tc>
+        <w:tc>
+          <w:tcPr>
+            <w:tcW w:type="dxa" w:w="3756"/>
+          </w:tcPr>
+          <w:p>
+            <w:pPr>
+              <w:pStyle w:val="Compact"/>
+              <w:jc w:val="left"/>
+            </w:pPr>
+            <w:r>
+              <w:rPr>
+                <w:sz w:val="15"/>
+              </w:rPr>
+              <w:t xml:space="preserve">not computed</w:t>
+            </w:r>
+          </w:p>
+        </w:tc>
+        <w:tc>
+          <w:tcPr>
+            <w:tcW w:type="dxa" w:w="3756"/>
+          </w:tcPr>
+          <w:p>
+            <w:pPr>
+              <w:pStyle w:val="Compact"/>
+              <w:jc w:val="left"/>
+            </w:pPr>
+            <w:r>
+              <w:rPr>
+                <w:sz w:val="15"/>
+              </w:rPr>
+              <w:t xml:space="preserve">3 (reading of</w:t>
+            </w:r>
+            <w:r>
+              <w:rPr>
+                <w:sz w:val="15"/>
+              </w:rPr>
+              <w:t xml:space="preserve"> </w:t>
+            </w:r>
+            <w:r>
+              <w:rPr>
+                <w:sz w:val="15"/>
+              </w:rPr>
+              <w:t xml:space="preserve">“</w:t>
+            </w:r>
+            <w:r>
+              <w:rPr>
+                <w:sz w:val="15"/>
+              </w:rPr>
+              <w:t xml:space="preserve">whichever is lower</w:t>
+            </w:r>
+            <w:r>
+              <w:rPr>
+                <w:sz w:val="15"/>
+              </w:rPr>
+              <w:t xml:space="preserve">”</w:t>
+            </w:r>
+            <w:r>
+              <w:rPr>
+                <w:sz w:val="15"/>
+              </w:rPr>
+              <w:t xml:space="preserve">)</w:t>
+            </w:r>
+          </w:p>
+        </w:tc>
+      </w:tr>
+    </w:tbl>
+    <w:p>
+      <w:pPr>
+        <w:pStyle w:val="BodyText"/>
+      </w:pPr>
+      <w:r>
+        <w:t xml:space="preserve">Kappa is moderate on layer and accommodation, as expected for categories that depend on how an instrument’s scope is read. Layer disagreements concerned whether a technology-neutral instrument is cross-cutting or belongs to a layer. Agreement on the thresholds, the quantities that Tables 3 and 5 of the manuscript rely on, was near complete.</w:t>
+      </w:r>
+    </w:p>
+    <w:p>
+      <w:pPr>
+        <w:pStyle w:val="BodyText"/>
+      </w:pPr>
+      <w:r>
+        <w:rPr>
+          <w:bCs/>
+          <w:b/>
+        </w:rPr>
+        <w:t xml:space="preserve">Resolution of disagreements</w:t>
+      </w:r>
+      <w:r>
+        <w:t xml:space="preserve"> </w:t>
+      </w:r>
+      <w:r>
+        <w:t xml:space="preserve">(first coder’s code, second coder’s code, final):</w:t>
+      </w:r>
+    </w:p>
+    <w:tbl>
+      <w:tblPr>
+        <w:tblStyle w:val="Table"/>
+        <w:tblLayout w:type="fixed"/>
+        <w:tblLook w:firstRow="1" w:lastRow="0" w:firstColumn="0" w:lastColumn="0" w:noHBand="0" w:noVBand="0" w:val="0020"/>
+        <w:jc w:val="start"/>
+        <w:tblBorders>
+          <w:top w:val="single" w:sz="4" w:color="999999"/>
+          <w:left w:val="single" w:sz="4" w:color="999999"/>
+          <w:bottom w:val="single" w:sz="4" w:color="999999"/>
+          <w:right w:val="single" w:sz="4" w:color="999999"/>
+          <w:insideH w:val="single" w:sz="4" w:color="999999"/>
+          <w:insideV w:val="single" w:sz="4" w:color="999999"/>
+        </w:tblBorders>
+        <w:tblLayout w:type="fixed"/>
+        <w:tblW w:w="15023" w:type="dxa"/>
+      </w:tblPr>
+      <w:tblGrid>
+        <w:gridCol w:w="715"/>
+        <w:gridCol w:w="2861"/>
+        <w:gridCol w:w="3577"/>
+        <w:gridCol w:w="4292"/>
+        <w:gridCol w:w="3577"/>
+      </w:tblGrid>
+      <w:tr>
+        <w:trPr>
+          <w:tblHeader w:val="true"/>
+        </w:trPr>
+        <w:tc>
+          <w:tcPr>
+            <w:tcW w:type="dxa" w:w="715"/>
+          </w:tcPr>
+          <w:p>
+            <w:pPr>
+              <w:pStyle w:val="Compact"/>
+              <w:jc w:val="left"/>
+            </w:pPr>
+            <w:r>
+              <w:rPr>
+                <w:b/>
+                <w:sz w:val="15"/>
+              </w:rPr>
+              <w:t xml:space="preserve">Row</w:t>
+            </w:r>
+          </w:p>
+        </w:tc>
+        <w:tc>
+          <w:tcPr>
+            <w:tcW w:type="dxa" w:w="2862"/>
+          </w:tcPr>
+          <w:p>
+            <w:pPr>
+              <w:pStyle w:val="Compact"/>
+              <w:jc w:val="left"/>
+            </w:pPr>
+            <w:r>
+              <w:rPr>
+                <w:b/>
+                <w:sz w:val="15"/>
+              </w:rPr>
+              <w:t xml:space="preserve">Dimension</w:t>
+            </w:r>
+          </w:p>
+        </w:tc>
+        <w:tc>
+          <w:tcPr>
+            <w:tcW w:type="dxa" w:w="3577"/>
+          </w:tcPr>
+          <w:p>
+            <w:pPr>
+              <w:pStyle w:val="Compact"/>
+              <w:jc w:val="left"/>
+            </w:pPr>
+            <w:r>
+              <w:rPr>
+                <w:b/>
+                <w:sz w:val="15"/>
+              </w:rPr>
+              <w:t xml:space="preserve">First coder</w:t>
+            </w:r>
+          </w:p>
+        </w:tc>
+        <w:tc>
+          <w:tcPr>
+            <w:tcW w:type="dxa" w:w="4292"/>
+          </w:tcPr>
+          <w:p>
+            <w:pPr>
+              <w:pStyle w:val="Compact"/>
+              <w:jc w:val="left"/>
+            </w:pPr>
+            <w:r>
+              <w:rPr>
+                <w:b/>
+                <w:sz w:val="15"/>
+              </w:rPr>
+              <w:t xml:space="preserve">Second coder</w:t>
+            </w:r>
+          </w:p>
+        </w:tc>
+        <w:tc>
+          <w:tcPr>
+            <w:tcW w:type="dxa" w:w="3577"/>
+          </w:tcPr>
+          <w:p>
+            <w:pPr>
+              <w:pStyle w:val="Compact"/>
+              <w:jc w:val="left"/>
+            </w:pPr>
+            <w:r>
+              <w:rPr>
+                <w:b/>
+                <w:sz w:val="15"/>
+              </w:rPr>
+              <w:t xml:space="preserve">Final and reason</w:t>
+            </w:r>
+          </w:p>
+        </w:tc>
+      </w:tr>
+      <w:tr>
+        <w:tc>
+          <w:tcPr>
+            <w:tcW w:type="dxa" w:w="715"/>
+          </w:tcPr>
+          <w:p>
+            <w:pPr>
+              <w:pStyle w:val="Compact"/>
+              <w:jc w:val="left"/>
+            </w:pPr>
+            <w:r>
+              <w:rPr>
+                <w:sz w:val="15"/>
+              </w:rPr>
+              <w:t xml:space="preserve">2</w:t>
+            </w:r>
+          </w:p>
+        </w:tc>
+        <w:tc>
+          <w:tcPr>
+            <w:tcW w:type="dxa" w:w="2862"/>
+          </w:tcPr>
+          <w:p>
+            <w:pPr>
+              <w:pStyle w:val="Compact"/>
+              <w:jc w:val="left"/>
+            </w:pPr>
+            <w:r>
+              <w:rPr>
+                <w:sz w:val="15"/>
+              </w:rPr>
+              <w:t xml:space="preserve">Layer</w:t>
+            </w:r>
+          </w:p>
+        </w:tc>
+        <w:tc>
+          <w:tcPr>
+            <w:tcW w:type="dxa" w:w="3577"/>
+          </w:tcPr>
+          <w:p>
+            <w:pPr>
+              <w:pStyle w:val="Compact"/>
+              <w:jc w:val="left"/>
+            </w:pPr>
+            <w:r>
+              <w:rPr>
+                <w:sz w:val="15"/>
+              </w:rPr>
+              <w:t xml:space="preserve">(i)</w:t>
+            </w:r>
+          </w:p>
+        </w:tc>
+        <w:tc>
+          <w:tcPr>
+            <w:tcW w:type="dxa" w:w="4292"/>
+          </w:tcPr>
+          <w:p>
+            <w:pPr>
+              <w:pStyle w:val="Compact"/>
+              <w:jc w:val="left"/>
+            </w:pPr>
+            <w:r>
+              <w:rPr>
+                <w:sz w:val="15"/>
+              </w:rPr>
+              <w:t xml:space="preserve">Cross-cutting</w:t>
+            </w:r>
+          </w:p>
+        </w:tc>
+        <w:tc>
+          <w:tcPr>
+            <w:tcW w:type="dxa" w:w="3577"/>
+          </w:tcPr>
+          <w:p>
+            <w:pPr>
+              <w:pStyle w:val="Compact"/>
+              <w:jc w:val="left"/>
+            </w:pPr>
+            <w:r>
+              <w:rPr>
+                <w:sz w:val="15"/>
+              </w:rPr>
+              <w:t xml:space="preserve">Cross-cutting: Activity 10.2 covers R&amp;D of any technology</w:t>
+            </w:r>
+          </w:p>
+        </w:tc>
+      </w:tr>
+      <w:tr>
+        <w:tc>
+          <w:tcPr>
+            <w:tcW w:type="dxa" w:w="715"/>
+          </w:tcPr>
+          <w:p>
+            <w:pPr>
+              <w:pStyle w:val="Compact"/>
+              <w:jc w:val="left"/>
+            </w:pPr>
+            <w:r>
+              <w:rPr>
+                <w:sz w:val="15"/>
+              </w:rPr>
+              <w:t xml:space="preserve">3</w:t>
+            </w:r>
+          </w:p>
+        </w:tc>
+        <w:tc>
+          <w:tcPr>
+            <w:tcW w:type="dxa" w:w="2862"/>
+          </w:tcPr>
+          <w:p>
+            <w:pPr>
+              <w:pStyle w:val="Compact"/>
+              <w:jc w:val="left"/>
+            </w:pPr>
+            <w:r>
+              <w:rPr>
+                <w:sz w:val="15"/>
+              </w:rPr>
+              <w:t xml:space="preserve">Accommodation</w:t>
+            </w:r>
+          </w:p>
+        </w:tc>
+        <w:tc>
+          <w:tcPr>
+            <w:tcW w:type="dxa" w:w="3577"/>
+          </w:tcPr>
+          <w:p>
+            <w:pPr>
+              <w:pStyle w:val="Compact"/>
+              <w:jc w:val="left"/>
+            </w:pPr>
+            <w:r>
+              <w:rPr>
+                <w:sz w:val="15"/>
+              </w:rPr>
+              <w:t xml:space="preserve">No</w:t>
+            </w:r>
+          </w:p>
+        </w:tc>
+        <w:tc>
+          <w:tcPr>
+            <w:tcW w:type="dxa" w:w="4292"/>
+          </w:tcPr>
+          <w:p>
+            <w:pPr>
+              <w:pStyle w:val="Compact"/>
+              <w:jc w:val="left"/>
+            </w:pPr>
+            <w:r>
+              <w:rPr>
+                <w:sz w:val="15"/>
+              </w:rPr>
+              <w:t xml:space="preserve">Not scale-based</w:t>
+            </w:r>
+          </w:p>
+        </w:tc>
+        <w:tc>
+          <w:tcPr>
+            <w:tcW w:type="dxa" w:w="3577"/>
+          </w:tcPr>
+          <w:p>
+            <w:pPr>
+              <w:pStyle w:val="Compact"/>
+              <w:jc w:val="left"/>
+            </w:pPr>
+            <w:r>
+              <w:rPr>
+                <w:sz w:val="15"/>
+              </w:rPr>
+              <w:t xml:space="preserve">Not scale-based: the rule is proportional to sales</w:t>
+            </w:r>
+          </w:p>
+        </w:tc>
+      </w:tr>
+      <w:tr>
+        <w:tc>
+          <w:tcPr>
+            <w:tcW w:type="dxa" w:w="715"/>
+          </w:tcPr>
+          <w:p>
+            <w:pPr>
+              <w:pStyle w:val="Compact"/>
+              <w:jc w:val="left"/>
+            </w:pPr>
+            <w:r>
+              <w:rPr>
+                <w:sz w:val="15"/>
+              </w:rPr>
+              <w:t xml:space="preserve">4</w:t>
+            </w:r>
+          </w:p>
+        </w:tc>
+        <w:tc>
+          <w:tcPr>
+            <w:tcW w:type="dxa" w:w="2862"/>
+          </w:tcPr>
+          <w:p>
+            <w:pPr>
+              <w:pStyle w:val="Compact"/>
+              <w:jc w:val="left"/>
+            </w:pPr>
+            <w:r>
+              <w:rPr>
+                <w:sz w:val="15"/>
+              </w:rPr>
+              <w:t xml:space="preserve">Layer</w:t>
+            </w:r>
+          </w:p>
+        </w:tc>
+        <w:tc>
+          <w:tcPr>
+            <w:tcW w:type="dxa" w:w="3577"/>
+          </w:tcPr>
+          <w:p>
+            <w:pPr>
+              <w:pStyle w:val="Compact"/>
+              <w:jc w:val="left"/>
+            </w:pPr>
+            <w:r>
+              <w:rPr>
+                <w:sz w:val="15"/>
+              </w:rPr>
+              <w:t xml:space="preserve">(ii)+(iii)</w:t>
+            </w:r>
+          </w:p>
+        </w:tc>
+        <w:tc>
+          <w:tcPr>
+            <w:tcW w:type="dxa" w:w="4292"/>
+          </w:tcPr>
+          <w:p>
+            <w:pPr>
+              <w:pStyle w:val="Compact"/>
+              <w:jc w:val="left"/>
+            </w:pPr>
+            <w:r>
+              <w:rPr>
+                <w:sz w:val="15"/>
+              </w:rPr>
+              <w:t xml:space="preserve">(ii)</w:t>
+            </w:r>
+          </w:p>
+        </w:tc>
+        <w:tc>
+          <w:tcPr>
+            <w:tcW w:type="dxa" w:w="3577"/>
+          </w:tcPr>
+          <w:p>
+            <w:pPr>
+              <w:pStyle w:val="Compact"/>
+              <w:jc w:val="left"/>
+            </w:pPr>
+            <w:r>
+              <w:rPr>
+                <w:sz w:val="15"/>
+              </w:rPr>
+              <w:t xml:space="preserve">(ii): the activity is rental of computing equipment</w:t>
+            </w:r>
+          </w:p>
+        </w:tc>
+      </w:tr>
+      <w:tr>
+        <w:tc>
+          <w:tcPr>
+            <w:tcW w:type="dxa" w:w="715"/>
+          </w:tcPr>
+          <w:p>
+            <w:pPr>
+              <w:pStyle w:val="Compact"/>
+              <w:jc w:val="left"/>
+            </w:pPr>
+            <w:r>
+              <w:rPr>
+                <w:sz w:val="15"/>
+              </w:rPr>
+              <w:t xml:space="preserve">7, 8, 9</w:t>
+            </w:r>
+          </w:p>
+        </w:tc>
+        <w:tc>
+          <w:tcPr>
+            <w:tcW w:type="dxa" w:w="2862"/>
+          </w:tcPr>
+          <w:p>
+            <w:pPr>
+              <w:pStyle w:val="Compact"/>
+              <w:jc w:val="left"/>
+            </w:pPr>
+            <w:r>
+              <w:rPr>
+                <w:sz w:val="15"/>
+              </w:rPr>
+              <w:t xml:space="preserve">Layer</w:t>
+            </w:r>
+          </w:p>
+        </w:tc>
+        <w:tc>
+          <w:tcPr>
+            <w:tcW w:type="dxa" w:w="3577"/>
+          </w:tcPr>
+          <w:p>
+            <w:pPr>
+              <w:pStyle w:val="Compact"/>
+              <w:jc w:val="left"/>
+            </w:pPr>
+            <w:r>
+              <w:rPr>
+                <w:sz w:val="15"/>
+              </w:rPr>
+              <w:t xml:space="preserve">(i)</w:t>
+            </w:r>
+          </w:p>
+        </w:tc>
+        <w:tc>
+          <w:tcPr>
+            <w:tcW w:type="dxa" w:w="4292"/>
+          </w:tcPr>
+          <w:p>
+            <w:pPr>
+              <w:pStyle w:val="Compact"/>
+              <w:jc w:val="left"/>
+            </w:pPr>
+            <w:r>
+              <w:rPr>
+                <w:sz w:val="15"/>
+              </w:rPr>
+              <w:t xml:space="preserve">Cross-cutting</w:t>
+            </w:r>
+          </w:p>
+        </w:tc>
+        <w:tc>
+          <w:tcPr>
+            <w:tcW w:type="dxa" w:w="3577"/>
+          </w:tcPr>
+          <w:p>
+            <w:pPr>
+              <w:pStyle w:val="Compact"/>
+              <w:jc w:val="left"/>
+            </w:pPr>
+            <w:r>
+              <w:rPr>
+                <w:sz w:val="15"/>
+              </w:rPr>
+              <w:t xml:space="preserve">Cross-cutting: the tracks cover listed technologies of any layer</w:t>
+            </w:r>
+          </w:p>
+        </w:tc>
+      </w:tr>
+      <w:tr>
+        <w:tc>
+          <w:tcPr>
+            <w:tcW w:type="dxa" w:w="715"/>
+          </w:tcPr>
+          <w:p>
+            <w:pPr>
+              <w:pStyle w:val="Compact"/>
+              <w:jc w:val="left"/>
+            </w:pPr>
+            <w:r>
+              <w:rPr>
+                <w:sz w:val="15"/>
+              </w:rPr>
+              <w:t xml:space="preserve">7</w:t>
+            </w:r>
+          </w:p>
+        </w:tc>
+        <w:tc>
+          <w:tcPr>
+            <w:tcW w:type="dxa" w:w="2862"/>
+          </w:tcPr>
+          <w:p>
+            <w:pPr>
+              <w:pStyle w:val="Compact"/>
+              <w:jc w:val="left"/>
+            </w:pPr>
+            <w:r>
+              <w:rPr>
+                <w:sz w:val="15"/>
+              </w:rPr>
+              <w:t xml:space="preserve">Accommodation</w:t>
+            </w:r>
+          </w:p>
+        </w:tc>
+        <w:tc>
+          <w:tcPr>
+            <w:tcW w:type="dxa" w:w="3577"/>
+          </w:tcPr>
+          <w:p>
+            <w:pPr>
+              <w:pStyle w:val="Compact"/>
+              <w:jc w:val="left"/>
+            </w:pPr>
+            <w:r>
+              <w:rPr>
+                <w:sz w:val="15"/>
+              </w:rPr>
+              <w:t xml:space="preserve">No</w:t>
+            </w:r>
+          </w:p>
+        </w:tc>
+        <w:tc>
+          <w:tcPr>
+            <w:tcW w:type="dxa" w:w="4292"/>
+          </w:tcPr>
+          <w:p>
+            <w:pPr>
+              <w:pStyle w:val="Compact"/>
+              <w:jc w:val="left"/>
+            </w:pPr>
+            <w:r>
+              <w:rPr>
+                <w:sz w:val="15"/>
+              </w:rPr>
+              <w:t xml:space="preserve">Not scale-based</w:t>
+            </w:r>
+          </w:p>
+        </w:tc>
+        <w:tc>
+          <w:tcPr>
+            <w:tcW w:type="dxa" w:w="3577"/>
+          </w:tcPr>
+          <w:p>
+            <w:pPr>
+              <w:pStyle w:val="Compact"/>
+              <w:jc w:val="left"/>
+            </w:pPr>
+            <w:r>
+              <w:rPr>
+                <w:sz w:val="15"/>
+              </w:rPr>
+              <w:t xml:space="preserve">Not scale-based: proportional ratios</w:t>
+            </w:r>
+          </w:p>
+        </w:tc>
+      </w:tr>
+      <w:tr>
+        <w:tc>
+          <w:tcPr>
+            <w:tcW w:type="dxa" w:w="715"/>
+          </w:tcPr>
+          <w:p>
+            <w:pPr>
+              <w:pStyle w:val="Compact"/>
+              <w:jc w:val="left"/>
+            </w:pPr>
+            <w:r>
+              <w:rPr>
+                <w:sz w:val="15"/>
+              </w:rPr>
+              <w:t xml:space="preserve">14</w:t>
+            </w:r>
+          </w:p>
+        </w:tc>
+        <w:tc>
+          <w:tcPr>
+            <w:tcW w:type="dxa" w:w="2862"/>
+          </w:tcPr>
+          <w:p>
+            <w:pPr>
+              <w:pStyle w:val="Compact"/>
+              <w:jc w:val="left"/>
+            </w:pPr>
+            <w:r>
+              <w:rPr>
+                <w:sz w:val="15"/>
+              </w:rPr>
+              <w:t xml:space="preserve">Layer</w:t>
+            </w:r>
+          </w:p>
+        </w:tc>
+        <w:tc>
+          <w:tcPr>
+            <w:tcW w:type="dxa" w:w="3577"/>
+          </w:tcPr>
+          <w:p>
+            <w:pPr>
+              <w:pStyle w:val="Compact"/>
+              <w:jc w:val="left"/>
+            </w:pPr>
+            <w:r>
+              <w:rPr>
+                <w:sz w:val="15"/>
+              </w:rPr>
+              <w:t xml:space="preserve">(i) and (ii)</w:t>
+            </w:r>
+          </w:p>
+        </w:tc>
+        <w:tc>
+          <w:tcPr>
+            <w:tcW w:type="dxa" w:w="4292"/>
+          </w:tcPr>
+          <w:p>
+            <w:pPr>
+              <w:pStyle w:val="Compact"/>
+              <w:jc w:val="left"/>
+            </w:pPr>
+            <w:r>
+              <w:rPr>
+                <w:sz w:val="15"/>
+              </w:rPr>
+              <w:t xml:space="preserve">Cross-cutting</w:t>
+            </w:r>
+          </w:p>
+        </w:tc>
+        <w:tc>
+          <w:tcPr>
+            <w:tcW w:type="dxa" w:w="3577"/>
+          </w:tcPr>
+          <w:p>
+            <w:pPr>
+              <w:pStyle w:val="Compact"/>
+              <w:jc w:val="left"/>
+            </w:pPr>
+            <w:r>
+              <w:rPr>
+                <w:sz w:val="15"/>
+              </w:rPr>
+              <w:t xml:space="preserve">Cross-cutting: ten enablers across layers</w:t>
+            </w:r>
+          </w:p>
+        </w:tc>
+      </w:tr>
+      <w:tr>
+        <w:tc>
+          <w:tcPr>
+            <w:tcW w:type="dxa" w:w="715"/>
+          </w:tcPr>
+          <w:p>
+            <w:pPr>
+              <w:pStyle w:val="Compact"/>
+              <w:jc w:val="left"/>
+            </w:pPr>
+            <w:r>
+              <w:rPr>
+                <w:sz w:val="15"/>
+              </w:rPr>
+              <w:t xml:space="preserve">20</w:t>
+            </w:r>
+          </w:p>
+        </w:tc>
+        <w:tc>
+          <w:tcPr>
+            <w:tcW w:type="dxa" w:w="2862"/>
+          </w:tcPr>
+          <w:p>
+            <w:pPr>
+              <w:pStyle w:val="Compact"/>
+              <w:jc w:val="left"/>
+            </w:pPr>
+            <w:r>
+              <w:rPr>
+                <w:sz w:val="15"/>
+              </w:rPr>
+              <w:t xml:space="preserve">Accommodation</w:t>
+            </w:r>
+          </w:p>
+        </w:tc>
+        <w:tc>
+          <w:tcPr>
+            <w:tcW w:type="dxa" w:w="3577"/>
+          </w:tcPr>
+          <w:p>
+            <w:pPr>
+              <w:pStyle w:val="Compact"/>
+              <w:jc w:val="left"/>
+            </w:pPr>
+            <w:r>
+              <w:rPr>
+                <w:sz w:val="15"/>
+              </w:rPr>
+              <w:t xml:space="preserve">Not applicable</w:t>
+            </w:r>
+          </w:p>
+        </w:tc>
+        <w:tc>
+          <w:tcPr>
+            <w:tcW w:type="dxa" w:w="4292"/>
+          </w:tcPr>
+          <w:p>
+            <w:pPr>
+              <w:pStyle w:val="Compact"/>
+              <w:jc w:val="left"/>
+            </w:pPr>
+            <w:r>
+              <w:rPr>
+                <w:sz w:val="15"/>
+              </w:rPr>
+              <w:t xml:space="preserve">No</w:t>
+            </w:r>
+          </w:p>
+        </w:tc>
+        <w:tc>
+          <w:tcPr>
+            <w:tcW w:type="dxa" w:w="3577"/>
+          </w:tcPr>
+          <w:p>
+            <w:pPr>
+              <w:pStyle w:val="Compact"/>
+              <w:jc w:val="left"/>
+            </w:pPr>
+            <w:r>
+              <w:rPr>
+                <w:sz w:val="15"/>
+              </w:rPr>
+              <w:t xml:space="preserve">No: discretionary, not an entitlement</w:t>
+            </w:r>
+          </w:p>
+        </w:tc>
+      </w:tr>
+      <w:tr>
+        <w:tc>
+          <w:tcPr>
+            <w:tcW w:type="dxa" w:w="715"/>
+          </w:tcPr>
+          <w:p>
+            <w:pPr>
+              <w:pStyle w:val="Compact"/>
+              <w:jc w:val="left"/>
+            </w:pPr>
+            <w:r>
+              <w:rPr>
+                <w:sz w:val="15"/>
+              </w:rPr>
+              <w:t xml:space="preserve">22</w:t>
+            </w:r>
+          </w:p>
+        </w:tc>
+        <w:tc>
+          <w:tcPr>
+            <w:tcW w:type="dxa" w:w="2862"/>
+          </w:tcPr>
+          <w:p>
+            <w:pPr>
+              <w:pStyle w:val="Compact"/>
+              <w:jc w:val="left"/>
+            </w:pPr>
+            <w:r>
+              <w:rPr>
+                <w:sz w:val="15"/>
+              </w:rPr>
+              <w:t xml:space="preserve">Layer</w:t>
+            </w:r>
+          </w:p>
+        </w:tc>
+        <w:tc>
+          <w:tcPr>
+            <w:tcW w:type="dxa" w:w="3577"/>
+          </w:tcPr>
+          <w:p>
+            <w:pPr>
+              <w:pStyle w:val="Compact"/>
+              <w:jc w:val="left"/>
+            </w:pPr>
+            <w:r>
+              <w:rPr>
+                <w:sz w:val="15"/>
+              </w:rPr>
+              <w:t xml:space="preserve">(ii)+(iii)</w:t>
+            </w:r>
+          </w:p>
+        </w:tc>
+        <w:tc>
+          <w:tcPr>
+            <w:tcW w:type="dxa" w:w="4292"/>
+          </w:tcPr>
+          <w:p>
+            <w:pPr>
+              <w:pStyle w:val="Compact"/>
+              <w:jc w:val="left"/>
+            </w:pPr>
+            <w:r>
+              <w:rPr>
+                <w:sz w:val="15"/>
+              </w:rPr>
+              <w:t xml:space="preserve">(iii)</w:t>
+            </w:r>
+          </w:p>
+        </w:tc>
+        <w:tc>
+          <w:tcPr>
+            <w:tcW w:type="dxa" w:w="3577"/>
+          </w:tcPr>
+          <w:p>
+            <w:pPr>
+              <w:pStyle w:val="Compact"/>
+              <w:jc w:val="left"/>
+            </w:pPr>
+            <w:r>
+              <w:rPr>
+                <w:sz w:val="15"/>
+              </w:rPr>
+              <w:t xml:space="preserve">(iii): data centres are facilities</w:t>
+            </w:r>
+          </w:p>
+        </w:tc>
+      </w:tr>
+      <w:tr>
+        <w:tc>
+          <w:tcPr>
+            <w:tcW w:type="dxa" w:w="715"/>
+          </w:tcPr>
+          <w:p>
+            <w:pPr>
+              <w:pStyle w:val="Compact"/>
+              <w:jc w:val="left"/>
+            </w:pPr>
+            <w:r>
+              <w:rPr>
+                <w:sz w:val="15"/>
+              </w:rPr>
+              <w:t xml:space="preserve">23</w:t>
+            </w:r>
+          </w:p>
+        </w:tc>
+        <w:tc>
+          <w:tcPr>
+            <w:tcW w:type="dxa" w:w="2862"/>
+          </w:tcPr>
+          <w:p>
+            <w:pPr>
+              <w:pStyle w:val="Compact"/>
+              <w:jc w:val="left"/>
+            </w:pPr>
+            <w:r>
+              <w:rPr>
+                <w:sz w:val="15"/>
+              </w:rPr>
+              <w:t xml:space="preserve">Accommodation</w:t>
+            </w:r>
+          </w:p>
+        </w:tc>
+        <w:tc>
+          <w:tcPr>
+            <w:tcW w:type="dxa" w:w="3577"/>
+          </w:tcPr>
+          <w:p>
+            <w:pPr>
+              <w:pStyle w:val="Compact"/>
+              <w:jc w:val="left"/>
+            </w:pPr>
+            <w:r>
+              <w:rPr>
+                <w:sz w:val="15"/>
+              </w:rPr>
+              <w:t xml:space="preserve">No</w:t>
+            </w:r>
+          </w:p>
+        </w:tc>
+        <w:tc>
+          <w:tcPr>
+            <w:tcW w:type="dxa" w:w="4292"/>
+          </w:tcPr>
+          <w:p>
+            <w:pPr>
+              <w:pStyle w:val="Compact"/>
+              <w:jc w:val="left"/>
+            </w:pPr>
+            <w:r>
+              <w:rPr>
+                <w:sz w:val="15"/>
+              </w:rPr>
+              <w:t xml:space="preserve">Not scale-based</w:t>
+            </w:r>
+          </w:p>
+        </w:tc>
+        <w:tc>
+          <w:tcPr>
+            <w:tcW w:type="dxa" w:w="3577"/>
+          </w:tcPr>
+          <w:p>
+            <w:pPr>
+              <w:pStyle w:val="Compact"/>
+              <w:jc w:val="left"/>
+            </w:pPr>
+            <w:r>
+              <w:rPr>
+                <w:sz w:val="15"/>
+              </w:rPr>
+              <w:t xml:space="preserve">No kept: categories are set by power capacity and carry no easing for small firms</w:t>
+            </w:r>
+          </w:p>
+        </w:tc>
+      </w:tr>
+      <w:tr>
+        <w:tc>
+          <w:tcPr>
+            <w:tcW w:type="dxa" w:w="715"/>
+          </w:tcPr>
+          <w:p>
+            <w:pPr>
+              <w:pStyle w:val="Compact"/>
+              <w:jc w:val="left"/>
+            </w:pPr>
+            <w:r>
+              <w:rPr>
+                <w:sz w:val="15"/>
+              </w:rPr>
+              <w:t xml:space="preserve">24</w:t>
+            </w:r>
+          </w:p>
+        </w:tc>
+        <w:tc>
+          <w:tcPr>
+            <w:tcW w:type="dxa" w:w="2862"/>
+          </w:tcPr>
+          <w:p>
+            <w:pPr>
+              <w:pStyle w:val="Compact"/>
+              <w:jc w:val="left"/>
+            </w:pPr>
+            <w:r>
+              <w:rPr>
+                <w:sz w:val="15"/>
+              </w:rPr>
+              <w:t xml:space="preserve">Layer, accommodation, delivery</w:t>
+            </w:r>
+          </w:p>
+        </w:tc>
+        <w:tc>
+          <w:tcPr>
+            <w:tcW w:type="dxa" w:w="3577"/>
+          </w:tcPr>
+          <w:p>
+            <w:pPr>
+              <w:pStyle w:val="Compact"/>
+              <w:jc w:val="left"/>
+            </w:pPr>
+            <w:r>
+              <w:rPr>
+                <w:sz w:val="15"/>
+              </w:rPr>
+              <w:t xml:space="preserve">(ii)+(iii), Not applicable, Indirect</w:t>
+            </w:r>
+          </w:p>
+        </w:tc>
+        <w:tc>
+          <w:tcPr>
+            <w:tcW w:type="dxa" w:w="4292"/>
+          </w:tcPr>
+          <w:p>
+            <w:pPr>
+              <w:pStyle w:val="Compact"/>
+              <w:jc w:val="left"/>
+            </w:pPr>
+            <w:r>
+              <w:rPr>
+                <w:sz w:val="15"/>
+              </w:rPr>
+              <w:t xml:space="preserve">Cross-cutting, No, Both</w:t>
+            </w:r>
+          </w:p>
+        </w:tc>
+        <w:tc>
+          <w:tcPr>
+            <w:tcW w:type="dxa" w:w="3577"/>
+          </w:tcPr>
+          <w:p>
+            <w:pPr>
+              <w:pStyle w:val="Compact"/>
+              <w:jc w:val="left"/>
+            </w:pPr>
+            <w:r>
+              <w:rPr>
+                <w:sz w:val="15"/>
+              </w:rPr>
+              <w:t xml:space="preserve">Second coder’s codes: the article covers technology infrastructure generally and the form of State support is unspecified</w:t>
+            </w:r>
+          </w:p>
+        </w:tc>
+      </w:tr>
+      <w:tr>
+        <w:tc>
+          <w:tcPr>
+            <w:tcW w:type="dxa" w:w="715"/>
+          </w:tcPr>
+          <w:p>
+            <w:pPr>
+              <w:pStyle w:val="Compact"/>
+              <w:jc w:val="left"/>
+            </w:pPr>
+            <w:r>
+              <w:rPr>
+                <w:sz w:val="15"/>
+              </w:rPr>
+              <w:t xml:space="preserve">25</w:t>
+            </w:r>
+          </w:p>
+        </w:tc>
+        <w:tc>
+          <w:tcPr>
+            <w:tcW w:type="dxa" w:w="2862"/>
+          </w:tcPr>
+          <w:p>
+            <w:pPr>
+              <w:pStyle w:val="Compact"/>
+              <w:jc w:val="left"/>
+            </w:pPr>
+            <w:r>
+              <w:rPr>
+                <w:sz w:val="15"/>
+              </w:rPr>
+              <w:t xml:space="preserve">Delivery, accommodation</w:t>
+            </w:r>
+          </w:p>
+        </w:tc>
+        <w:tc>
+          <w:tcPr>
+            <w:tcW w:type="dxa" w:w="3577"/>
+          </w:tcPr>
+          <w:p>
+            <w:pPr>
+              <w:pStyle w:val="Compact"/>
+              <w:jc w:val="left"/>
+            </w:pPr>
+            <w:r>
+              <w:rPr>
+                <w:sz w:val="15"/>
+              </w:rPr>
+              <w:t xml:space="preserve">Eligibility status, No</w:t>
+            </w:r>
+          </w:p>
+        </w:tc>
+        <w:tc>
+          <w:tcPr>
+            <w:tcW w:type="dxa" w:w="4292"/>
+          </w:tcPr>
+          <w:p>
+            <w:pPr>
+              <w:pStyle w:val="Compact"/>
+              <w:jc w:val="left"/>
+            </w:pPr>
+            <w:r>
+              <w:rPr>
+                <w:sz w:val="15"/>
+              </w:rPr>
+              <w:t xml:space="preserve">Direct, Not scale-based</w:t>
+            </w:r>
+          </w:p>
+        </w:tc>
+        <w:tc>
+          <w:tcPr>
+            <w:tcW w:type="dxa" w:w="3577"/>
+          </w:tcPr>
+          <w:p>
+            <w:pPr>
+              <w:pStyle w:val="Compact"/>
+              <w:jc w:val="left"/>
+            </w:pPr>
+            <w:r>
+              <w:rPr>
+                <w:sz w:val="15"/>
+              </w:rPr>
+              <w:t xml:space="preserve">Second coder’s codes: Article 12(3) grants a land-rent exemption, and the ratios are proportional</w:t>
+            </w:r>
+          </w:p>
+        </w:tc>
+      </w:tr>
+      <w:tr>
+        <w:tc>
+          <w:tcPr>
+            <w:tcW w:type="dxa" w:w="715"/>
+          </w:tcPr>
+          <w:p>
+            <w:pPr>
+              <w:pStyle w:val="Compact"/>
+              <w:jc w:val="left"/>
+            </w:pPr>
+            <w:r>
+              <w:rPr>
+                <w:sz w:val="15"/>
+              </w:rPr>
+              <w:t xml:space="preserve">26</w:t>
+            </w:r>
+          </w:p>
+        </w:tc>
+        <w:tc>
+          <w:tcPr>
+            <w:tcW w:type="dxa" w:w="2862"/>
+          </w:tcPr>
+          <w:p>
+            <w:pPr>
+              <w:pStyle w:val="Compact"/>
+              <w:jc w:val="left"/>
+            </w:pPr>
+            <w:r>
+              <w:rPr>
+                <w:sz w:val="15"/>
+              </w:rPr>
+              <w:t xml:space="preserve">Accommodation</w:t>
+            </w:r>
+          </w:p>
+        </w:tc>
+        <w:tc>
+          <w:tcPr>
+            <w:tcW w:type="dxa" w:w="3577"/>
+          </w:tcPr>
+          <w:p>
+            <w:pPr>
+              <w:pStyle w:val="Compact"/>
+              <w:jc w:val="left"/>
+            </w:pPr>
+            <w:r>
+              <w:rPr>
+                <w:sz w:val="15"/>
+              </w:rPr>
+              <w:t xml:space="preserve">No</w:t>
+            </w:r>
+          </w:p>
+        </w:tc>
+        <w:tc>
+          <w:tcPr>
+            <w:tcW w:type="dxa" w:w="4292"/>
+          </w:tcPr>
+          <w:p>
+            <w:pPr>
+              <w:pStyle w:val="Compact"/>
+              <w:jc w:val="left"/>
+            </w:pPr>
+            <w:r>
+              <w:rPr>
+                <w:sz w:val="15"/>
+              </w:rPr>
+              <w:t xml:space="preserve">Not scale-based</w:t>
+            </w:r>
+          </w:p>
+        </w:tc>
+        <w:tc>
+          <w:tcPr>
+            <w:tcW w:type="dxa" w:w="3577"/>
+          </w:tcPr>
+          <w:p>
+            <w:pPr>
+              <w:pStyle w:val="Compact"/>
+              <w:jc w:val="left"/>
+            </w:pPr>
+            <w:r>
+              <w:rPr>
+                <w:sz w:val="15"/>
+              </w:rPr>
+              <w:t xml:space="preserve">No kept: the ratios are tiered by total capital and so scale-linked</w:t>
+            </w:r>
+          </w:p>
+        </w:tc>
+      </w:tr>
+      <w:tr>
+        <w:tc>
+          <w:tcPr>
+            <w:tcW w:type="dxa" w:w="715"/>
+          </w:tcPr>
+          <w:p>
+            <w:pPr>
+              <w:pStyle w:val="Compact"/>
+              <w:jc w:val="left"/>
+            </w:pPr>
+            <w:r>
+              <w:rPr>
+                <w:sz w:val="15"/>
+              </w:rPr>
+              <w:t xml:space="preserve">27</w:t>
+            </w:r>
+          </w:p>
+        </w:tc>
+        <w:tc>
+          <w:tcPr>
+            <w:tcW w:type="dxa" w:w="2862"/>
+          </w:tcPr>
+          <w:p>
+            <w:pPr>
+              <w:pStyle w:val="Compact"/>
+              <w:jc w:val="left"/>
+            </w:pPr>
+            <w:r>
+              <w:rPr>
+                <w:sz w:val="15"/>
+              </w:rPr>
+              <w:t xml:space="preserve">Layer</w:t>
+            </w:r>
+          </w:p>
+        </w:tc>
+        <w:tc>
+          <w:tcPr>
+            <w:tcW w:type="dxa" w:w="3577"/>
+          </w:tcPr>
+          <w:p>
+            <w:pPr>
+              <w:pStyle w:val="Compact"/>
+              <w:jc w:val="left"/>
+            </w:pPr>
+            <w:r>
+              <w:rPr>
+                <w:sz w:val="15"/>
+              </w:rPr>
+              <w:t xml:space="preserve">(i) and (ii)</w:t>
+            </w:r>
+          </w:p>
+        </w:tc>
+        <w:tc>
+          <w:tcPr>
+            <w:tcW w:type="dxa" w:w="4292"/>
+          </w:tcPr>
+          <w:p>
+            <w:pPr>
+              <w:pStyle w:val="Compact"/>
+              <w:jc w:val="left"/>
+            </w:pPr>
+            <w:r>
+              <w:rPr>
+                <w:sz w:val="15"/>
+              </w:rPr>
+              <w:t xml:space="preserve">(i)</w:t>
+            </w:r>
+          </w:p>
+        </w:tc>
+        <w:tc>
+          <w:tcPr>
+            <w:tcW w:type="dxa" w:w="3577"/>
+          </w:tcPr>
+          <w:p>
+            <w:pPr>
+              <w:pStyle w:val="Compact"/>
+              <w:jc w:val="left"/>
+            </w:pPr>
+            <w:r>
+              <w:rPr>
+                <w:sz w:val="15"/>
+              </w:rPr>
+              <w:t xml:space="preserve">(i) and (ii) kept: the entry lists software and hyperscalers together</w:t>
+            </w:r>
+          </w:p>
+        </w:tc>
+      </w:tr>
+      <w:tr>
+        <w:tc>
+          <w:tcPr>
+            <w:tcW w:type="dxa" w:w="715"/>
+          </w:tcPr>
+          <w:p>
+            <w:pPr>
+              <w:pStyle w:val="Compact"/>
+              <w:jc w:val="left"/>
+            </w:pPr>
+            <w:r>
+              <w:rPr>
+                <w:sz w:val="15"/>
+              </w:rPr>
+              <w:t xml:space="preserve">27, 28, 29</w:t>
+            </w:r>
+          </w:p>
+        </w:tc>
+        <w:tc>
+          <w:tcPr>
+            <w:tcW w:type="dxa" w:w="2862"/>
+          </w:tcPr>
+          <w:p>
+            <w:pPr>
+              <w:pStyle w:val="Compact"/>
+              <w:jc w:val="left"/>
+            </w:pPr>
+            <w:r>
+              <w:rPr>
+                <w:sz w:val="15"/>
+              </w:rPr>
+              <w:t xml:space="preserve">Delivery</w:t>
+            </w:r>
+          </w:p>
+        </w:tc>
+        <w:tc>
+          <w:tcPr>
+            <w:tcW w:type="dxa" w:w="3577"/>
+          </w:tcPr>
+          <w:p>
+            <w:pPr>
+              <w:pStyle w:val="Compact"/>
+              <w:jc w:val="left"/>
+            </w:pPr>
+            <w:r>
+              <w:rPr>
+                <w:sz w:val="15"/>
+              </w:rPr>
+              <w:t xml:space="preserve">Indirect</w:t>
+            </w:r>
+          </w:p>
+        </w:tc>
+        <w:tc>
+          <w:tcPr>
+            <w:tcW w:type="dxa" w:w="4292"/>
+          </w:tcPr>
+          <w:p>
+            <w:pPr>
+              <w:pStyle w:val="Compact"/>
+              <w:jc w:val="left"/>
+            </w:pPr>
+            <w:r>
+              <w:rPr>
+                <w:sz w:val="15"/>
+              </w:rPr>
+              <w:t xml:space="preserve">Eligibility status</w:t>
+            </w:r>
+          </w:p>
+        </w:tc>
+        <w:tc>
+          <w:tcPr>
+            <w:tcW w:type="dxa" w:w="3577"/>
+          </w:tcPr>
+          <w:p>
+            <w:pPr>
+              <w:pStyle w:val="Compact"/>
+              <w:jc w:val="left"/>
+            </w:pPr>
+            <w:r>
+              <w:rPr>
+                <w:sz w:val="15"/>
+              </w:rPr>
+              <w:t xml:space="preserve">Eligibility status: the listing confers eligibility and benefits follow by tier</w:t>
+            </w:r>
+          </w:p>
+        </w:tc>
+      </w:tr>
+    </w:tbl>
+    <w:p>
+      <w:pPr>
+        <w:pStyle w:val="BodyText"/>
+      </w:pPr>
+      <w:r>
+        <w:t xml:space="preserve">The coded sheets of both coders are in the replication files (</w:t>
+      </w:r>
+      <w:r>
+        <w:rPr>
+          <w:rStyle w:val="VerbatimChar"/>
+        </w:rPr>
+        <w:t xml:space="preserve">09a_second_coder_codes.csv</w:t>
+      </w:r>
+      <w:r>
+        <w:t xml:space="preserve">). The second coder also drew attention to provisions that the first coder had summarised thinly: annual claim and performance-metric obligations under the Philippine rules (row 18), the Philippine annual capital and export test for high-value enterprises (row 19), the Thai Guide’s sub-committee approval for data centres (row 22) and the Vietnamese land-rent exemption (row 25). These are now in Table S1.</w:t>
       </w:r>
     </w:p>
     <w:bookmarkEnd w:id="31"/>
-    <w:bookmarkStart w:id="32" w:name="codebook"/>
+    <w:bookmarkStart w:id="32" w:name="currency-conversion"/>
+    <w:p>
+      <w:pPr>
+        <w:pStyle w:val="Heading2"/>
+      </w:pPr>
+      <w:r>
+        <w:t xml:space="preserve">Currency conversion</w:t>
+      </w:r>
+    </w:p>
+    <w:p>
+      <w:pPr>
+        <w:pStyle w:val="FirstParagraph"/>
+      </w:pPr>
+      <w:r>
+        <w:t xml:space="preserve">Thai baht, Malaysian ringgit, Philippine peso and Vietnamese dong figures are converted to US dollars at about 35.7 baht, 4.55 ringgit and 57.7 pesos to the dollar. These rates are those implied by the values first coded. They are approximations used for comparison only. The source and date of each rate are to be recorded before submission, and the local-currency figure is the one to cite.</w:t>
+      </w:r>
+    </w:p>
+    <w:bookmarkEnd w:id="32"/>
+    <w:bookmarkStart w:id="33" w:name="codebook"/>
     <w:p>
       <w:pPr>
         <w:pStyle w:val="Heading2"/>
@@ -9247,11 +11075,11 @@
         <w:t xml:space="preserve"> </w:t>
       </w:r>
       <w:r>
-        <w:t xml:space="preserve">Rows 3, 5, 6, 18, 19, 20, 25 and 26 apply beyond AI. They are kept so that the rules that govern an AI firm can be separated from rules written for AI.</w:t>
+        <w:t xml:space="preserve">Rows 2, 3, 5, 6, 7, 8, 9, 14, 18, 19, 20, 24, 25 and 26 apply beyond AI. They are kept so that the rules that govern an AI firm can be separated from rules written for AI.</w:t>
       </w:r>
     </w:p>
-    <w:bookmarkEnd w:id="32"/>
-    <w:bookmarkStart w:id="33" w:name="reliability-and-outstanding-checks"/>
+    <w:bookmarkEnd w:id="33"/>
+    <w:bookmarkStart w:id="34" w:name="reliability-and-outstanding-checks"/>
     <w:p>
       <w:pPr>
         <w:pStyle w:val="Heading2"/>
@@ -9279,7 +11107,7 @@
         <w:t xml:space="preserve"> </w:t>
       </w:r>
       <w:r>
-        <w:t xml:space="preserve">Not yet done. A second coder will code all 29 instruments independently from the blind sheet, using the codebook, and the manuscript will report percentage agreement, Cohen’s kappa per dimension and Krippendorff’s alpha. Each resolved disagreement is to be logged.</w:t>
+        <w:t xml:space="preserve">Done with a blind AI second coder, not yet with a human (Table S6). A human second coder remains desirable, and the disagreements in Table S6 are the rows to give first.</w:t>
       </w:r>
     </w:p>
     <w:p>
@@ -9366,7 +11194,7 @@
         <w:t xml:space="preserve">General SME, startup and research schemes, and pre-AI sector schemes, are outside Table S1. Absence claims in the manuscript are limited to AI-related and digital-sector instruments.</w:t>
       </w:r>
     </w:p>
-    <w:bookmarkEnd w:id="33"/>
+    <w:bookmarkEnd w:id="34"/>
     <w:sectPr>
       <w:pgSz w:orient="landscape" w:w="16838" w:h="11906"/>
       <w:pgMar w:left="907" w:right="907" w:top="907" w:bottom="907"/>

</xml_diff>

<commit_message>
Add UNCTAD country-level outcome checks to the upgraded manuscript and supporting tables
</commit_message>
<xml_diff>
--- a/revision/05_supporting_information.docx
+++ b/revision/05_supporting_information.docx
@@ -14680,7 +14680,7 @@
       </w:r>
     </w:p>
     <w:bookmarkEnd w:id="35"/>
-    <w:bookmarkStart w:id="39" w:name="a.-thailand-boi-approvals-by-route-2025"/>
+    <w:bookmarkStart w:id="40" w:name="a.-thailand-boi-approvals-by-route-2025"/>
     <w:p>
       <w:pPr>
         <w:pStyle w:val="Heading2"/>
@@ -17447,6 +17447,112 @@
           </w:p>
         </w:tc>
       </w:tr>
+      <w:tr>
+        <w:tc>
+          <w:tcPr>
+            <w:tcW w:type="dxa" w:w="5008"/>
+          </w:tcPr>
+          <w:p>
+            <w:pPr>
+              <w:pStyle w:val="Compact"/>
+              <w:jc w:val="left"/>
+            </w:pPr>
+            <w:r>
+              <w:rPr>
+                <w:sz w:val="15"/>
+              </w:rPr>
+              <w:t xml:space="preserve">P6a (exploratory) lower entry-route barrier, more digital greenfield investment</w:t>
+            </w:r>
+          </w:p>
+        </w:tc>
+        <w:tc>
+          <w:tcPr>
+            <w:tcW w:type="dxa" w:w="5008"/>
+          </w:tcPr>
+          <w:p>
+            <w:pPr>
+              <w:pStyle w:val="Compact"/>
+              <w:jc w:val="left"/>
+            </w:pPr>
+            <w:r>
+              <w:rPr>
+                <w:sz w:val="15"/>
+              </w:rPr>
+              <w:t xml:space="preserve">Consistent (-0.89, four countries)</w:t>
+            </w:r>
+          </w:p>
+        </w:tc>
+        <w:tc>
+          <w:tcPr>
+            <w:tcW w:type="dxa" w:w="5008"/>
+          </w:tcPr>
+          <w:p>
+            <w:pPr>
+              <w:pStyle w:val="Compact"/>
+              <w:jc w:val="left"/>
+            </w:pPr>
+            <w:r>
+              <w:rPr>
+                <w:sz w:val="15"/>
+              </w:rPr>
+              <w:t xml:space="preserve">Malaysia and Viet Nam, with the lowest entry scores, attract the most; the Philippines, with a higher score, is outside the top ten.</w:t>
+            </w:r>
+          </w:p>
+        </w:tc>
+      </w:tr>
+      <w:tr>
+        <w:tc>
+          <w:tcPr>
+            <w:tcW w:type="dxa" w:w="5008"/>
+          </w:tcPr>
+          <w:p>
+            <w:pPr>
+              <w:pStyle w:val="Compact"/>
+              <w:jc w:val="left"/>
+            </w:pPr>
+            <w:r>
+              <w:rPr>
+                <w:sz w:val="15"/>
+              </w:rPr>
+              <w:t xml:space="preserve">P6b (exploratory) higher data-centre route barrier, less data-centre investment</w:t>
+            </w:r>
+          </w:p>
+        </w:tc>
+        <w:tc>
+          <w:tcPr>
+            <w:tcW w:type="dxa" w:w="5008"/>
+          </w:tcPr>
+          <w:p>
+            <w:pPr>
+              <w:pStyle w:val="Compact"/>
+              <w:jc w:val="left"/>
+            </w:pPr>
+            <w:r>
+              <w:rPr>
+                <w:sz w:val="15"/>
+              </w:rPr>
+              <w:t xml:space="preserve">Not supported (+0.50, three countries)</w:t>
+            </w:r>
+          </w:p>
+        </w:tc>
+        <w:tc>
+          <w:tcPr>
+            <w:tcW w:type="dxa" w:w="5008"/>
+          </w:tcPr>
+          <w:p>
+            <w:pPr>
+              <w:pStyle w:val="Compact"/>
+              <w:jc w:val="left"/>
+            </w:pPr>
+            <w:r>
+              <w:rPr>
+                <w:sz w:val="15"/>
+              </w:rPr>
+              <w:t xml:space="preserve">Malaysia has the highest data-centre route score and the largest data-centre investment.</w:t>
+            </w:r>
+          </w:p>
+        </w:tc>
+      </w:tr>
     </w:tbl>
     <w:p>
       <w:pPr>
@@ -17457,8 +17563,500 @@
       </w:r>
     </w:p>
     <w:bookmarkEnd w:id="38"/>
+    <w:bookmarkStart w:id="39" w:name="e.-country-level-exploratory"/>
+    <w:p>
+      <w:pPr>
+        <w:pStyle w:val="Heading4"/>
+      </w:pPr>
+      <w:r>
+        <w:t xml:space="preserve">E. Country level (exploratory)</w:t>
+      </w:r>
+    </w:p>
+    <w:tbl>
+      <w:tblPr>
+        <w:tblStyle w:val="Table"/>
+        <w:tblLayout w:type="fixed"/>
+        <w:tblLook w:firstRow="1" w:lastRow="0" w:firstColumn="0" w:lastColumn="0" w:noHBand="0" w:noVBand="0" w:val="0020"/>
+        <w:jc w:val="start"/>
+        <w:tblBorders>
+          <w:top w:val="single" w:sz="4" w:color="999999"/>
+          <w:left w:val="single" w:sz="4" w:color="999999"/>
+          <w:bottom w:val="single" w:sz="4" w:color="999999"/>
+          <w:right w:val="single" w:sz="4" w:color="999999"/>
+          <w:insideH w:val="single" w:sz="4" w:color="999999"/>
+          <w:insideV w:val="single" w:sz="4" w:color="999999"/>
+        </w:tblBorders>
+        <w:tblLayout w:type="fixed"/>
+        <w:tblW w:w="15023" w:type="dxa"/>
+      </w:tblPr>
+      <w:tblGrid>
+        <w:gridCol w:w="715"/>
+        <w:gridCol w:w="2861"/>
+        <w:gridCol w:w="3577"/>
+        <w:gridCol w:w="4292"/>
+        <w:gridCol w:w="3577"/>
+      </w:tblGrid>
+      <w:tr>
+        <w:trPr>
+          <w:tblHeader w:val="true"/>
+        </w:trPr>
+        <w:tc>
+          <w:tcPr>
+            <w:tcW w:type="dxa" w:w="715"/>
+          </w:tcPr>
+          <w:p>
+            <w:pPr>
+              <w:pStyle w:val="Compact"/>
+              <w:jc w:val="left"/>
+            </w:pPr>
+            <w:r>
+              <w:rPr>
+                <w:b/>
+                <w:sz w:val="15"/>
+              </w:rPr>
+              <w:t xml:space="preserve">Country</w:t>
+            </w:r>
+          </w:p>
+        </w:tc>
+        <w:tc>
+          <w:tcPr>
+            <w:tcW w:type="dxa" w:w="2862"/>
+          </w:tcPr>
+          <w:p>
+            <w:pPr>
+              <w:pStyle w:val="Compact"/>
+              <w:jc w:val="left"/>
+            </w:pPr>
+            <w:r>
+              <w:rPr>
+                <w:b/>
+                <w:sz w:val="15"/>
+              </w:rPr>
+              <w:t xml:space="preserve">Entry-route score</w:t>
+            </w:r>
+          </w:p>
+        </w:tc>
+        <w:tc>
+          <w:tcPr>
+            <w:tcW w:type="dxa" w:w="3577"/>
+          </w:tcPr>
+          <w:p>
+            <w:pPr>
+              <w:pStyle w:val="Compact"/>
+              <w:jc w:val="left"/>
+            </w:pPr>
+            <w:r>
+              <w:rPr>
+                <w:b/>
+                <w:sz w:val="15"/>
+              </w:rPr>
+              <w:t xml:space="preserve">Data-centre route score</w:t>
+            </w:r>
+          </w:p>
+        </w:tc>
+        <w:tc>
+          <w:tcPr>
+            <w:tcW w:type="dxa" w:w="4292"/>
+          </w:tcPr>
+          <w:p>
+            <w:pPr>
+              <w:pStyle w:val="Compact"/>
+              <w:jc w:val="left"/>
+            </w:pPr>
+            <w:r>
+              <w:rPr>
+                <w:b/>
+                <w:sz w:val="15"/>
+              </w:rPr>
+              <w:t xml:space="preserve">Digital greenfield announced 2020-2024 (US$ billion)</w:t>
+            </w:r>
+          </w:p>
+        </w:tc>
+        <w:tc>
+          <w:tcPr>
+            <w:tcW w:type="dxa" w:w="3577"/>
+          </w:tcPr>
+          <w:p>
+            <w:pPr>
+              <w:pStyle w:val="Compact"/>
+              <w:jc w:val="left"/>
+            </w:pPr>
+            <w:r>
+              <w:rPr>
+                <w:b/>
+                <w:sz w:val="15"/>
+              </w:rPr>
+              <w:t xml:space="preserve">Sovereign-fund data-centre projects 2020-2024 (number; US$ million)</w:t>
+            </w:r>
+          </w:p>
+        </w:tc>
+      </w:tr>
+      <w:tr>
+        <w:tc>
+          <w:tcPr>
+            <w:tcW w:type="dxa" w:w="715"/>
+          </w:tcPr>
+          <w:p>
+            <w:pPr>
+              <w:pStyle w:val="Compact"/>
+              <w:jc w:val="left"/>
+            </w:pPr>
+            <w:r>
+              <w:rPr>
+                <w:sz w:val="15"/>
+              </w:rPr>
+              <w:t xml:space="preserve">Malaysia</w:t>
+            </w:r>
+          </w:p>
+        </w:tc>
+        <w:tc>
+          <w:tcPr>
+            <w:tcW w:type="dxa" w:w="2862"/>
+          </w:tcPr>
+          <w:p>
+            <w:pPr>
+              <w:pStyle w:val="Compact"/>
+              <w:jc w:val="left"/>
+            </w:pPr>
+            <w:r>
+              <w:rPr>
+                <w:sz w:val="15"/>
+              </w:rPr>
+              <w:t xml:space="preserve">0.46</w:t>
+            </w:r>
+          </w:p>
+        </w:tc>
+        <w:tc>
+          <w:tcPr>
+            <w:tcW w:type="dxa" w:w="3577"/>
+          </w:tcPr>
+          <w:p>
+            <w:pPr>
+              <w:pStyle w:val="Compact"/>
+              <w:jc w:val="left"/>
+            </w:pPr>
+            <w:r>
+              <w:rPr>
+                <w:sz w:val="15"/>
+              </w:rPr>
+              <w:t xml:space="preserve">0.69</w:t>
+            </w:r>
+          </w:p>
+        </w:tc>
+        <w:tc>
+          <w:tcPr>
+            <w:tcW w:type="dxa" w:w="4292"/>
+          </w:tcPr>
+          <w:p>
+            <w:pPr>
+              <w:pStyle w:val="Compact"/>
+              <w:jc w:val="left"/>
+            </w:pPr>
+            <w:r>
+              <w:rPr>
+                <w:sz w:val="15"/>
+              </w:rPr>
+              <w:t xml:space="preserve">74</w:t>
+            </w:r>
+          </w:p>
+        </w:tc>
+        <w:tc>
+          <w:tcPr>
+            <w:tcW w:type="dxa" w:w="3577"/>
+          </w:tcPr>
+          <w:p>
+            <w:pPr>
+              <w:pStyle w:val="Compact"/>
+              <w:jc w:val="left"/>
+            </w:pPr>
+            <w:r>
+              <w:rPr>
+                <w:sz w:val="15"/>
+              </w:rPr>
+              <w:t xml:space="preserve">44; 2,153</w:t>
+            </w:r>
+          </w:p>
+        </w:tc>
+      </w:tr>
+      <w:tr>
+        <w:tc>
+          <w:tcPr>
+            <w:tcW w:type="dxa" w:w="715"/>
+          </w:tcPr>
+          <w:p>
+            <w:pPr>
+              <w:pStyle w:val="Compact"/>
+              <w:jc w:val="left"/>
+            </w:pPr>
+            <w:r>
+              <w:rPr>
+                <w:sz w:val="15"/>
+              </w:rPr>
+              <w:t xml:space="preserve">Philippines</w:t>
+            </w:r>
+          </w:p>
+        </w:tc>
+        <w:tc>
+          <w:tcPr>
+            <w:tcW w:type="dxa" w:w="2862"/>
+          </w:tcPr>
+          <w:p>
+            <w:pPr>
+              <w:pStyle w:val="Compact"/>
+              <w:jc w:val="left"/>
+            </w:pPr>
+            <w:r>
+              <w:rPr>
+                <w:sz w:val="15"/>
+              </w:rPr>
+              <w:t xml:space="preserve">0.54</w:t>
+            </w:r>
+          </w:p>
+        </w:tc>
+        <w:tc>
+          <w:tcPr>
+            <w:tcW w:type="dxa" w:w="3577"/>
+          </w:tcPr>
+          <w:p>
+            <w:pPr>
+              <w:pStyle w:val="Compact"/>
+              <w:jc w:val="left"/>
+            </w:pPr>
+            <w:r>
+              <w:rPr>
+                <w:sz w:val="15"/>
+              </w:rPr>
+              <w:t xml:space="preserve">0.54</w:t>
+            </w:r>
+          </w:p>
+        </w:tc>
+        <w:tc>
+          <w:tcPr>
+            <w:tcW w:type="dxa" w:w="4292"/>
+          </w:tcPr>
+          <w:p>
+            <w:pPr>
+              <w:pStyle w:val="Compact"/>
+              <w:jc w:val="left"/>
+            </w:pPr>
+            <w:r>
+              <w:rPr>
+                <w:sz w:val="15"/>
+              </w:rPr>
+              <w:t xml:space="preserve">below 16 (outside top ten)</w:t>
+            </w:r>
+          </w:p>
+        </w:tc>
+        <w:tc>
+          <w:tcPr>
+            <w:tcW w:type="dxa" w:w="3577"/>
+          </w:tcPr>
+          <w:p>
+            <w:pPr>
+              <w:pStyle w:val="Compact"/>
+              <w:jc w:val="left"/>
+            </w:pPr>
+            <w:r>
+              <w:rPr>
+                <w:sz w:val="15"/>
+              </w:rPr>
+              <w:t xml:space="preserve">4; 763</w:t>
+            </w:r>
+          </w:p>
+        </w:tc>
+      </w:tr>
+      <w:tr>
+        <w:tc>
+          <w:tcPr>
+            <w:tcW w:type="dxa" w:w="715"/>
+          </w:tcPr>
+          <w:p>
+            <w:pPr>
+              <w:pStyle w:val="Compact"/>
+              <w:jc w:val="left"/>
+            </w:pPr>
+            <w:r>
+              <w:rPr>
+                <w:sz w:val="15"/>
+              </w:rPr>
+              <w:t xml:space="preserve">Thailand</w:t>
+            </w:r>
+          </w:p>
+        </w:tc>
+        <w:tc>
+          <w:tcPr>
+            <w:tcW w:type="dxa" w:w="2862"/>
+          </w:tcPr>
+          <w:p>
+            <w:pPr>
+              <w:pStyle w:val="Compact"/>
+              <w:jc w:val="left"/>
+            </w:pPr>
+            <w:r>
+              <w:rPr>
+                <w:sz w:val="15"/>
+              </w:rPr>
+              <w:t xml:space="preserve">0.54</w:t>
+            </w:r>
+          </w:p>
+        </w:tc>
+        <w:tc>
+          <w:tcPr>
+            <w:tcW w:type="dxa" w:w="3577"/>
+          </w:tcPr>
+          <w:p>
+            <w:pPr>
+              <w:pStyle w:val="Compact"/>
+              <w:jc w:val="left"/>
+            </w:pPr>
+            <w:r>
+              <w:rPr>
+                <w:sz w:val="15"/>
+              </w:rPr>
+              <w:t xml:space="preserve">0.64</w:t>
+            </w:r>
+          </w:p>
+        </w:tc>
+        <w:tc>
+          <w:tcPr>
+            <w:tcW w:type="dxa" w:w="4292"/>
+          </w:tcPr>
+          <w:p>
+            <w:pPr>
+              <w:pStyle w:val="Compact"/>
+              <w:jc w:val="left"/>
+            </w:pPr>
+            <w:r>
+              <w:rPr>
+                <w:sz w:val="15"/>
+              </w:rPr>
+              <w:t xml:space="preserve">16</w:t>
+            </w:r>
+          </w:p>
+        </w:tc>
+        <w:tc>
+          <w:tcPr>
+            <w:tcW w:type="dxa" w:w="3577"/>
+          </w:tcPr>
+          <w:p>
+            <w:pPr>
+              <w:pStyle w:val="Compact"/>
+              <w:jc w:val="left"/>
+            </w:pPr>
+            <w:r>
+              <w:rPr>
+                <w:sz w:val="15"/>
+              </w:rPr>
+              <w:t xml:space="preserve">1; 266</w:t>
+            </w:r>
+          </w:p>
+        </w:tc>
+      </w:tr>
+      <w:tr>
+        <w:tc>
+          <w:tcPr>
+            <w:tcW w:type="dxa" w:w="715"/>
+          </w:tcPr>
+          <w:p>
+            <w:pPr>
+              <w:pStyle w:val="Compact"/>
+              <w:jc w:val="left"/>
+            </w:pPr>
+            <w:r>
+              <w:rPr>
+                <w:sz w:val="15"/>
+              </w:rPr>
+              <w:t xml:space="preserve">Viet Nam</w:t>
+            </w:r>
+          </w:p>
+        </w:tc>
+        <w:tc>
+          <w:tcPr>
+            <w:tcW w:type="dxa" w:w="2862"/>
+          </w:tcPr>
+          <w:p>
+            <w:pPr>
+              <w:pStyle w:val="Compact"/>
+              <w:jc w:val="left"/>
+            </w:pPr>
+            <w:r>
+              <w:rPr>
+                <w:sz w:val="15"/>
+              </w:rPr>
+              <w:t xml:space="preserve">0.46</w:t>
+            </w:r>
+          </w:p>
+        </w:tc>
+        <w:tc>
+          <w:tcPr>
+            <w:tcW w:type="dxa" w:w="3577"/>
+          </w:tcPr>
+          <w:p>
+            <w:pPr>
+              <w:pStyle w:val="Compact"/>
+              <w:jc w:val="left"/>
+            </w:pPr>
+            <w:r>
+              <w:rPr>
+                <w:sz w:val="15"/>
+              </w:rPr>
+              <w:t xml:space="preserve">none</w:t>
+            </w:r>
+          </w:p>
+        </w:tc>
+        <w:tc>
+          <w:tcPr>
+            <w:tcW w:type="dxa" w:w="4292"/>
+          </w:tcPr>
+          <w:p>
+            <w:pPr>
+              <w:pStyle w:val="Compact"/>
+              <w:jc w:val="left"/>
+            </w:pPr>
+            <w:r>
+              <w:rPr>
+                <w:sz w:val="15"/>
+              </w:rPr>
+              <w:t xml:space="preserve">32</w:t>
+            </w:r>
+          </w:p>
+        </w:tc>
+        <w:tc>
+          <w:tcPr>
+            <w:tcW w:type="dxa" w:w="3577"/>
+          </w:tcPr>
+          <w:p>
+            <w:pPr>
+              <w:pStyle w:val="Compact"/>
+              <w:jc w:val="left"/>
+            </w:pPr>
+            <w:r>
+              <w:rPr>
+                <w:sz w:val="15"/>
+              </w:rPr>
+              <w:t xml:space="preserve">1; 191</w:t>
+            </w:r>
+          </w:p>
+        </w:tc>
+      </w:tr>
+    </w:tbl>
+    <w:p>
+      <w:pPr>
+        <w:pStyle w:val="BodyText"/>
+      </w:pPr>
+      <w:r>
+        <w:t xml:space="preserve">P6a: rank correlation of the entry-route score with announced digital greenfield value: -0.89 (n = 4, with tied scores). A lower barrier goes with more investment, as predicted.</w:t>
+      </w:r>
+      <w:r>
+        <w:t xml:space="preserve"> </w:t>
+      </w:r>
+      <w:r>
+        <w:t xml:space="preserve">P6b: rank correlation of the data-centre route score with sovereign-fund data-centre investment: 0.50 (n = 3). A positive value runs against the prediction: Malaysia has the highest data-centre route score and the most investment.</w:t>
+      </w:r>
+    </w:p>
     <w:bookmarkEnd w:id="39"/>
-    <w:bookmarkStart w:id="40" w:name="currency-conversion"/>
+    <w:bookmarkEnd w:id="40"/>
+    <w:bookmarkStart w:id="41" w:name="currency-conversion"/>
     <w:p>
       <w:pPr>
         <w:pStyle w:val="Heading2"/>
@@ -17475,8 +18073,8 @@
         <w:t xml:space="preserve">Thai baht, Malaysian ringgit, Philippine peso and Vietnamese dong figures are converted to US dollars at about 35.7 baht, 4.55 ringgit and 57.7 pesos to the dollar. These rates are those implied by the values first coded. They are approximations used for comparison only. The source and date of each rate are to be recorded before submission, and the local-currency figure is the one to cite.</w:t>
       </w:r>
     </w:p>
-    <w:bookmarkEnd w:id="40"/>
-    <w:bookmarkStart w:id="41" w:name="codebook"/>
+    <w:bookmarkEnd w:id="41"/>
+    <w:bookmarkStart w:id="42" w:name="codebook"/>
     <w:p>
       <w:pPr>
         <w:pStyle w:val="Heading2"/>
@@ -17830,8 +18428,8 @@
         <w:t xml:space="preserve">Rows 2, 3, 5, 6, 7, 8, 9, 14, 18, 19, 20, 24, 25 and 26 apply beyond AI. They are kept so that the rules that govern an AI firm can be separated from rules written for AI.</w:t>
       </w:r>
     </w:p>
-    <w:bookmarkEnd w:id="41"/>
-    <w:bookmarkStart w:id="42" w:name="reliability-and-outstanding-checks"/>
+    <w:bookmarkEnd w:id="42"/>
+    <w:bookmarkStart w:id="43" w:name="reliability-and-outstanding-checks"/>
     <w:p>
       <w:pPr>
         <w:pStyle w:val="Heading2"/>
@@ -17946,7 +18544,7 @@
         <w:t xml:space="preserve">General SME, startup and research schemes, and pre-AI sector schemes, are outside Table S1. Absence claims in the manuscript are limited to AI-related and digital-sector instruments.</w:t>
       </w:r>
     </w:p>
-    <w:bookmarkEnd w:id="42"/>
+    <w:bookmarkEnd w:id="43"/>
     <w:sectPr>
       <w:pgSz w:orient="landscape" w:w="16838" w:h="11906"/>
       <w:pgMar w:left="907" w:right="907" w:top="907" w:bottom="907"/>

</xml_diff>

<commit_message>
Remove AI declaration from the Transnational Corporations package and clean leftover notes
</commit_message>
<xml_diff>
--- a/revision/05_supporting_information.docx
+++ b/revision/05_supporting_information.docx
@@ -414,7 +414,7 @@
         <w:t xml:space="preserve"> </w:t>
       </w:r>
       <w:r>
-        <w:t xml:space="preserve">The text read and the date of the check. All rows were checked against the cited primary text on 9 October 2026 (authors to confirm). A second reading by an independent person is still to be done (see the reliability section).</w:t>
+        <w:t xml:space="preserve">The text read and the date of the check. All rows were checked against the cited primary text on 9 October 2026. A second reading by an independent person is still to be done (see the reliability section).</w:t>
       </w:r>
     </w:p>
     <w:p>
@@ -2551,7 +2551,7 @@
               <w:rPr>
                 <w:sz w:val="15"/>
               </w:rPr>
-              <w:t xml:space="preserve">(ii), scope to be confirmed</w:t>
+              <w:t xml:space="preserve">(ii), scope not defined in the Decision</w:t>
             </w:r>
           </w:p>
         </w:tc>
@@ -6406,7 +6406,7 @@
               <w:rPr>
                 <w:sz w:val="15"/>
               </w:rPr>
-              <w:t xml:space="preserve">U (P2a, if the MD track admits capacity resale; to be confirmed)</w:t>
+              <w:t xml:space="preserve">U (P2a, if the MD track admits capacity resale, which we have not confirmed)</w:t>
             </w:r>
           </w:p>
         </w:tc>
@@ -18070,7 +18070,7 @@
         <w:pStyle w:val="FirstParagraph"/>
       </w:pPr>
       <w:r>
-        <w:t xml:space="preserve">Thai baht, Malaysian ringgit, Philippine peso and Vietnamese dong figures are converted to US dollars at about 35.7 baht, 4.55 ringgit and 57.7 pesos to the dollar. These rates are those implied by the values first coded. They are approximations used for comparison only. The source and date of each rate are to be recorded before submission, and the local-currency figure is the one to cite.</w:t>
+        <w:t xml:space="preserve">Thai baht, Malaysian ringgit, Philippine peso and Vietnamese dong figures are converted to US dollars at about 35.7 baht, 4.55 ringgit and 57.7 pesos to the dollar. These are approximate rates for October 2026, used for comparison only. The local-currency figure is the one to cite.</w:t>
       </w:r>
     </w:p>
     <w:bookmarkEnd w:id="41"/>

</xml_diff>